<commit_message>
modified file content changes
</commit_message>
<xml_diff>
--- a/customers_data_analysis.docx
+++ b/customers_data_analysis.docx
@@ -2,6 +2,64 @@
 <file path=word/document.xml><?xml version="1.0" encoding="utf-8"?>
 <w:document xmlns:wpc="http://schemas.microsoft.com/office/word/2010/wordprocessingCanvas" xmlns:mc="http://schemas.openxmlformats.org/markup-compatibility/2006" xmlns:o="urn:schemas-microsoft-com:office:office" xmlns:r="http://schemas.openxmlformats.org/officeDocument/2006/relationships" xmlns:m="http://schemas.openxmlformats.org/officeDocument/2006/math" xmlns:v="urn:schemas-microsoft-com:vml" xmlns:wp14="http://schemas.microsoft.com/office/word/2010/wordprocessingDrawing" xmlns:wp="http://schemas.openxmlformats.org/drawingml/2006/wordprocessingDrawing" xmlns:w10="urn:schemas-microsoft-com:office:word" xmlns:w="http://schemas.openxmlformats.org/wordprocessingml/2006/main" xmlns:w14="http://schemas.microsoft.com/office/word/2010/wordml" xmlns:w15="http://schemas.microsoft.com/office/word/2012/wordml" xmlns:wpg="http://schemas.microsoft.com/office/word/2010/wordprocessingGroup" xmlns:wpi="http://schemas.microsoft.com/office/word/2010/wordprocessingInk" xmlns:wne="http://schemas.microsoft.com/office/word/2006/wordml" xmlns:wps="http://schemas.microsoft.com/office/word/2010/wordprocessingShape" mc:Ignorable="w14 w15 wp14">
   <w:body>
+    <w:p>
+      <w:pPr>
+        <w:jc w:val="center"/>
+        <w:rPr>
+          <w:rFonts w:ascii="Arial" w:hAnsi="Arial" w:cs="Arial"/>
+          <w:b/>
+          <w:bCs/>
+          <w:sz w:val="50"/>
+          <w:szCs w:val="50"/>
+        </w:rPr>
+      </w:pPr>
+      <w:r>
+        <w:rPr>
+          <w:rFonts w:ascii="Arial" w:hAnsi="Arial" w:cs="Arial"/>
+          <w:b/>
+          <w:bCs/>
+          <w:sz w:val="50"/>
+          <w:szCs w:val="50"/>
+        </w:rPr>
+        <w:t>PharmaKart</w:t>
+      </w:r>
+    </w:p>
+    <w:p>
+      <w:pPr>
+        <w:jc w:val="center"/>
+        <w:rPr>
+          <w:rFonts w:ascii="Arial" w:hAnsi="Arial" w:cs="Arial"/>
+          <w:color w:val="555555"/>
+        </w:rPr>
+      </w:pPr>
+      <w:r>
+        <w:rPr>
+          <w:rFonts w:ascii="Arial" w:hAnsi="Arial" w:cs="Arial"/>
+          <w:color w:val="555555"/>
+        </w:rPr>
+        <w:t>SQL Analysis — Sales &amp; Customer Data</w:t>
+      </w:r>
+    </w:p>
+    <w:p>
+      <w:pPr>
+        <w:jc w:val="center"/>
+        <w:rPr>
+          <w:b/>
+          <w:sz w:val="32"/>
+          <w:szCs w:val="32"/>
+        </w:rPr>
+      </w:pPr>
+      <w:r>
+        <w:rPr>
+          <w:b/>
+          <w:sz w:val="32"/>
+          <w:szCs w:val="32"/>
+        </w:rPr>
+        <w:t>----------------------------------------------------------------------------------------------------------</w:t>
+      </w:r>
+      <w:bookmarkStart w:id="0" w:name="_GoBack"/>
+      <w:bookmarkEnd w:id="0"/>
+    </w:p>
     <w:p>
       <w:pPr>
         <w:rPr>
@@ -1484,7 +1542,47 @@
                 <w:szCs w:val="28"/>
                 <w:shd w:val="clear" w:color="auto" w:fill="FDFDFE"/>
               </w:rPr>
-              <w:t>3183259.03</w:t>
+              <w:t>31</w:t>
+            </w:r>
+            <w:r>
+              <w:rPr>
+                <w:rFonts w:ascii="Arial" w:hAnsi="Arial" w:cs="Arial"/>
+                <w:color w:val="000000"/>
+                <w:sz w:val="28"/>
+                <w:szCs w:val="28"/>
+                <w:shd w:val="clear" w:color="auto" w:fill="FDFDFE"/>
+              </w:rPr>
+              <w:t>,</w:t>
+            </w:r>
+            <w:r>
+              <w:rPr>
+                <w:rFonts w:ascii="Arial" w:hAnsi="Arial" w:cs="Arial"/>
+                <w:color w:val="000000"/>
+                <w:sz w:val="28"/>
+                <w:szCs w:val="28"/>
+                <w:shd w:val="clear" w:color="auto" w:fill="FDFDFE"/>
+              </w:rPr>
+              <w:t>83</w:t>
+            </w:r>
+            <w:r>
+              <w:rPr>
+                <w:rFonts w:ascii="Arial" w:hAnsi="Arial" w:cs="Arial"/>
+                <w:color w:val="000000"/>
+                <w:sz w:val="28"/>
+                <w:szCs w:val="28"/>
+                <w:shd w:val="clear" w:color="auto" w:fill="FDFDFE"/>
+              </w:rPr>
+              <w:t>,</w:t>
+            </w:r>
+            <w:r>
+              <w:rPr>
+                <w:rFonts w:ascii="Arial" w:hAnsi="Arial" w:cs="Arial"/>
+                <w:color w:val="000000"/>
+                <w:sz w:val="28"/>
+                <w:szCs w:val="28"/>
+                <w:shd w:val="clear" w:color="auto" w:fill="FDFDFE"/>
+              </w:rPr>
+              <w:t>259.03</w:t>
             </w:r>
           </w:p>
         </w:tc>
@@ -1627,6 +1725,7 @@
                 <w:szCs w:val="20"/>
                 <w:shd w:val="clear" w:color="auto" w:fill="FDFDFE"/>
               </w:rPr>
+              <w:lastRenderedPageBreak/>
               <w:t>Android</w:t>
             </w:r>
           </w:p>
@@ -1651,7 +1750,47 @@
                 <w:szCs w:val="20"/>
                 <w:shd w:val="clear" w:color="auto" w:fill="FDFDFE"/>
               </w:rPr>
-              <w:t>1962321.34</w:t>
+              <w:t>19</w:t>
+            </w:r>
+            <w:r>
+              <w:rPr>
+                <w:rFonts w:ascii="Arial" w:hAnsi="Arial" w:cs="Arial"/>
+                <w:color w:val="000000"/>
+                <w:sz w:val="20"/>
+                <w:szCs w:val="20"/>
+                <w:shd w:val="clear" w:color="auto" w:fill="FDFDFE"/>
+              </w:rPr>
+              <w:t>,</w:t>
+            </w:r>
+            <w:r>
+              <w:rPr>
+                <w:rFonts w:ascii="Arial" w:hAnsi="Arial" w:cs="Arial"/>
+                <w:color w:val="000000"/>
+                <w:sz w:val="20"/>
+                <w:szCs w:val="20"/>
+                <w:shd w:val="clear" w:color="auto" w:fill="FDFDFE"/>
+              </w:rPr>
+              <w:t>62</w:t>
+            </w:r>
+            <w:r>
+              <w:rPr>
+                <w:rFonts w:ascii="Arial" w:hAnsi="Arial" w:cs="Arial"/>
+                <w:color w:val="000000"/>
+                <w:sz w:val="20"/>
+                <w:szCs w:val="20"/>
+                <w:shd w:val="clear" w:color="auto" w:fill="FDFDFE"/>
+              </w:rPr>
+              <w:t>,</w:t>
+            </w:r>
+            <w:r>
+              <w:rPr>
+                <w:rFonts w:ascii="Arial" w:hAnsi="Arial" w:cs="Arial"/>
+                <w:color w:val="000000"/>
+                <w:sz w:val="20"/>
+                <w:szCs w:val="20"/>
+                <w:shd w:val="clear" w:color="auto" w:fill="FDFDFE"/>
+              </w:rPr>
+              <w:t>321.34</w:t>
             </w:r>
           </w:p>
         </w:tc>
@@ -1703,7 +1842,47 @@
                 <w:szCs w:val="20"/>
                 <w:shd w:val="clear" w:color="auto" w:fill="FDFDFE"/>
               </w:rPr>
-              <w:t>700758.17</w:t>
+              <w:t>7</w:t>
+            </w:r>
+            <w:r>
+              <w:rPr>
+                <w:rFonts w:ascii="Arial" w:hAnsi="Arial" w:cs="Arial"/>
+                <w:color w:val="000000"/>
+                <w:sz w:val="20"/>
+                <w:szCs w:val="20"/>
+                <w:shd w:val="clear" w:color="auto" w:fill="FDFDFE"/>
+              </w:rPr>
+              <w:t>,</w:t>
+            </w:r>
+            <w:r>
+              <w:rPr>
+                <w:rFonts w:ascii="Arial" w:hAnsi="Arial" w:cs="Arial"/>
+                <w:color w:val="000000"/>
+                <w:sz w:val="20"/>
+                <w:szCs w:val="20"/>
+                <w:shd w:val="clear" w:color="auto" w:fill="FDFDFE"/>
+              </w:rPr>
+              <w:t>00</w:t>
+            </w:r>
+            <w:r>
+              <w:rPr>
+                <w:rFonts w:ascii="Arial" w:hAnsi="Arial" w:cs="Arial"/>
+                <w:color w:val="000000"/>
+                <w:sz w:val="20"/>
+                <w:szCs w:val="20"/>
+                <w:shd w:val="clear" w:color="auto" w:fill="FDFDFE"/>
+              </w:rPr>
+              <w:t>,</w:t>
+            </w:r>
+            <w:r>
+              <w:rPr>
+                <w:rFonts w:ascii="Arial" w:hAnsi="Arial" w:cs="Arial"/>
+                <w:color w:val="000000"/>
+                <w:sz w:val="20"/>
+                <w:szCs w:val="20"/>
+                <w:shd w:val="clear" w:color="auto" w:fill="FDFDFE"/>
+              </w:rPr>
+              <w:t>758.17</w:t>
             </w:r>
           </w:p>
         </w:tc>
@@ -1755,7 +1934,47 @@
                 <w:szCs w:val="20"/>
                 <w:shd w:val="clear" w:color="auto" w:fill="FDFDFE"/>
               </w:rPr>
-              <w:t>520179.52</w:t>
+              <w:t>5</w:t>
+            </w:r>
+            <w:r>
+              <w:rPr>
+                <w:rFonts w:ascii="Arial" w:hAnsi="Arial" w:cs="Arial"/>
+                <w:color w:val="000000"/>
+                <w:sz w:val="20"/>
+                <w:szCs w:val="20"/>
+                <w:shd w:val="clear" w:color="auto" w:fill="FDFDFE"/>
+              </w:rPr>
+              <w:t>,</w:t>
+            </w:r>
+            <w:r>
+              <w:rPr>
+                <w:rFonts w:ascii="Arial" w:hAnsi="Arial" w:cs="Arial"/>
+                <w:color w:val="000000"/>
+                <w:sz w:val="20"/>
+                <w:szCs w:val="20"/>
+                <w:shd w:val="clear" w:color="auto" w:fill="FDFDFE"/>
+              </w:rPr>
+              <w:t>20</w:t>
+            </w:r>
+            <w:r>
+              <w:rPr>
+                <w:rFonts w:ascii="Arial" w:hAnsi="Arial" w:cs="Arial"/>
+                <w:color w:val="000000"/>
+                <w:sz w:val="20"/>
+                <w:szCs w:val="20"/>
+                <w:shd w:val="clear" w:color="auto" w:fill="FDFDFE"/>
+              </w:rPr>
+              <w:t>,</w:t>
+            </w:r>
+            <w:r>
+              <w:rPr>
+                <w:rFonts w:ascii="Arial" w:hAnsi="Arial" w:cs="Arial"/>
+                <w:color w:val="000000"/>
+                <w:sz w:val="20"/>
+                <w:szCs w:val="20"/>
+                <w:shd w:val="clear" w:color="auto" w:fill="FDFDFE"/>
+              </w:rPr>
+              <w:t>179.52</w:t>
             </w:r>
           </w:p>
         </w:tc>
@@ -1805,7 +2024,6 @@
           <w:sz w:val="24"/>
           <w:szCs w:val="24"/>
         </w:rPr>
-        <w:lastRenderedPageBreak/>
         <w:t>Which acquisition channels have brought the most customers?</w:t>
       </w:r>
     </w:p>
@@ -1918,7 +2136,47 @@
                 <w:szCs w:val="20"/>
                 <w:shd w:val="clear" w:color="auto" w:fill="FDFDFE"/>
               </w:rPr>
-              <w:t>1182687.89</w:t>
+              <w:t>11</w:t>
+            </w:r>
+            <w:r>
+              <w:rPr>
+                <w:rFonts w:ascii="Arial" w:hAnsi="Arial" w:cs="Arial"/>
+                <w:color w:val="000000"/>
+                <w:sz w:val="20"/>
+                <w:szCs w:val="20"/>
+                <w:shd w:val="clear" w:color="auto" w:fill="FDFDFE"/>
+              </w:rPr>
+              <w:t>,</w:t>
+            </w:r>
+            <w:r>
+              <w:rPr>
+                <w:rFonts w:ascii="Arial" w:hAnsi="Arial" w:cs="Arial"/>
+                <w:color w:val="000000"/>
+                <w:sz w:val="20"/>
+                <w:szCs w:val="20"/>
+                <w:shd w:val="clear" w:color="auto" w:fill="FDFDFE"/>
+              </w:rPr>
+              <w:t>82</w:t>
+            </w:r>
+            <w:r>
+              <w:rPr>
+                <w:rFonts w:ascii="Arial" w:hAnsi="Arial" w:cs="Arial"/>
+                <w:color w:val="000000"/>
+                <w:sz w:val="20"/>
+                <w:szCs w:val="20"/>
+                <w:shd w:val="clear" w:color="auto" w:fill="FDFDFE"/>
+              </w:rPr>
+              <w:t>,</w:t>
+            </w:r>
+            <w:r>
+              <w:rPr>
+                <w:rFonts w:ascii="Arial" w:hAnsi="Arial" w:cs="Arial"/>
+                <w:color w:val="000000"/>
+                <w:sz w:val="20"/>
+                <w:szCs w:val="20"/>
+                <w:shd w:val="clear" w:color="auto" w:fill="FDFDFE"/>
+              </w:rPr>
+              <w:t>687.89</w:t>
             </w:r>
           </w:p>
         </w:tc>
@@ -1970,7 +2228,47 @@
                 <w:szCs w:val="20"/>
                 <w:shd w:val="clear" w:color="auto" w:fill="FDFDFE"/>
               </w:rPr>
-              <w:t>646789.05</w:t>
+              <w:t>6</w:t>
+            </w:r>
+            <w:r>
+              <w:rPr>
+                <w:rFonts w:ascii="Arial" w:hAnsi="Arial" w:cs="Arial"/>
+                <w:color w:val="000000"/>
+                <w:sz w:val="20"/>
+                <w:szCs w:val="20"/>
+                <w:shd w:val="clear" w:color="auto" w:fill="FDFDFE"/>
+              </w:rPr>
+              <w:t>,</w:t>
+            </w:r>
+            <w:r>
+              <w:rPr>
+                <w:rFonts w:ascii="Arial" w:hAnsi="Arial" w:cs="Arial"/>
+                <w:color w:val="000000"/>
+                <w:sz w:val="20"/>
+                <w:szCs w:val="20"/>
+                <w:shd w:val="clear" w:color="auto" w:fill="FDFDFE"/>
+              </w:rPr>
+              <w:t>46</w:t>
+            </w:r>
+            <w:r>
+              <w:rPr>
+                <w:rFonts w:ascii="Arial" w:hAnsi="Arial" w:cs="Arial"/>
+                <w:color w:val="000000"/>
+                <w:sz w:val="20"/>
+                <w:szCs w:val="20"/>
+                <w:shd w:val="clear" w:color="auto" w:fill="FDFDFE"/>
+              </w:rPr>
+              <w:t>,</w:t>
+            </w:r>
+            <w:r>
+              <w:rPr>
+                <w:rFonts w:ascii="Arial" w:hAnsi="Arial" w:cs="Arial"/>
+                <w:color w:val="000000"/>
+                <w:sz w:val="20"/>
+                <w:szCs w:val="20"/>
+                <w:shd w:val="clear" w:color="auto" w:fill="FDFDFE"/>
+              </w:rPr>
+              <w:t>789.05</w:t>
             </w:r>
           </w:p>
         </w:tc>
@@ -2022,7 +2320,47 @@
                 <w:szCs w:val="20"/>
                 <w:shd w:val="clear" w:color="auto" w:fill="FDFDFE"/>
               </w:rPr>
-              <w:t>497038.54</w:t>
+              <w:t>4</w:t>
+            </w:r>
+            <w:r>
+              <w:rPr>
+                <w:rFonts w:ascii="Arial" w:hAnsi="Arial" w:cs="Arial"/>
+                <w:color w:val="000000"/>
+                <w:sz w:val="20"/>
+                <w:szCs w:val="20"/>
+                <w:shd w:val="clear" w:color="auto" w:fill="FDFDFE"/>
+              </w:rPr>
+              <w:t>,</w:t>
+            </w:r>
+            <w:r>
+              <w:rPr>
+                <w:rFonts w:ascii="Arial" w:hAnsi="Arial" w:cs="Arial"/>
+                <w:color w:val="000000"/>
+                <w:sz w:val="20"/>
+                <w:szCs w:val="20"/>
+                <w:shd w:val="clear" w:color="auto" w:fill="FDFDFE"/>
+              </w:rPr>
+              <w:t>97</w:t>
+            </w:r>
+            <w:r>
+              <w:rPr>
+                <w:rFonts w:ascii="Arial" w:hAnsi="Arial" w:cs="Arial"/>
+                <w:color w:val="000000"/>
+                <w:sz w:val="20"/>
+                <w:szCs w:val="20"/>
+                <w:shd w:val="clear" w:color="auto" w:fill="FDFDFE"/>
+              </w:rPr>
+              <w:t>,</w:t>
+            </w:r>
+            <w:r>
+              <w:rPr>
+                <w:rFonts w:ascii="Arial" w:hAnsi="Arial" w:cs="Arial"/>
+                <w:color w:val="000000"/>
+                <w:sz w:val="20"/>
+                <w:szCs w:val="20"/>
+                <w:shd w:val="clear" w:color="auto" w:fill="FDFDFE"/>
+              </w:rPr>
+              <w:t>038.54</w:t>
             </w:r>
           </w:p>
         </w:tc>
@@ -2080,7 +2418,47 @@
                 <w:szCs w:val="20"/>
                 <w:shd w:val="clear" w:color="auto" w:fill="FDFDFE"/>
               </w:rPr>
-              <w:t>400471.50</w:t>
+              <w:t>4</w:t>
+            </w:r>
+            <w:r>
+              <w:rPr>
+                <w:rFonts w:ascii="Arial" w:hAnsi="Arial" w:cs="Arial"/>
+                <w:color w:val="000000"/>
+                <w:sz w:val="20"/>
+                <w:szCs w:val="20"/>
+                <w:shd w:val="clear" w:color="auto" w:fill="FDFDFE"/>
+              </w:rPr>
+              <w:t>,</w:t>
+            </w:r>
+            <w:r>
+              <w:rPr>
+                <w:rFonts w:ascii="Arial" w:hAnsi="Arial" w:cs="Arial"/>
+                <w:color w:val="000000"/>
+                <w:sz w:val="20"/>
+                <w:szCs w:val="20"/>
+                <w:shd w:val="clear" w:color="auto" w:fill="FDFDFE"/>
+              </w:rPr>
+              <w:t>00</w:t>
+            </w:r>
+            <w:r>
+              <w:rPr>
+                <w:rFonts w:ascii="Arial" w:hAnsi="Arial" w:cs="Arial"/>
+                <w:color w:val="000000"/>
+                <w:sz w:val="20"/>
+                <w:szCs w:val="20"/>
+                <w:shd w:val="clear" w:color="auto" w:fill="FDFDFE"/>
+              </w:rPr>
+              <w:t>,</w:t>
+            </w:r>
+            <w:r>
+              <w:rPr>
+                <w:rFonts w:ascii="Arial" w:hAnsi="Arial" w:cs="Arial"/>
+                <w:color w:val="000000"/>
+                <w:sz w:val="20"/>
+                <w:szCs w:val="20"/>
+                <w:shd w:val="clear" w:color="auto" w:fill="FDFDFE"/>
+              </w:rPr>
+              <w:t>471.50</w:t>
             </w:r>
           </w:p>
         </w:tc>
@@ -2138,7 +2516,47 @@
                 <w:szCs w:val="20"/>
                 <w:shd w:val="clear" w:color="auto" w:fill="FDFDFE"/>
               </w:rPr>
-              <w:t>253909.92</w:t>
+              <w:t>2</w:t>
+            </w:r>
+            <w:r>
+              <w:rPr>
+                <w:rFonts w:ascii="Arial" w:hAnsi="Arial" w:cs="Arial"/>
+                <w:color w:val="000000"/>
+                <w:sz w:val="20"/>
+                <w:szCs w:val="20"/>
+                <w:shd w:val="clear" w:color="auto" w:fill="FDFDFE"/>
+              </w:rPr>
+              <w:t>,</w:t>
+            </w:r>
+            <w:r>
+              <w:rPr>
+                <w:rFonts w:ascii="Arial" w:hAnsi="Arial" w:cs="Arial"/>
+                <w:color w:val="000000"/>
+                <w:sz w:val="20"/>
+                <w:szCs w:val="20"/>
+                <w:shd w:val="clear" w:color="auto" w:fill="FDFDFE"/>
+              </w:rPr>
+              <w:t>53</w:t>
+            </w:r>
+            <w:r>
+              <w:rPr>
+                <w:rFonts w:ascii="Arial" w:hAnsi="Arial" w:cs="Arial"/>
+                <w:color w:val="000000"/>
+                <w:sz w:val="20"/>
+                <w:szCs w:val="20"/>
+                <w:shd w:val="clear" w:color="auto" w:fill="FDFDFE"/>
+              </w:rPr>
+              <w:t>,</w:t>
+            </w:r>
+            <w:r>
+              <w:rPr>
+                <w:rFonts w:ascii="Arial" w:hAnsi="Arial" w:cs="Arial"/>
+                <w:color w:val="000000"/>
+                <w:sz w:val="20"/>
+                <w:szCs w:val="20"/>
+                <w:shd w:val="clear" w:color="auto" w:fill="FDFDFE"/>
+              </w:rPr>
+              <w:t>909.92</w:t>
             </w:r>
           </w:p>
         </w:tc>
@@ -2196,7 +2614,47 @@
                 <w:szCs w:val="20"/>
                 <w:shd w:val="clear" w:color="auto" w:fill="FDFDFE"/>
               </w:rPr>
-              <w:t>120481.43</w:t>
+              <w:t>1</w:t>
+            </w:r>
+            <w:r>
+              <w:rPr>
+                <w:rFonts w:ascii="Arial" w:hAnsi="Arial" w:cs="Arial"/>
+                <w:color w:val="000000"/>
+                <w:sz w:val="20"/>
+                <w:szCs w:val="20"/>
+                <w:shd w:val="clear" w:color="auto" w:fill="FDFDFE"/>
+              </w:rPr>
+              <w:t>,</w:t>
+            </w:r>
+            <w:r>
+              <w:rPr>
+                <w:rFonts w:ascii="Arial" w:hAnsi="Arial" w:cs="Arial"/>
+                <w:color w:val="000000"/>
+                <w:sz w:val="20"/>
+                <w:szCs w:val="20"/>
+                <w:shd w:val="clear" w:color="auto" w:fill="FDFDFE"/>
+              </w:rPr>
+              <w:t>20</w:t>
+            </w:r>
+            <w:r>
+              <w:rPr>
+                <w:rFonts w:ascii="Arial" w:hAnsi="Arial" w:cs="Arial"/>
+                <w:color w:val="000000"/>
+                <w:sz w:val="20"/>
+                <w:szCs w:val="20"/>
+                <w:shd w:val="clear" w:color="auto" w:fill="FDFDFE"/>
+              </w:rPr>
+              <w:t>,</w:t>
+            </w:r>
+            <w:r>
+              <w:rPr>
+                <w:rFonts w:ascii="Arial" w:hAnsi="Arial" w:cs="Arial"/>
+                <w:color w:val="000000"/>
+                <w:sz w:val="20"/>
+                <w:szCs w:val="20"/>
+                <w:shd w:val="clear" w:color="auto" w:fill="FDFDFE"/>
+              </w:rPr>
+              <w:t>481.43</w:t>
             </w:r>
           </w:p>
         </w:tc>
@@ -3735,7 +4193,27 @@
                 <w:szCs w:val="20"/>
                 <w:shd w:val="clear" w:color="auto" w:fill="FDFDFE"/>
               </w:rPr>
-              <w:t>1999.00</w:t>
+              <w:t>1</w:t>
+            </w:r>
+            <w:r>
+              <w:rPr>
+                <w:rFonts w:ascii="Arial" w:hAnsi="Arial" w:cs="Arial"/>
+                <w:color w:val="000000"/>
+                <w:sz w:val="20"/>
+                <w:szCs w:val="20"/>
+                <w:shd w:val="clear" w:color="auto" w:fill="FDFDFE"/>
+              </w:rPr>
+              <w:t>,</w:t>
+            </w:r>
+            <w:r>
+              <w:rPr>
+                <w:rFonts w:ascii="Arial" w:hAnsi="Arial" w:cs="Arial"/>
+                <w:color w:val="000000"/>
+                <w:sz w:val="20"/>
+                <w:szCs w:val="20"/>
+                <w:shd w:val="clear" w:color="auto" w:fill="FDFDFE"/>
+              </w:rPr>
+              <w:t>999.00</w:t>
             </w:r>
           </w:p>
         </w:tc>
@@ -3844,6 +4322,7 @@
                 <w:szCs w:val="20"/>
                 <w:shd w:val="clear" w:color="auto" w:fill="FDFDFE"/>
               </w:rPr>
+              <w:lastRenderedPageBreak/>
               <w:t>Nebulizer Machine</w:t>
             </w:r>
           </w:p>
@@ -3868,7 +4347,27 @@
                 <w:szCs w:val="20"/>
                 <w:shd w:val="clear" w:color="auto" w:fill="FDFDFE"/>
               </w:rPr>
-              <w:t>2999.00</w:t>
+              <w:t>2</w:t>
+            </w:r>
+            <w:r>
+              <w:rPr>
+                <w:rFonts w:ascii="Arial" w:hAnsi="Arial" w:cs="Arial"/>
+                <w:color w:val="000000"/>
+                <w:sz w:val="20"/>
+                <w:szCs w:val="20"/>
+                <w:shd w:val="clear" w:color="auto" w:fill="FDFDFE"/>
+              </w:rPr>
+              <w:t>,</w:t>
+            </w:r>
+            <w:r>
+              <w:rPr>
+                <w:rFonts w:ascii="Arial" w:hAnsi="Arial" w:cs="Arial"/>
+                <w:color w:val="000000"/>
+                <w:sz w:val="20"/>
+                <w:szCs w:val="20"/>
+                <w:shd w:val="clear" w:color="auto" w:fill="FDFDFE"/>
+              </w:rPr>
+              <w:t>999.00</w:t>
             </w:r>
           </w:p>
         </w:tc>
@@ -3895,7 +4394,27 @@
                 <w:szCs w:val="20"/>
                 <w:shd w:val="clear" w:color="auto" w:fill="FDFDFE"/>
               </w:rPr>
-              <w:t>2099.30</w:t>
+              <w:t>2</w:t>
+            </w:r>
+            <w:r>
+              <w:rPr>
+                <w:rFonts w:ascii="Arial" w:hAnsi="Arial" w:cs="Arial"/>
+                <w:color w:val="000000"/>
+                <w:sz w:val="20"/>
+                <w:szCs w:val="20"/>
+                <w:shd w:val="clear" w:color="auto" w:fill="FDFDFE"/>
+              </w:rPr>
+              <w:t>,</w:t>
+            </w:r>
+            <w:r>
+              <w:rPr>
+                <w:rFonts w:ascii="Arial" w:hAnsi="Arial" w:cs="Arial"/>
+                <w:color w:val="000000"/>
+                <w:sz w:val="20"/>
+                <w:szCs w:val="20"/>
+                <w:shd w:val="clear" w:color="auto" w:fill="FDFDFE"/>
+              </w:rPr>
+              <w:t>099.30</w:t>
             </w:r>
           </w:p>
         </w:tc>
@@ -4001,7 +4520,27 @@
                 <w:szCs w:val="20"/>
                 <w:shd w:val="clear" w:color="auto" w:fill="FDFDFE"/>
               </w:rPr>
-              <w:t>2499.00</w:t>
+              <w:t>2</w:t>
+            </w:r>
+            <w:r>
+              <w:rPr>
+                <w:rFonts w:ascii="Arial" w:hAnsi="Arial" w:cs="Arial"/>
+                <w:color w:val="000000"/>
+                <w:sz w:val="20"/>
+                <w:szCs w:val="20"/>
+                <w:shd w:val="clear" w:color="auto" w:fill="FDFDFE"/>
+              </w:rPr>
+              <w:t>,</w:t>
+            </w:r>
+            <w:r>
+              <w:rPr>
+                <w:rFonts w:ascii="Arial" w:hAnsi="Arial" w:cs="Arial"/>
+                <w:color w:val="000000"/>
+                <w:sz w:val="20"/>
+                <w:szCs w:val="20"/>
+                <w:shd w:val="clear" w:color="auto" w:fill="FDFDFE"/>
+              </w:rPr>
+              <w:t>499.00</w:t>
             </w:r>
           </w:p>
         </w:tc>
@@ -4028,7 +4567,27 @@
                 <w:szCs w:val="20"/>
                 <w:shd w:val="clear" w:color="auto" w:fill="FDFDFE"/>
               </w:rPr>
-              <w:t>1624.35</w:t>
+              <w:t>1</w:t>
+            </w:r>
+            <w:r>
+              <w:rPr>
+                <w:rFonts w:ascii="Arial" w:hAnsi="Arial" w:cs="Arial"/>
+                <w:color w:val="000000"/>
+                <w:sz w:val="20"/>
+                <w:szCs w:val="20"/>
+                <w:shd w:val="clear" w:color="auto" w:fill="FDFDFE"/>
+              </w:rPr>
+              <w:t>,</w:t>
+            </w:r>
+            <w:r>
+              <w:rPr>
+                <w:rFonts w:ascii="Arial" w:hAnsi="Arial" w:cs="Arial"/>
+                <w:color w:val="000000"/>
+                <w:sz w:val="20"/>
+                <w:szCs w:val="20"/>
+                <w:shd w:val="clear" w:color="auto" w:fill="FDFDFE"/>
+              </w:rPr>
+              <w:t>624.35</w:t>
             </w:r>
           </w:p>
         </w:tc>
@@ -4140,7 +4699,27 @@
                 <w:szCs w:val="20"/>
                 <w:shd w:val="clear" w:color="auto" w:fill="FDFDFE"/>
               </w:rPr>
-              <w:t>2499.00</w:t>
+              <w:t>2</w:t>
+            </w:r>
+            <w:r>
+              <w:rPr>
+                <w:rFonts w:ascii="Arial" w:hAnsi="Arial" w:cs="Arial"/>
+                <w:color w:val="000000"/>
+                <w:sz w:val="20"/>
+                <w:szCs w:val="20"/>
+                <w:shd w:val="clear" w:color="auto" w:fill="FDFDFE"/>
+              </w:rPr>
+              <w:t>,</w:t>
+            </w:r>
+            <w:r>
+              <w:rPr>
+                <w:rFonts w:ascii="Arial" w:hAnsi="Arial" w:cs="Arial"/>
+                <w:color w:val="000000"/>
+                <w:sz w:val="20"/>
+                <w:szCs w:val="20"/>
+                <w:shd w:val="clear" w:color="auto" w:fill="FDFDFE"/>
+              </w:rPr>
+              <w:t>499.00</w:t>
             </w:r>
           </w:p>
         </w:tc>
@@ -4167,7 +4746,27 @@
                 <w:szCs w:val="20"/>
                 <w:shd w:val="clear" w:color="auto" w:fill="FDFDFE"/>
               </w:rPr>
-              <w:t>1999.20</w:t>
+              <w:t>1</w:t>
+            </w:r>
+            <w:r>
+              <w:rPr>
+                <w:rFonts w:ascii="Arial" w:hAnsi="Arial" w:cs="Arial"/>
+                <w:color w:val="000000"/>
+                <w:sz w:val="20"/>
+                <w:szCs w:val="20"/>
+                <w:shd w:val="clear" w:color="auto" w:fill="FDFDFE"/>
+              </w:rPr>
+              <w:t>,</w:t>
+            </w:r>
+            <w:r>
+              <w:rPr>
+                <w:rFonts w:ascii="Arial" w:hAnsi="Arial" w:cs="Arial"/>
+                <w:color w:val="000000"/>
+                <w:sz w:val="20"/>
+                <w:szCs w:val="20"/>
+                <w:shd w:val="clear" w:color="auto" w:fill="FDFDFE"/>
+              </w:rPr>
+              <w:t>999.20</w:t>
             </w:r>
           </w:p>
         </w:tc>
@@ -4279,7 +4878,27 @@
                 <w:szCs w:val="20"/>
                 <w:shd w:val="clear" w:color="auto" w:fill="FDFDFE"/>
               </w:rPr>
-              <w:t>1499.00</w:t>
+              <w:t>1</w:t>
+            </w:r>
+            <w:r>
+              <w:rPr>
+                <w:rFonts w:ascii="Arial" w:hAnsi="Arial" w:cs="Arial"/>
+                <w:color w:val="000000"/>
+                <w:sz w:val="20"/>
+                <w:szCs w:val="20"/>
+                <w:shd w:val="clear" w:color="auto" w:fill="FDFDFE"/>
+              </w:rPr>
+              <w:t>,</w:t>
+            </w:r>
+            <w:r>
+              <w:rPr>
+                <w:rFonts w:ascii="Arial" w:hAnsi="Arial" w:cs="Arial"/>
+                <w:color w:val="000000"/>
+                <w:sz w:val="20"/>
+                <w:szCs w:val="20"/>
+                <w:shd w:val="clear" w:color="auto" w:fill="FDFDFE"/>
+              </w:rPr>
+              <w:t>499.00</w:t>
             </w:r>
           </w:p>
         </w:tc>
@@ -4306,7 +4925,27 @@
                 <w:szCs w:val="20"/>
                 <w:shd w:val="clear" w:color="auto" w:fill="FDFDFE"/>
               </w:rPr>
-              <w:t>1049.30</w:t>
+              <w:t>1</w:t>
+            </w:r>
+            <w:r>
+              <w:rPr>
+                <w:rFonts w:ascii="Arial" w:hAnsi="Arial" w:cs="Arial"/>
+                <w:color w:val="000000"/>
+                <w:sz w:val="20"/>
+                <w:szCs w:val="20"/>
+                <w:shd w:val="clear" w:color="auto" w:fill="FDFDFE"/>
+              </w:rPr>
+              <w:t>,</w:t>
+            </w:r>
+            <w:r>
+              <w:rPr>
+                <w:rFonts w:ascii="Arial" w:hAnsi="Arial" w:cs="Arial"/>
+                <w:color w:val="000000"/>
+                <w:sz w:val="20"/>
+                <w:szCs w:val="20"/>
+                <w:shd w:val="clear" w:color="auto" w:fill="FDFDFE"/>
+              </w:rPr>
+              <w:t>049.30</w:t>
             </w:r>
           </w:p>
         </w:tc>
@@ -4388,7 +5027,6 @@
                 <w:sz w:val="32"/>
                 <w:szCs w:val="32"/>
               </w:rPr>
-              <w:lastRenderedPageBreak/>
               <w:t>PRODUCT NAME</w:t>
             </w:r>
           </w:p>
@@ -4539,7 +5177,27 @@
                 <w:szCs w:val="20"/>
                 <w:shd w:val="clear" w:color="auto" w:fill="FDFDFE"/>
               </w:rPr>
-              <w:t>1150.00</w:t>
+              <w:t>1</w:t>
+            </w:r>
+            <w:r>
+              <w:rPr>
+                <w:rFonts w:ascii="Arial" w:hAnsi="Arial" w:cs="Arial"/>
+                <w:color w:val="000000"/>
+                <w:sz w:val="20"/>
+                <w:szCs w:val="20"/>
+                <w:shd w:val="clear" w:color="auto" w:fill="FDFDFE"/>
+              </w:rPr>
+              <w:t>,</w:t>
+            </w:r>
+            <w:r>
+              <w:rPr>
+                <w:rFonts w:ascii="Arial" w:hAnsi="Arial" w:cs="Arial"/>
+                <w:color w:val="000000"/>
+                <w:sz w:val="20"/>
+                <w:szCs w:val="20"/>
+                <w:shd w:val="clear" w:color="auto" w:fill="FDFDFE"/>
+              </w:rPr>
+              <w:t>150.00</w:t>
             </w:r>
           </w:p>
         </w:tc>
@@ -5506,7 +6164,47 @@
                 <w:szCs w:val="20"/>
                 <w:shd w:val="clear" w:color="auto" w:fill="FDFDFE"/>
               </w:rPr>
-              <w:t>2517915.60</w:t>
+              <w:t>25</w:t>
+            </w:r>
+            <w:r>
+              <w:rPr>
+                <w:rFonts w:ascii="Arial" w:hAnsi="Arial" w:cs="Arial"/>
+                <w:color w:val="000000"/>
+                <w:sz w:val="20"/>
+                <w:szCs w:val="20"/>
+                <w:shd w:val="clear" w:color="auto" w:fill="FDFDFE"/>
+              </w:rPr>
+              <w:t>,</w:t>
+            </w:r>
+            <w:r>
+              <w:rPr>
+                <w:rFonts w:ascii="Arial" w:hAnsi="Arial" w:cs="Arial"/>
+                <w:color w:val="000000"/>
+                <w:sz w:val="20"/>
+                <w:szCs w:val="20"/>
+                <w:shd w:val="clear" w:color="auto" w:fill="FDFDFE"/>
+              </w:rPr>
+              <w:t>17</w:t>
+            </w:r>
+            <w:r>
+              <w:rPr>
+                <w:rFonts w:ascii="Arial" w:hAnsi="Arial" w:cs="Arial"/>
+                <w:color w:val="000000"/>
+                <w:sz w:val="20"/>
+                <w:szCs w:val="20"/>
+                <w:shd w:val="clear" w:color="auto" w:fill="FDFDFE"/>
+              </w:rPr>
+              <w:t>,</w:t>
+            </w:r>
+            <w:r>
+              <w:rPr>
+                <w:rFonts w:ascii="Arial" w:hAnsi="Arial" w:cs="Arial"/>
+                <w:color w:val="000000"/>
+                <w:sz w:val="20"/>
+                <w:szCs w:val="20"/>
+                <w:shd w:val="clear" w:color="auto" w:fill="FDFDFE"/>
+              </w:rPr>
+              <w:t>915.60</w:t>
             </w:r>
           </w:p>
         </w:tc>
@@ -5666,7 +6364,47 @@
                 <w:szCs w:val="20"/>
                 <w:shd w:val="clear" w:color="auto" w:fill="FDFDFE"/>
               </w:rPr>
-              <w:t>628046.20</w:t>
+              <w:t>6</w:t>
+            </w:r>
+            <w:r>
+              <w:rPr>
+                <w:rFonts w:ascii="Arial" w:hAnsi="Arial" w:cs="Arial"/>
+                <w:color w:val="000000"/>
+                <w:sz w:val="20"/>
+                <w:szCs w:val="20"/>
+                <w:shd w:val="clear" w:color="auto" w:fill="FDFDFE"/>
+              </w:rPr>
+              <w:t>,</w:t>
+            </w:r>
+            <w:r>
+              <w:rPr>
+                <w:rFonts w:ascii="Arial" w:hAnsi="Arial" w:cs="Arial"/>
+                <w:color w:val="000000"/>
+                <w:sz w:val="20"/>
+                <w:szCs w:val="20"/>
+                <w:shd w:val="clear" w:color="auto" w:fill="FDFDFE"/>
+              </w:rPr>
+              <w:t>28</w:t>
+            </w:r>
+            <w:r>
+              <w:rPr>
+                <w:rFonts w:ascii="Arial" w:hAnsi="Arial" w:cs="Arial"/>
+                <w:color w:val="000000"/>
+                <w:sz w:val="20"/>
+                <w:szCs w:val="20"/>
+                <w:shd w:val="clear" w:color="auto" w:fill="FDFDFE"/>
+              </w:rPr>
+              <w:t>,</w:t>
+            </w:r>
+            <w:r>
+              <w:rPr>
+                <w:rFonts w:ascii="Arial" w:hAnsi="Arial" w:cs="Arial"/>
+                <w:color w:val="000000"/>
+                <w:sz w:val="20"/>
+                <w:szCs w:val="20"/>
+                <w:shd w:val="clear" w:color="auto" w:fill="FDFDFE"/>
+              </w:rPr>
+              <w:t>046.20</w:t>
             </w:r>
           </w:p>
         </w:tc>
@@ -6040,7 +6778,47 @@
                 <w:szCs w:val="20"/>
                 <w:shd w:val="clear" w:color="auto" w:fill="FDFDFE"/>
               </w:rPr>
-              <w:t>1452645.15</w:t>
+              <w:t>14</w:t>
+            </w:r>
+            <w:r>
+              <w:rPr>
+                <w:rFonts w:ascii="Arial" w:hAnsi="Arial" w:cs="Arial"/>
+                <w:color w:val="000000"/>
+                <w:sz w:val="20"/>
+                <w:szCs w:val="20"/>
+                <w:shd w:val="clear" w:color="auto" w:fill="FDFDFE"/>
+              </w:rPr>
+              <w:t>,</w:t>
+            </w:r>
+            <w:r>
+              <w:rPr>
+                <w:rFonts w:ascii="Arial" w:hAnsi="Arial" w:cs="Arial"/>
+                <w:color w:val="000000"/>
+                <w:sz w:val="20"/>
+                <w:szCs w:val="20"/>
+                <w:shd w:val="clear" w:color="auto" w:fill="FDFDFE"/>
+              </w:rPr>
+              <w:t>52</w:t>
+            </w:r>
+            <w:r>
+              <w:rPr>
+                <w:rFonts w:ascii="Arial" w:hAnsi="Arial" w:cs="Arial"/>
+                <w:color w:val="000000"/>
+                <w:sz w:val="20"/>
+                <w:szCs w:val="20"/>
+                <w:shd w:val="clear" w:color="auto" w:fill="FDFDFE"/>
+              </w:rPr>
+              <w:t>,</w:t>
+            </w:r>
+            <w:r>
+              <w:rPr>
+                <w:rFonts w:ascii="Arial" w:hAnsi="Arial" w:cs="Arial"/>
+                <w:color w:val="000000"/>
+                <w:sz w:val="20"/>
+                <w:szCs w:val="20"/>
+                <w:shd w:val="clear" w:color="auto" w:fill="FDFDFE"/>
+              </w:rPr>
+              <w:t>645.15</w:t>
             </w:r>
           </w:p>
         </w:tc>
@@ -6200,7 +6978,47 @@
                 <w:szCs w:val="20"/>
                 <w:shd w:val="clear" w:color="auto" w:fill="FDFDFE"/>
               </w:rPr>
-              <w:t>1693316.65</w:t>
+              <w:t>16</w:t>
+            </w:r>
+            <w:r>
+              <w:rPr>
+                <w:rFonts w:ascii="Arial" w:hAnsi="Arial" w:cs="Arial"/>
+                <w:color w:val="000000"/>
+                <w:sz w:val="20"/>
+                <w:szCs w:val="20"/>
+                <w:shd w:val="clear" w:color="auto" w:fill="FDFDFE"/>
+              </w:rPr>
+              <w:t>,</w:t>
+            </w:r>
+            <w:r>
+              <w:rPr>
+                <w:rFonts w:ascii="Arial" w:hAnsi="Arial" w:cs="Arial"/>
+                <w:color w:val="000000"/>
+                <w:sz w:val="20"/>
+                <w:szCs w:val="20"/>
+                <w:shd w:val="clear" w:color="auto" w:fill="FDFDFE"/>
+              </w:rPr>
+              <w:t>93</w:t>
+            </w:r>
+            <w:r>
+              <w:rPr>
+                <w:rFonts w:ascii="Arial" w:hAnsi="Arial" w:cs="Arial"/>
+                <w:color w:val="000000"/>
+                <w:sz w:val="20"/>
+                <w:szCs w:val="20"/>
+                <w:shd w:val="clear" w:color="auto" w:fill="FDFDFE"/>
+              </w:rPr>
+              <w:t>,</w:t>
+            </w:r>
+            <w:r>
+              <w:rPr>
+                <w:rFonts w:ascii="Arial" w:hAnsi="Arial" w:cs="Arial"/>
+                <w:color w:val="000000"/>
+                <w:sz w:val="20"/>
+                <w:szCs w:val="20"/>
+                <w:shd w:val="clear" w:color="auto" w:fill="FDFDFE"/>
+              </w:rPr>
+              <w:t>316.65</w:t>
             </w:r>
           </w:p>
         </w:tc>
@@ -6482,7 +7300,47 @@
                 <w:szCs w:val="20"/>
                 <w:shd w:val="clear" w:color="auto" w:fill="FDFDFE"/>
               </w:rPr>
-              <w:t>394788.95</w:t>
+              <w:t>3</w:t>
+            </w:r>
+            <w:r>
+              <w:rPr>
+                <w:rFonts w:ascii="Arial" w:hAnsi="Arial" w:cs="Arial"/>
+                <w:color w:val="000000"/>
+                <w:sz w:val="20"/>
+                <w:szCs w:val="20"/>
+                <w:shd w:val="clear" w:color="auto" w:fill="FDFDFE"/>
+              </w:rPr>
+              <w:t>,</w:t>
+            </w:r>
+            <w:r>
+              <w:rPr>
+                <w:rFonts w:ascii="Arial" w:hAnsi="Arial" w:cs="Arial"/>
+                <w:color w:val="000000"/>
+                <w:sz w:val="20"/>
+                <w:szCs w:val="20"/>
+                <w:shd w:val="clear" w:color="auto" w:fill="FDFDFE"/>
+              </w:rPr>
+              <w:t>94</w:t>
+            </w:r>
+            <w:r>
+              <w:rPr>
+                <w:rFonts w:ascii="Arial" w:hAnsi="Arial" w:cs="Arial"/>
+                <w:color w:val="000000"/>
+                <w:sz w:val="20"/>
+                <w:szCs w:val="20"/>
+                <w:shd w:val="clear" w:color="auto" w:fill="FDFDFE"/>
+              </w:rPr>
+              <w:t>,</w:t>
+            </w:r>
+            <w:r>
+              <w:rPr>
+                <w:rFonts w:ascii="Arial" w:hAnsi="Arial" w:cs="Arial"/>
+                <w:color w:val="000000"/>
+                <w:sz w:val="20"/>
+                <w:szCs w:val="20"/>
+                <w:shd w:val="clear" w:color="auto" w:fill="FDFDFE"/>
+              </w:rPr>
+              <w:t>788.95</w:t>
             </w:r>
           </w:p>
         </w:tc>
@@ -6561,7 +7419,47 @@
                 <w:szCs w:val="20"/>
                 <w:shd w:val="clear" w:color="auto" w:fill="FDFDFE"/>
               </w:rPr>
-              <w:t>271318.50</w:t>
+              <w:t>2</w:t>
+            </w:r>
+            <w:r>
+              <w:rPr>
+                <w:rFonts w:ascii="Arial" w:hAnsi="Arial" w:cs="Arial"/>
+                <w:color w:val="000000"/>
+                <w:sz w:val="20"/>
+                <w:szCs w:val="20"/>
+                <w:shd w:val="clear" w:color="auto" w:fill="FDFDFE"/>
+              </w:rPr>
+              <w:t>,</w:t>
+            </w:r>
+            <w:r>
+              <w:rPr>
+                <w:rFonts w:ascii="Arial" w:hAnsi="Arial" w:cs="Arial"/>
+                <w:color w:val="000000"/>
+                <w:sz w:val="20"/>
+                <w:szCs w:val="20"/>
+                <w:shd w:val="clear" w:color="auto" w:fill="FDFDFE"/>
+              </w:rPr>
+              <w:t>71</w:t>
+            </w:r>
+            <w:r>
+              <w:rPr>
+                <w:rFonts w:ascii="Arial" w:hAnsi="Arial" w:cs="Arial"/>
+                <w:color w:val="000000"/>
+                <w:sz w:val="20"/>
+                <w:szCs w:val="20"/>
+                <w:shd w:val="clear" w:color="auto" w:fill="FDFDFE"/>
+              </w:rPr>
+              <w:t>,</w:t>
+            </w:r>
+            <w:r>
+              <w:rPr>
+                <w:rFonts w:ascii="Arial" w:hAnsi="Arial" w:cs="Arial"/>
+                <w:color w:val="000000"/>
+                <w:sz w:val="20"/>
+                <w:szCs w:val="20"/>
+                <w:shd w:val="clear" w:color="auto" w:fill="FDFDFE"/>
+              </w:rPr>
+              <w:t>318.50</w:t>
             </w:r>
           </w:p>
         </w:tc>
@@ -6640,7 +7538,27 @@
                 <w:szCs w:val="20"/>
                 <w:shd w:val="clear" w:color="auto" w:fill="FDFDFE"/>
               </w:rPr>
-              <w:t>62881.80</w:t>
+              <w:t>62</w:t>
+            </w:r>
+            <w:r>
+              <w:rPr>
+                <w:rFonts w:ascii="Arial" w:hAnsi="Arial" w:cs="Arial"/>
+                <w:color w:val="000000"/>
+                <w:sz w:val="20"/>
+                <w:szCs w:val="20"/>
+                <w:shd w:val="clear" w:color="auto" w:fill="FDFDFE"/>
+              </w:rPr>
+              <w:t>,</w:t>
+            </w:r>
+            <w:r>
+              <w:rPr>
+                <w:rFonts w:ascii="Arial" w:hAnsi="Arial" w:cs="Arial"/>
+                <w:color w:val="000000"/>
+                <w:sz w:val="20"/>
+                <w:szCs w:val="20"/>
+                <w:shd w:val="clear" w:color="auto" w:fill="FDFDFE"/>
+              </w:rPr>
+              <w:t>881.80</w:t>
             </w:r>
           </w:p>
         </w:tc>
@@ -6725,7 +7643,27 @@
                 <w:szCs w:val="20"/>
                 <w:shd w:val="clear" w:color="auto" w:fill="FDFDFE"/>
               </w:rPr>
-              <w:t>73655.20</w:t>
+              <w:t>73</w:t>
+            </w:r>
+            <w:r>
+              <w:rPr>
+                <w:rFonts w:ascii="Arial" w:hAnsi="Arial" w:cs="Arial"/>
+                <w:color w:val="000000"/>
+                <w:sz w:val="20"/>
+                <w:szCs w:val="20"/>
+                <w:shd w:val="clear" w:color="auto" w:fill="FDFDFE"/>
+              </w:rPr>
+              <w:t>,</w:t>
+            </w:r>
+            <w:r>
+              <w:rPr>
+                <w:rFonts w:ascii="Arial" w:hAnsi="Arial" w:cs="Arial"/>
+                <w:color w:val="000000"/>
+                <w:sz w:val="20"/>
+                <w:szCs w:val="20"/>
+                <w:shd w:val="clear" w:color="auto" w:fill="FDFDFE"/>
+              </w:rPr>
+              <w:t>655.20</w:t>
             </w:r>
           </w:p>
         </w:tc>
@@ -6810,7 +7748,27 @@
                 <w:szCs w:val="20"/>
                 <w:shd w:val="clear" w:color="auto" w:fill="FDFDFE"/>
               </w:rPr>
-              <w:t>79441.10</w:t>
+              <w:t>79</w:t>
+            </w:r>
+            <w:r>
+              <w:rPr>
+                <w:rFonts w:ascii="Arial" w:hAnsi="Arial" w:cs="Arial"/>
+                <w:color w:val="000000"/>
+                <w:sz w:val="20"/>
+                <w:szCs w:val="20"/>
+                <w:shd w:val="clear" w:color="auto" w:fill="FDFDFE"/>
+              </w:rPr>
+              <w:t>,</w:t>
+            </w:r>
+            <w:r>
+              <w:rPr>
+                <w:rFonts w:ascii="Arial" w:hAnsi="Arial" w:cs="Arial"/>
+                <w:color w:val="000000"/>
+                <w:sz w:val="20"/>
+                <w:szCs w:val="20"/>
+                <w:shd w:val="clear" w:color="auto" w:fill="FDFDFE"/>
+              </w:rPr>
+              <w:t>441.10</w:t>
             </w:r>
           </w:p>
         </w:tc>
@@ -6895,7 +7853,27 @@
                 <w:szCs w:val="20"/>
                 <w:shd w:val="clear" w:color="auto" w:fill="FDFDFE"/>
               </w:rPr>
-              <w:t>42888.05</w:t>
+              <w:t>42</w:t>
+            </w:r>
+            <w:r>
+              <w:rPr>
+                <w:rFonts w:ascii="Arial" w:hAnsi="Arial" w:cs="Arial"/>
+                <w:color w:val="000000"/>
+                <w:sz w:val="20"/>
+                <w:szCs w:val="20"/>
+                <w:shd w:val="clear" w:color="auto" w:fill="FDFDFE"/>
+              </w:rPr>
+              <w:t>,</w:t>
+            </w:r>
+            <w:r>
+              <w:rPr>
+                <w:rFonts w:ascii="Arial" w:hAnsi="Arial" w:cs="Arial"/>
+                <w:color w:val="000000"/>
+                <w:sz w:val="20"/>
+                <w:szCs w:val="20"/>
+                <w:shd w:val="clear" w:color="auto" w:fill="FDFDFE"/>
+              </w:rPr>
+              <w:t>888.05</w:t>
             </w:r>
           </w:p>
         </w:tc>
@@ -6980,7 +7958,27 @@
                 <w:szCs w:val="20"/>
                 <w:shd w:val="clear" w:color="auto" w:fill="FDFDFE"/>
               </w:rPr>
-              <w:t>30120.15</w:t>
+              <w:t>30</w:t>
+            </w:r>
+            <w:r>
+              <w:rPr>
+                <w:rFonts w:ascii="Arial" w:hAnsi="Arial" w:cs="Arial"/>
+                <w:color w:val="000000"/>
+                <w:sz w:val="20"/>
+                <w:szCs w:val="20"/>
+                <w:shd w:val="clear" w:color="auto" w:fill="FDFDFE"/>
+              </w:rPr>
+              <w:t>,</w:t>
+            </w:r>
+            <w:r>
+              <w:rPr>
+                <w:rFonts w:ascii="Arial" w:hAnsi="Arial" w:cs="Arial"/>
+                <w:color w:val="000000"/>
+                <w:sz w:val="20"/>
+                <w:szCs w:val="20"/>
+                <w:shd w:val="clear" w:color="auto" w:fill="FDFDFE"/>
+              </w:rPr>
+              <w:t>120.15</w:t>
             </w:r>
           </w:p>
         </w:tc>
@@ -7065,7 +8063,27 @@
                 <w:szCs w:val="20"/>
                 <w:shd w:val="clear" w:color="auto" w:fill="FDFDFE"/>
               </w:rPr>
-              <w:t>34827.25</w:t>
+              <w:t>34</w:t>
+            </w:r>
+            <w:r>
+              <w:rPr>
+                <w:rFonts w:ascii="Arial" w:hAnsi="Arial" w:cs="Arial"/>
+                <w:color w:val="000000"/>
+                <w:sz w:val="20"/>
+                <w:szCs w:val="20"/>
+                <w:shd w:val="clear" w:color="auto" w:fill="FDFDFE"/>
+              </w:rPr>
+              <w:t>,</w:t>
+            </w:r>
+            <w:r>
+              <w:rPr>
+                <w:rFonts w:ascii="Arial" w:hAnsi="Arial" w:cs="Arial"/>
+                <w:color w:val="000000"/>
+                <w:sz w:val="20"/>
+                <w:szCs w:val="20"/>
+                <w:shd w:val="clear" w:color="auto" w:fill="FDFDFE"/>
+              </w:rPr>
+              <w:t>827.25</w:t>
             </w:r>
           </w:p>
         </w:tc>
@@ -7150,7 +8168,27 @@
                 <w:szCs w:val="20"/>
                 <w:shd w:val="clear" w:color="auto" w:fill="FDFDFE"/>
               </w:rPr>
-              <w:t>17096.70</w:t>
+              <w:t>17</w:t>
+            </w:r>
+            <w:r>
+              <w:rPr>
+                <w:rFonts w:ascii="Arial" w:hAnsi="Arial" w:cs="Arial"/>
+                <w:color w:val="000000"/>
+                <w:sz w:val="20"/>
+                <w:szCs w:val="20"/>
+                <w:shd w:val="clear" w:color="auto" w:fill="FDFDFE"/>
+              </w:rPr>
+              <w:t>,</w:t>
+            </w:r>
+            <w:r>
+              <w:rPr>
+                <w:rFonts w:ascii="Arial" w:hAnsi="Arial" w:cs="Arial"/>
+                <w:color w:val="000000"/>
+                <w:sz w:val="20"/>
+                <w:szCs w:val="20"/>
+                <w:shd w:val="clear" w:color="auto" w:fill="FDFDFE"/>
+              </w:rPr>
+              <w:t>096.70</w:t>
             </w:r>
           </w:p>
         </w:tc>
@@ -7223,6 +8261,7 @@
                 <w:sz w:val="24"/>
                 <w:szCs w:val="24"/>
               </w:rPr>
+              <w:lastRenderedPageBreak/>
               <w:t xml:space="preserve">CAMPAIGN </w:t>
             </w:r>
             <w:r>
@@ -7469,7 +8508,47 @@
                 <w:szCs w:val="20"/>
                 <w:shd w:val="clear" w:color="auto" w:fill="FDFDFE"/>
               </w:rPr>
-              <w:t>457670.75</w:t>
+              <w:t>4</w:t>
+            </w:r>
+            <w:r>
+              <w:rPr>
+                <w:rFonts w:ascii="Arial" w:hAnsi="Arial" w:cs="Arial"/>
+                <w:color w:val="000000"/>
+                <w:sz w:val="20"/>
+                <w:szCs w:val="20"/>
+                <w:shd w:val="clear" w:color="auto" w:fill="FDFDFE"/>
+              </w:rPr>
+              <w:t>,</w:t>
+            </w:r>
+            <w:r>
+              <w:rPr>
+                <w:rFonts w:ascii="Arial" w:hAnsi="Arial" w:cs="Arial"/>
+                <w:color w:val="000000"/>
+                <w:sz w:val="20"/>
+                <w:szCs w:val="20"/>
+                <w:shd w:val="clear" w:color="auto" w:fill="FDFDFE"/>
+              </w:rPr>
+              <w:t>57</w:t>
+            </w:r>
+            <w:r>
+              <w:rPr>
+                <w:rFonts w:ascii="Arial" w:hAnsi="Arial" w:cs="Arial"/>
+                <w:color w:val="000000"/>
+                <w:sz w:val="20"/>
+                <w:szCs w:val="20"/>
+                <w:shd w:val="clear" w:color="auto" w:fill="FDFDFE"/>
+              </w:rPr>
+              <w:t>,</w:t>
+            </w:r>
+            <w:r>
+              <w:rPr>
+                <w:rFonts w:ascii="Arial" w:hAnsi="Arial" w:cs="Arial"/>
+                <w:color w:val="000000"/>
+                <w:sz w:val="20"/>
+                <w:szCs w:val="20"/>
+                <w:shd w:val="clear" w:color="auto" w:fill="FDFDFE"/>
+              </w:rPr>
+              <w:t>670.75</w:t>
             </w:r>
           </w:p>
         </w:tc>
@@ -7524,7 +8603,6 @@
                 <w:sz w:val="24"/>
                 <w:szCs w:val="24"/>
               </w:rPr>
-              <w:lastRenderedPageBreak/>
               <w:t xml:space="preserve">CAMPAIGN </w:t>
             </w:r>
             <w:r>
@@ -7771,7 +8849,47 @@
                 <w:szCs w:val="20"/>
                 <w:shd w:val="clear" w:color="auto" w:fill="FDFDFE"/>
               </w:rPr>
-              <w:t>380879.75</w:t>
+              <w:t>3</w:t>
+            </w:r>
+            <w:r>
+              <w:rPr>
+                <w:rFonts w:ascii="Arial" w:hAnsi="Arial" w:cs="Arial"/>
+                <w:color w:val="000000"/>
+                <w:sz w:val="20"/>
+                <w:szCs w:val="20"/>
+                <w:shd w:val="clear" w:color="auto" w:fill="FDFDFE"/>
+              </w:rPr>
+              <w:t>,</w:t>
+            </w:r>
+            <w:r>
+              <w:rPr>
+                <w:rFonts w:ascii="Arial" w:hAnsi="Arial" w:cs="Arial"/>
+                <w:color w:val="000000"/>
+                <w:sz w:val="20"/>
+                <w:szCs w:val="20"/>
+                <w:shd w:val="clear" w:color="auto" w:fill="FDFDFE"/>
+              </w:rPr>
+              <w:t>80</w:t>
+            </w:r>
+            <w:r>
+              <w:rPr>
+                <w:rFonts w:ascii="Arial" w:hAnsi="Arial" w:cs="Arial"/>
+                <w:color w:val="000000"/>
+                <w:sz w:val="20"/>
+                <w:szCs w:val="20"/>
+                <w:shd w:val="clear" w:color="auto" w:fill="FDFDFE"/>
+              </w:rPr>
+              <w:t>,</w:t>
+            </w:r>
+            <w:r>
+              <w:rPr>
+                <w:rFonts w:ascii="Arial" w:hAnsi="Arial" w:cs="Arial"/>
+                <w:color w:val="000000"/>
+                <w:sz w:val="20"/>
+                <w:szCs w:val="20"/>
+                <w:shd w:val="clear" w:color="auto" w:fill="FDFDFE"/>
+              </w:rPr>
+              <w:t>879.75</w:t>
             </w:r>
           </w:p>
         </w:tc>
@@ -7893,7 +9011,27 @@
                 <w:szCs w:val="20"/>
                 <w:shd w:val="clear" w:color="auto" w:fill="FDFDFE"/>
               </w:rPr>
-              <w:t>73655.20</w:t>
+              <w:t>73</w:t>
+            </w:r>
+            <w:r>
+              <w:rPr>
+                <w:rFonts w:ascii="Arial" w:hAnsi="Arial" w:cs="Arial"/>
+                <w:color w:val="000000"/>
+                <w:sz w:val="20"/>
+                <w:szCs w:val="20"/>
+                <w:shd w:val="clear" w:color="auto" w:fill="FDFDFE"/>
+              </w:rPr>
+              <w:t>,</w:t>
+            </w:r>
+            <w:r>
+              <w:rPr>
+                <w:rFonts w:ascii="Arial" w:hAnsi="Arial" w:cs="Arial"/>
+                <w:color w:val="000000"/>
+                <w:sz w:val="20"/>
+                <w:szCs w:val="20"/>
+                <w:shd w:val="clear" w:color="auto" w:fill="FDFDFE"/>
+              </w:rPr>
+              <w:t>655.20</w:t>
             </w:r>
           </w:p>
         </w:tc>
@@ -8018,7 +9156,27 @@
                 <w:szCs w:val="20"/>
                 <w:shd w:val="clear" w:color="auto" w:fill="FDFDFE"/>
               </w:rPr>
-              <w:t>42888.05</w:t>
+              <w:t>42</w:t>
+            </w:r>
+            <w:r>
+              <w:rPr>
+                <w:rFonts w:ascii="Arial" w:hAnsi="Arial" w:cs="Arial"/>
+                <w:color w:val="000000"/>
+                <w:sz w:val="20"/>
+                <w:szCs w:val="20"/>
+                <w:shd w:val="clear" w:color="auto" w:fill="FDFDFE"/>
+              </w:rPr>
+              <w:t>,</w:t>
+            </w:r>
+            <w:r>
+              <w:rPr>
+                <w:rFonts w:ascii="Arial" w:hAnsi="Arial" w:cs="Arial"/>
+                <w:color w:val="000000"/>
+                <w:sz w:val="20"/>
+                <w:szCs w:val="20"/>
+                <w:shd w:val="clear" w:color="auto" w:fill="FDFDFE"/>
+              </w:rPr>
+              <w:t>888.05</w:t>
             </w:r>
           </w:p>
         </w:tc>
@@ -8154,7 +9312,27 @@
                 <w:szCs w:val="20"/>
                 <w:shd w:val="clear" w:color="auto" w:fill="FDFDFE"/>
               </w:rPr>
-              <w:t>51923.95</w:t>
+              <w:t>51</w:t>
+            </w:r>
+            <w:r>
+              <w:rPr>
+                <w:rFonts w:ascii="Arial" w:hAnsi="Arial" w:cs="Arial"/>
+                <w:color w:val="000000"/>
+                <w:sz w:val="20"/>
+                <w:szCs w:val="20"/>
+                <w:shd w:val="clear" w:color="auto" w:fill="FDFDFE"/>
+              </w:rPr>
+              <w:t>,</w:t>
+            </w:r>
+            <w:r>
+              <w:rPr>
+                <w:rFonts w:ascii="Arial" w:hAnsi="Arial" w:cs="Arial"/>
+                <w:color w:val="000000"/>
+                <w:sz w:val="20"/>
+                <w:szCs w:val="20"/>
+                <w:shd w:val="clear" w:color="auto" w:fill="FDFDFE"/>
+              </w:rPr>
+              <w:t>923.95</w:t>
             </w:r>
           </w:p>
         </w:tc>
@@ -8357,7 +9535,27 @@
                 <w:szCs w:val="20"/>
                 <w:shd w:val="clear" w:color="auto" w:fill="FDFDFE"/>
               </w:rPr>
-              <w:t>36100.00</w:t>
+              <w:t>36</w:t>
+            </w:r>
+            <w:r>
+              <w:rPr>
+                <w:rFonts w:ascii="Arial" w:hAnsi="Arial" w:cs="Arial"/>
+                <w:color w:val="000000"/>
+                <w:sz w:val="20"/>
+                <w:szCs w:val="20"/>
+                <w:shd w:val="clear" w:color="auto" w:fill="FDFDFE"/>
+              </w:rPr>
+              <w:t>,</w:t>
+            </w:r>
+            <w:r>
+              <w:rPr>
+                <w:rFonts w:ascii="Arial" w:hAnsi="Arial" w:cs="Arial"/>
+                <w:color w:val="000000"/>
+                <w:sz w:val="20"/>
+                <w:szCs w:val="20"/>
+                <w:shd w:val="clear" w:color="auto" w:fill="FDFDFE"/>
+              </w:rPr>
+              <w:t>100.00</w:t>
             </w:r>
           </w:p>
         </w:tc>
@@ -8437,7 +9635,27 @@
                 <w:szCs w:val="20"/>
                 <w:shd w:val="clear" w:color="auto" w:fill="FDFDFE"/>
               </w:rPr>
-              <w:t>34843.18</w:t>
+              <w:t>34</w:t>
+            </w:r>
+            <w:r>
+              <w:rPr>
+                <w:rFonts w:ascii="Arial" w:hAnsi="Arial" w:cs="Arial"/>
+                <w:color w:val="000000"/>
+                <w:sz w:val="20"/>
+                <w:szCs w:val="20"/>
+                <w:shd w:val="clear" w:color="auto" w:fill="FDFDFE"/>
+              </w:rPr>
+              <w:t>,</w:t>
+            </w:r>
+            <w:r>
+              <w:rPr>
+                <w:rFonts w:ascii="Arial" w:hAnsi="Arial" w:cs="Arial"/>
+                <w:color w:val="000000"/>
+                <w:sz w:val="20"/>
+                <w:szCs w:val="20"/>
+                <w:shd w:val="clear" w:color="auto" w:fill="FDFDFE"/>
+              </w:rPr>
+              <w:t>843.18</w:t>
             </w:r>
           </w:p>
         </w:tc>
@@ -8514,7 +9732,27 @@
                 <w:szCs w:val="20"/>
                 <w:shd w:val="clear" w:color="auto" w:fill="FDFDFE"/>
               </w:rPr>
-              <w:t>15474.99</w:t>
+              <w:t>15</w:t>
+            </w:r>
+            <w:r>
+              <w:rPr>
+                <w:rFonts w:ascii="Arial" w:hAnsi="Arial" w:cs="Arial"/>
+                <w:color w:val="000000"/>
+                <w:sz w:val="20"/>
+                <w:szCs w:val="20"/>
+                <w:shd w:val="clear" w:color="auto" w:fill="FDFDFE"/>
+              </w:rPr>
+              <w:t>,</w:t>
+            </w:r>
+            <w:r>
+              <w:rPr>
+                <w:rFonts w:ascii="Arial" w:hAnsi="Arial" w:cs="Arial"/>
+                <w:color w:val="000000"/>
+                <w:sz w:val="20"/>
+                <w:szCs w:val="20"/>
+                <w:shd w:val="clear" w:color="auto" w:fill="FDFDFE"/>
+              </w:rPr>
+              <w:t>474.99</w:t>
             </w:r>
           </w:p>
         </w:tc>
@@ -8596,7 +9834,27 @@
                 <w:szCs w:val="20"/>
                 <w:shd w:val="clear" w:color="auto" w:fill="FDFDFE"/>
               </w:rPr>
-              <w:t>12576.36</w:t>
+              <w:t>12</w:t>
+            </w:r>
+            <w:r>
+              <w:rPr>
+                <w:rFonts w:ascii="Arial" w:hAnsi="Arial" w:cs="Arial"/>
+                <w:color w:val="000000"/>
+                <w:sz w:val="20"/>
+                <w:szCs w:val="20"/>
+                <w:shd w:val="clear" w:color="auto" w:fill="FDFDFE"/>
+              </w:rPr>
+              <w:t>,</w:t>
+            </w:r>
+            <w:r>
+              <w:rPr>
+                <w:rFonts w:ascii="Arial" w:hAnsi="Arial" w:cs="Arial"/>
+                <w:color w:val="000000"/>
+                <w:sz w:val="20"/>
+                <w:szCs w:val="20"/>
+                <w:shd w:val="clear" w:color="auto" w:fill="FDFDFE"/>
+              </w:rPr>
+              <w:t>576.36</w:t>
             </w:r>
           </w:p>
         </w:tc>
@@ -8681,7 +9939,27 @@
                 <w:szCs w:val="20"/>
                 <w:shd w:val="clear" w:color="auto" w:fill="FDFDFE"/>
               </w:rPr>
-              <w:t>7402.09</w:t>
+              <w:t>7</w:t>
+            </w:r>
+            <w:r>
+              <w:rPr>
+                <w:rFonts w:ascii="Arial" w:hAnsi="Arial" w:cs="Arial"/>
+                <w:color w:val="000000"/>
+                <w:sz w:val="20"/>
+                <w:szCs w:val="20"/>
+                <w:shd w:val="clear" w:color="auto" w:fill="FDFDFE"/>
+              </w:rPr>
+              <w:t>,</w:t>
+            </w:r>
+            <w:r>
+              <w:rPr>
+                <w:rFonts w:ascii="Arial" w:hAnsi="Arial" w:cs="Arial"/>
+                <w:color w:val="000000"/>
+                <w:sz w:val="20"/>
+                <w:szCs w:val="20"/>
+                <w:shd w:val="clear" w:color="auto" w:fill="FDFDFE"/>
+              </w:rPr>
+              <w:t>402.09</w:t>
             </w:r>
           </w:p>
         </w:tc>
@@ -8766,7 +10044,27 @@
                 <w:szCs w:val="20"/>
                 <w:shd w:val="clear" w:color="auto" w:fill="FDFDFE"/>
               </w:rPr>
-              <w:t>5660.53</w:t>
+              <w:t>5</w:t>
+            </w:r>
+            <w:r>
+              <w:rPr>
+                <w:rFonts w:ascii="Arial" w:hAnsi="Arial" w:cs="Arial"/>
+                <w:color w:val="000000"/>
+                <w:sz w:val="20"/>
+                <w:szCs w:val="20"/>
+                <w:shd w:val="clear" w:color="auto" w:fill="FDFDFE"/>
+              </w:rPr>
+              <w:t>,</w:t>
+            </w:r>
+            <w:r>
+              <w:rPr>
+                <w:rFonts w:ascii="Arial" w:hAnsi="Arial" w:cs="Arial"/>
+                <w:color w:val="000000"/>
+                <w:sz w:val="20"/>
+                <w:szCs w:val="20"/>
+                <w:shd w:val="clear" w:color="auto" w:fill="FDFDFE"/>
+              </w:rPr>
+              <w:t>660.53</w:t>
             </w:r>
           </w:p>
         </w:tc>
@@ -8851,7 +10149,27 @@
                 <w:szCs w:val="20"/>
                 <w:shd w:val="clear" w:color="auto" w:fill="FDFDFE"/>
               </w:rPr>
-              <w:t>3840.52</w:t>
+              <w:t>3</w:t>
+            </w:r>
+            <w:r>
+              <w:rPr>
+                <w:rFonts w:ascii="Arial" w:hAnsi="Arial" w:cs="Arial"/>
+                <w:color w:val="000000"/>
+                <w:sz w:val="20"/>
+                <w:szCs w:val="20"/>
+                <w:shd w:val="clear" w:color="auto" w:fill="FDFDFE"/>
+              </w:rPr>
+              <w:t>,</w:t>
+            </w:r>
+            <w:r>
+              <w:rPr>
+                <w:rFonts w:ascii="Arial" w:hAnsi="Arial" w:cs="Arial"/>
+                <w:color w:val="000000"/>
+                <w:sz w:val="20"/>
+                <w:szCs w:val="20"/>
+                <w:shd w:val="clear" w:color="auto" w:fill="FDFDFE"/>
+              </w:rPr>
+              <w:t>840.52</w:t>
             </w:r>
           </w:p>
         </w:tc>
@@ -8936,7 +10254,27 @@
                 <w:szCs w:val="20"/>
                 <w:shd w:val="clear" w:color="auto" w:fill="FDFDFE"/>
               </w:rPr>
-              <w:t>1500.00</w:t>
+              <w:t>1</w:t>
+            </w:r>
+            <w:r>
+              <w:rPr>
+                <w:rFonts w:ascii="Arial" w:hAnsi="Arial" w:cs="Arial"/>
+                <w:color w:val="000000"/>
+                <w:sz w:val="20"/>
+                <w:szCs w:val="20"/>
+                <w:shd w:val="clear" w:color="auto" w:fill="FDFDFE"/>
+              </w:rPr>
+              <w:t>,</w:t>
+            </w:r>
+            <w:r>
+              <w:rPr>
+                <w:rFonts w:ascii="Arial" w:hAnsi="Arial" w:cs="Arial"/>
+                <w:color w:val="000000"/>
+                <w:sz w:val="20"/>
+                <w:szCs w:val="20"/>
+                <w:shd w:val="clear" w:color="auto" w:fill="FDFDFE"/>
+              </w:rPr>
+              <w:t>500.00</w:t>
             </w:r>
           </w:p>
         </w:tc>
@@ -9021,7 +10359,27 @@
                 <w:szCs w:val="20"/>
                 <w:shd w:val="clear" w:color="auto" w:fill="FDFDFE"/>
               </w:rPr>
-              <w:t>1500.00</w:t>
+              <w:t>1</w:t>
+            </w:r>
+            <w:r>
+              <w:rPr>
+                <w:rFonts w:ascii="Arial" w:hAnsi="Arial" w:cs="Arial"/>
+                <w:color w:val="000000"/>
+                <w:sz w:val="20"/>
+                <w:szCs w:val="20"/>
+                <w:shd w:val="clear" w:color="auto" w:fill="FDFDFE"/>
+              </w:rPr>
+              <w:t>,</w:t>
+            </w:r>
+            <w:r>
+              <w:rPr>
+                <w:rFonts w:ascii="Arial" w:hAnsi="Arial" w:cs="Arial"/>
+                <w:color w:val="000000"/>
+                <w:sz w:val="20"/>
+                <w:szCs w:val="20"/>
+                <w:shd w:val="clear" w:color="auto" w:fill="FDFDFE"/>
+              </w:rPr>
+              <w:t>500.00</w:t>
             </w:r>
           </w:p>
         </w:tc>
@@ -9383,7 +10741,47 @@
                 <w:szCs w:val="20"/>
                 <w:shd w:val="clear" w:color="auto" w:fill="FDFDFE"/>
               </w:rPr>
-              <w:t>1007017.70</w:t>
+              <w:t>10</w:t>
+            </w:r>
+            <w:r>
+              <w:rPr>
+                <w:rFonts w:ascii="Arial" w:hAnsi="Arial" w:cs="Arial"/>
+                <w:color w:val="000000"/>
+                <w:sz w:val="20"/>
+                <w:szCs w:val="20"/>
+                <w:shd w:val="clear" w:color="auto" w:fill="FDFDFE"/>
+              </w:rPr>
+              <w:t>,</w:t>
+            </w:r>
+            <w:r>
+              <w:rPr>
+                <w:rFonts w:ascii="Arial" w:hAnsi="Arial" w:cs="Arial"/>
+                <w:color w:val="000000"/>
+                <w:sz w:val="20"/>
+                <w:szCs w:val="20"/>
+                <w:shd w:val="clear" w:color="auto" w:fill="FDFDFE"/>
+              </w:rPr>
+              <w:t>07</w:t>
+            </w:r>
+            <w:r>
+              <w:rPr>
+                <w:rFonts w:ascii="Arial" w:hAnsi="Arial" w:cs="Arial"/>
+                <w:color w:val="000000"/>
+                <w:sz w:val="20"/>
+                <w:szCs w:val="20"/>
+                <w:shd w:val="clear" w:color="auto" w:fill="FDFDFE"/>
+              </w:rPr>
+              <w:t>,</w:t>
+            </w:r>
+            <w:r>
+              <w:rPr>
+                <w:rFonts w:ascii="Arial" w:hAnsi="Arial" w:cs="Arial"/>
+                <w:color w:val="000000"/>
+                <w:sz w:val="20"/>
+                <w:szCs w:val="20"/>
+                <w:shd w:val="clear" w:color="auto" w:fill="FDFDFE"/>
+              </w:rPr>
+              <w:t>017.70</w:t>
             </w:r>
           </w:p>
         </w:tc>
@@ -9410,7 +10808,27 @@
                 <w:szCs w:val="20"/>
                 <w:shd w:val="clear" w:color="auto" w:fill="FDFDFE"/>
               </w:rPr>
-              <w:t>1101.66</w:t>
+              <w:t>1</w:t>
+            </w:r>
+            <w:r>
+              <w:rPr>
+                <w:rFonts w:ascii="Arial" w:hAnsi="Arial" w:cs="Arial"/>
+                <w:color w:val="000000"/>
+                <w:sz w:val="20"/>
+                <w:szCs w:val="20"/>
+                <w:shd w:val="clear" w:color="auto" w:fill="FDFDFE"/>
+              </w:rPr>
+              <w:t>,</w:t>
+            </w:r>
+            <w:r>
+              <w:rPr>
+                <w:rFonts w:ascii="Arial" w:hAnsi="Arial" w:cs="Arial"/>
+                <w:color w:val="000000"/>
+                <w:sz w:val="20"/>
+                <w:szCs w:val="20"/>
+                <w:shd w:val="clear" w:color="auto" w:fill="FDFDFE"/>
+              </w:rPr>
+              <w:t>101.66</w:t>
             </w:r>
           </w:p>
         </w:tc>
@@ -9511,7 +10929,47 @@
                 <w:szCs w:val="20"/>
                 <w:shd w:val="clear" w:color="auto" w:fill="FDFDFE"/>
               </w:rPr>
-              <w:t>2138944.10</w:t>
+              <w:t>21</w:t>
+            </w:r>
+            <w:r>
+              <w:rPr>
+                <w:rFonts w:ascii="Arial" w:hAnsi="Arial" w:cs="Arial"/>
+                <w:color w:val="000000"/>
+                <w:sz w:val="20"/>
+                <w:szCs w:val="20"/>
+                <w:shd w:val="clear" w:color="auto" w:fill="FDFDFE"/>
+              </w:rPr>
+              <w:t>,</w:t>
+            </w:r>
+            <w:r>
+              <w:rPr>
+                <w:rFonts w:ascii="Arial" w:hAnsi="Arial" w:cs="Arial"/>
+                <w:color w:val="000000"/>
+                <w:sz w:val="20"/>
+                <w:szCs w:val="20"/>
+                <w:shd w:val="clear" w:color="auto" w:fill="FDFDFE"/>
+              </w:rPr>
+              <w:t>38</w:t>
+            </w:r>
+            <w:r>
+              <w:rPr>
+                <w:rFonts w:ascii="Arial" w:hAnsi="Arial" w:cs="Arial"/>
+                <w:color w:val="000000"/>
+                <w:sz w:val="20"/>
+                <w:szCs w:val="20"/>
+                <w:shd w:val="clear" w:color="auto" w:fill="FDFDFE"/>
+              </w:rPr>
+              <w:t>,</w:t>
+            </w:r>
+            <w:r>
+              <w:rPr>
+                <w:rFonts w:ascii="Arial" w:hAnsi="Arial" w:cs="Arial"/>
+                <w:color w:val="000000"/>
+                <w:sz w:val="20"/>
+                <w:szCs w:val="20"/>
+                <w:shd w:val="clear" w:color="auto" w:fill="FDFDFE"/>
+              </w:rPr>
+              <w:t>944.10</w:t>
             </w:r>
           </w:p>
         </w:tc>
@@ -9869,7 +11327,27 @@
                 <w:szCs w:val="20"/>
                 <w:shd w:val="clear" w:color="auto" w:fill="FDFDFE"/>
               </w:rPr>
-              <w:t>7258.00</w:t>
+              <w:t>7</w:t>
+            </w:r>
+            <w:r>
+              <w:rPr>
+                <w:rFonts w:ascii="Arial" w:hAnsi="Arial" w:cs="Arial"/>
+                <w:color w:val="000000"/>
+                <w:sz w:val="20"/>
+                <w:szCs w:val="20"/>
+                <w:shd w:val="clear" w:color="auto" w:fill="FDFDFE"/>
+              </w:rPr>
+              <w:t>,</w:t>
+            </w:r>
+            <w:r>
+              <w:rPr>
+                <w:rFonts w:ascii="Arial" w:hAnsi="Arial" w:cs="Arial"/>
+                <w:color w:val="000000"/>
+                <w:sz w:val="20"/>
+                <w:szCs w:val="20"/>
+                <w:shd w:val="clear" w:color="auto" w:fill="FDFDFE"/>
+              </w:rPr>
+              <w:t>258.00</w:t>
             </w:r>
           </w:p>
         </w:tc>
@@ -9896,7 +11374,27 @@
                 <w:szCs w:val="20"/>
                 <w:shd w:val="clear" w:color="auto" w:fill="FDFDFE"/>
               </w:rPr>
-              <w:t>4744.65</w:t>
+              <w:t>4</w:t>
+            </w:r>
+            <w:r>
+              <w:rPr>
+                <w:rFonts w:ascii="Arial" w:hAnsi="Arial" w:cs="Arial"/>
+                <w:color w:val="000000"/>
+                <w:sz w:val="20"/>
+                <w:szCs w:val="20"/>
+                <w:shd w:val="clear" w:color="auto" w:fill="FDFDFE"/>
+              </w:rPr>
+              <w:t>,</w:t>
+            </w:r>
+            <w:r>
+              <w:rPr>
+                <w:rFonts w:ascii="Arial" w:hAnsi="Arial" w:cs="Arial"/>
+                <w:color w:val="000000"/>
+                <w:sz w:val="20"/>
+                <w:szCs w:val="20"/>
+                <w:shd w:val="clear" w:color="auto" w:fill="FDFDFE"/>
+              </w:rPr>
+              <w:t>744.65</w:t>
             </w:r>
           </w:p>
         </w:tc>
@@ -9923,7 +11421,27 @@
                 <w:szCs w:val="20"/>
                 <w:shd w:val="clear" w:color="auto" w:fill="FDFDFE"/>
               </w:rPr>
-              <w:t>2513.35</w:t>
+              <w:t>2</w:t>
+            </w:r>
+            <w:r>
+              <w:rPr>
+                <w:rFonts w:ascii="Arial" w:hAnsi="Arial" w:cs="Arial"/>
+                <w:color w:val="000000"/>
+                <w:sz w:val="20"/>
+                <w:szCs w:val="20"/>
+                <w:shd w:val="clear" w:color="auto" w:fill="FDFDFE"/>
+              </w:rPr>
+              <w:t>,</w:t>
+            </w:r>
+            <w:r>
+              <w:rPr>
+                <w:rFonts w:ascii="Arial" w:hAnsi="Arial" w:cs="Arial"/>
+                <w:color w:val="000000"/>
+                <w:sz w:val="20"/>
+                <w:szCs w:val="20"/>
+                <w:shd w:val="clear" w:color="auto" w:fill="FDFDFE"/>
+              </w:rPr>
+              <w:t>513.35</w:t>
             </w:r>
           </w:p>
         </w:tc>
@@ -9979,6 +11497,7 @@
                 <w:szCs w:val="20"/>
                 <w:shd w:val="clear" w:color="auto" w:fill="FDFDFE"/>
               </w:rPr>
+              <w:lastRenderedPageBreak/>
               <w:t>104308</w:t>
             </w:r>
           </w:p>
@@ -10062,7 +11581,27 @@
                 <w:szCs w:val="20"/>
                 <w:shd w:val="clear" w:color="auto" w:fill="FDFDFE"/>
               </w:rPr>
-              <w:t>5009.00</w:t>
+              <w:t>5</w:t>
+            </w:r>
+            <w:r>
+              <w:rPr>
+                <w:rFonts w:ascii="Arial" w:hAnsi="Arial" w:cs="Arial"/>
+                <w:color w:val="000000"/>
+                <w:sz w:val="20"/>
+                <w:szCs w:val="20"/>
+                <w:shd w:val="clear" w:color="auto" w:fill="FDFDFE"/>
+              </w:rPr>
+              <w:t>,</w:t>
+            </w:r>
+            <w:r>
+              <w:rPr>
+                <w:rFonts w:ascii="Arial" w:hAnsi="Arial" w:cs="Arial"/>
+                <w:color w:val="000000"/>
+                <w:sz w:val="20"/>
+                <w:szCs w:val="20"/>
+                <w:shd w:val="clear" w:color="auto" w:fill="FDFDFE"/>
+              </w:rPr>
+              <w:t>009.00</w:t>
             </w:r>
           </w:p>
         </w:tc>
@@ -10089,7 +11628,27 @@
                 <w:szCs w:val="20"/>
                 <w:shd w:val="clear" w:color="auto" w:fill="FDFDFE"/>
               </w:rPr>
-              <w:t>2824.30</w:t>
+              <w:t>2</w:t>
+            </w:r>
+            <w:r>
+              <w:rPr>
+                <w:rFonts w:ascii="Arial" w:hAnsi="Arial" w:cs="Arial"/>
+                <w:color w:val="000000"/>
+                <w:sz w:val="20"/>
+                <w:szCs w:val="20"/>
+                <w:shd w:val="clear" w:color="auto" w:fill="FDFDFE"/>
+              </w:rPr>
+              <w:t>,</w:t>
+            </w:r>
+            <w:r>
+              <w:rPr>
+                <w:rFonts w:ascii="Arial" w:hAnsi="Arial" w:cs="Arial"/>
+                <w:color w:val="000000"/>
+                <w:sz w:val="20"/>
+                <w:szCs w:val="20"/>
+                <w:shd w:val="clear" w:color="auto" w:fill="FDFDFE"/>
+              </w:rPr>
+              <w:t>824.30</w:t>
             </w:r>
           </w:p>
         </w:tc>
@@ -10116,7 +11675,27 @@
                 <w:szCs w:val="20"/>
                 <w:shd w:val="clear" w:color="auto" w:fill="FDFDFE"/>
               </w:rPr>
-              <w:t>2184.70</w:t>
+              <w:t>2</w:t>
+            </w:r>
+            <w:r>
+              <w:rPr>
+                <w:rFonts w:ascii="Arial" w:hAnsi="Arial" w:cs="Arial"/>
+                <w:color w:val="000000"/>
+                <w:sz w:val="20"/>
+                <w:szCs w:val="20"/>
+                <w:shd w:val="clear" w:color="auto" w:fill="FDFDFE"/>
+              </w:rPr>
+              <w:t>,</w:t>
+            </w:r>
+            <w:r>
+              <w:rPr>
+                <w:rFonts w:ascii="Arial" w:hAnsi="Arial" w:cs="Arial"/>
+                <w:color w:val="000000"/>
+                <w:sz w:val="20"/>
+                <w:szCs w:val="20"/>
+                <w:shd w:val="clear" w:color="auto" w:fill="FDFDFE"/>
+              </w:rPr>
+              <w:t>184.70</w:t>
             </w:r>
           </w:p>
         </w:tc>
@@ -10254,7 +11833,27 @@
                 <w:szCs w:val="20"/>
                 <w:shd w:val="clear" w:color="auto" w:fill="FDFDFE"/>
               </w:rPr>
-              <w:t>5399.00</w:t>
+              <w:t>5</w:t>
+            </w:r>
+            <w:r>
+              <w:rPr>
+                <w:rFonts w:ascii="Arial" w:hAnsi="Arial" w:cs="Arial"/>
+                <w:color w:val="000000"/>
+                <w:sz w:val="20"/>
+                <w:szCs w:val="20"/>
+                <w:shd w:val="clear" w:color="auto" w:fill="FDFDFE"/>
+              </w:rPr>
+              <w:t>,</w:t>
+            </w:r>
+            <w:r>
+              <w:rPr>
+                <w:rFonts w:ascii="Arial" w:hAnsi="Arial" w:cs="Arial"/>
+                <w:color w:val="000000"/>
+                <w:sz w:val="20"/>
+                <w:szCs w:val="20"/>
+                <w:shd w:val="clear" w:color="auto" w:fill="FDFDFE"/>
+              </w:rPr>
+              <w:t>399.00</w:t>
             </w:r>
           </w:p>
         </w:tc>
@@ -10281,7 +11880,27 @@
                 <w:szCs w:val="20"/>
                 <w:shd w:val="clear" w:color="auto" w:fill="FDFDFE"/>
               </w:rPr>
-              <w:t>3318.85</w:t>
+              <w:t>3</w:t>
+            </w:r>
+            <w:r>
+              <w:rPr>
+                <w:rFonts w:ascii="Arial" w:hAnsi="Arial" w:cs="Arial"/>
+                <w:color w:val="000000"/>
+                <w:sz w:val="20"/>
+                <w:szCs w:val="20"/>
+                <w:shd w:val="clear" w:color="auto" w:fill="FDFDFE"/>
+              </w:rPr>
+              <w:t>,</w:t>
+            </w:r>
+            <w:r>
+              <w:rPr>
+                <w:rFonts w:ascii="Arial" w:hAnsi="Arial" w:cs="Arial"/>
+                <w:color w:val="000000"/>
+                <w:sz w:val="20"/>
+                <w:szCs w:val="20"/>
+                <w:shd w:val="clear" w:color="auto" w:fill="FDFDFE"/>
+              </w:rPr>
+              <w:t>318.85</w:t>
             </w:r>
           </w:p>
         </w:tc>
@@ -10308,7 +11927,27 @@
                 <w:szCs w:val="20"/>
                 <w:shd w:val="clear" w:color="auto" w:fill="FDFDFE"/>
               </w:rPr>
-              <w:t>2080.15</w:t>
+              <w:t>2</w:t>
+            </w:r>
+            <w:r>
+              <w:rPr>
+                <w:rFonts w:ascii="Arial" w:hAnsi="Arial" w:cs="Arial"/>
+                <w:color w:val="000000"/>
+                <w:sz w:val="20"/>
+                <w:szCs w:val="20"/>
+                <w:shd w:val="clear" w:color="auto" w:fill="FDFDFE"/>
+              </w:rPr>
+              <w:t>,</w:t>
+            </w:r>
+            <w:r>
+              <w:rPr>
+                <w:rFonts w:ascii="Arial" w:hAnsi="Arial" w:cs="Arial"/>
+                <w:color w:val="000000"/>
+                <w:sz w:val="20"/>
+                <w:szCs w:val="20"/>
+                <w:shd w:val="clear" w:color="auto" w:fill="FDFDFE"/>
+              </w:rPr>
+              <w:t>080.15</w:t>
             </w:r>
           </w:p>
         </w:tc>
@@ -10363,7 +12002,6 @@
                 <w:sz w:val="24"/>
                 <w:szCs w:val="24"/>
               </w:rPr>
-              <w:lastRenderedPageBreak/>
               <w:t>ORDER ID</w:t>
             </w:r>
           </w:p>
@@ -10603,7 +12241,27 @@
                 <w:szCs w:val="20"/>
                 <w:shd w:val="clear" w:color="auto" w:fill="FDFDFE"/>
               </w:rPr>
-              <w:t>4070.00</w:t>
+              <w:t>4</w:t>
+            </w:r>
+            <w:r>
+              <w:rPr>
+                <w:rFonts w:ascii="Arial" w:hAnsi="Arial" w:cs="Arial"/>
+                <w:color w:val="000000"/>
+                <w:sz w:val="20"/>
+                <w:szCs w:val="20"/>
+                <w:shd w:val="clear" w:color="auto" w:fill="FDFDFE"/>
+              </w:rPr>
+              <w:t>,</w:t>
+            </w:r>
+            <w:r>
+              <w:rPr>
+                <w:rFonts w:ascii="Arial" w:hAnsi="Arial" w:cs="Arial"/>
+                <w:color w:val="000000"/>
+                <w:sz w:val="20"/>
+                <w:szCs w:val="20"/>
+                <w:shd w:val="clear" w:color="auto" w:fill="FDFDFE"/>
+              </w:rPr>
+              <w:t>070.00</w:t>
             </w:r>
           </w:p>
         </w:tc>
@@ -10627,7 +12285,27 @@
                 <w:szCs w:val="20"/>
                 <w:shd w:val="clear" w:color="auto" w:fill="FDFDFE"/>
               </w:rPr>
-              <w:t>2496.10</w:t>
+              <w:t>2</w:t>
+            </w:r>
+            <w:r>
+              <w:rPr>
+                <w:rFonts w:ascii="Arial" w:hAnsi="Arial" w:cs="Arial"/>
+                <w:color w:val="000000"/>
+                <w:sz w:val="20"/>
+                <w:szCs w:val="20"/>
+                <w:shd w:val="clear" w:color="auto" w:fill="FDFDFE"/>
+              </w:rPr>
+              <w:t>,</w:t>
+            </w:r>
+            <w:r>
+              <w:rPr>
+                <w:rFonts w:ascii="Arial" w:hAnsi="Arial" w:cs="Arial"/>
+                <w:color w:val="000000"/>
+                <w:sz w:val="20"/>
+                <w:szCs w:val="20"/>
+                <w:shd w:val="clear" w:color="auto" w:fill="FDFDFE"/>
+              </w:rPr>
+              <w:t>496.10</w:t>
             </w:r>
           </w:p>
         </w:tc>
@@ -10651,7 +12329,27 @@
                 <w:szCs w:val="20"/>
                 <w:shd w:val="clear" w:color="auto" w:fill="FDFDFE"/>
               </w:rPr>
-              <w:t>1573.90</w:t>
+              <w:t>1</w:t>
+            </w:r>
+            <w:r>
+              <w:rPr>
+                <w:rFonts w:ascii="Arial" w:hAnsi="Arial" w:cs="Arial"/>
+                <w:color w:val="000000"/>
+                <w:sz w:val="20"/>
+                <w:szCs w:val="20"/>
+                <w:shd w:val="clear" w:color="auto" w:fill="FDFDFE"/>
+              </w:rPr>
+              <w:t>,</w:t>
+            </w:r>
+            <w:r>
+              <w:rPr>
+                <w:rFonts w:ascii="Arial" w:hAnsi="Arial" w:cs="Arial"/>
+                <w:color w:val="000000"/>
+                <w:sz w:val="20"/>
+                <w:szCs w:val="20"/>
+                <w:shd w:val="clear" w:color="auto" w:fill="FDFDFE"/>
+              </w:rPr>
+              <w:t>573.90</w:t>
             </w:r>
           </w:p>
         </w:tc>
@@ -10776,7 +12474,27 @@
                 <w:szCs w:val="20"/>
                 <w:shd w:val="clear" w:color="auto" w:fill="FDFDFE"/>
               </w:rPr>
-              <w:t>3889.00</w:t>
+              <w:t>3</w:t>
+            </w:r>
+            <w:r>
+              <w:rPr>
+                <w:rFonts w:ascii="Arial" w:hAnsi="Arial" w:cs="Arial"/>
+                <w:color w:val="000000"/>
+                <w:sz w:val="20"/>
+                <w:szCs w:val="20"/>
+                <w:shd w:val="clear" w:color="auto" w:fill="FDFDFE"/>
+              </w:rPr>
+              <w:t>,</w:t>
+            </w:r>
+            <w:r>
+              <w:rPr>
+                <w:rFonts w:ascii="Arial" w:hAnsi="Arial" w:cs="Arial"/>
+                <w:color w:val="000000"/>
+                <w:sz w:val="20"/>
+                <w:szCs w:val="20"/>
+                <w:shd w:val="clear" w:color="auto" w:fill="FDFDFE"/>
+              </w:rPr>
+              <w:t>889.00</w:t>
             </w:r>
           </w:p>
         </w:tc>
@@ -10800,7 +12518,27 @@
                 <w:szCs w:val="20"/>
                 <w:shd w:val="clear" w:color="auto" w:fill="FDFDFE"/>
               </w:rPr>
-              <w:t>2321.25</w:t>
+              <w:t>2</w:t>
+            </w:r>
+            <w:r>
+              <w:rPr>
+                <w:rFonts w:ascii="Arial" w:hAnsi="Arial" w:cs="Arial"/>
+                <w:color w:val="000000"/>
+                <w:sz w:val="20"/>
+                <w:szCs w:val="20"/>
+                <w:shd w:val="clear" w:color="auto" w:fill="FDFDFE"/>
+              </w:rPr>
+              <w:t>,</w:t>
+            </w:r>
+            <w:r>
+              <w:rPr>
+                <w:rFonts w:ascii="Arial" w:hAnsi="Arial" w:cs="Arial"/>
+                <w:color w:val="000000"/>
+                <w:sz w:val="20"/>
+                <w:szCs w:val="20"/>
+                <w:shd w:val="clear" w:color="auto" w:fill="FDFDFE"/>
+              </w:rPr>
+              <w:t>321.25</w:t>
             </w:r>
           </w:p>
         </w:tc>
@@ -10824,7 +12562,27 @@
                 <w:szCs w:val="20"/>
                 <w:shd w:val="clear" w:color="auto" w:fill="FDFDFE"/>
               </w:rPr>
-              <w:t>1567.75</w:t>
+              <w:t>1</w:t>
+            </w:r>
+            <w:r>
+              <w:rPr>
+                <w:rFonts w:ascii="Arial" w:hAnsi="Arial" w:cs="Arial"/>
+                <w:color w:val="000000"/>
+                <w:sz w:val="20"/>
+                <w:szCs w:val="20"/>
+                <w:shd w:val="clear" w:color="auto" w:fill="FDFDFE"/>
+              </w:rPr>
+              <w:t>,</w:t>
+            </w:r>
+            <w:r>
+              <w:rPr>
+                <w:rFonts w:ascii="Arial" w:hAnsi="Arial" w:cs="Arial"/>
+                <w:color w:val="000000"/>
+                <w:sz w:val="20"/>
+                <w:szCs w:val="20"/>
+                <w:shd w:val="clear" w:color="auto" w:fill="FDFDFE"/>
+              </w:rPr>
+              <w:t>567.75</w:t>
             </w:r>
           </w:p>
         </w:tc>
@@ -10949,7 +12707,27 @@
                 <w:szCs w:val="20"/>
                 <w:shd w:val="clear" w:color="auto" w:fill="FDFDFE"/>
               </w:rPr>
-              <w:t>3406.00</w:t>
+              <w:t>3</w:t>
+            </w:r>
+            <w:r>
+              <w:rPr>
+                <w:rFonts w:ascii="Arial" w:hAnsi="Arial" w:cs="Arial"/>
+                <w:color w:val="000000"/>
+                <w:sz w:val="20"/>
+                <w:szCs w:val="20"/>
+                <w:shd w:val="clear" w:color="auto" w:fill="FDFDFE"/>
+              </w:rPr>
+              <w:t>,</w:t>
+            </w:r>
+            <w:r>
+              <w:rPr>
+                <w:rFonts w:ascii="Arial" w:hAnsi="Arial" w:cs="Arial"/>
+                <w:color w:val="000000"/>
+                <w:sz w:val="20"/>
+                <w:szCs w:val="20"/>
+                <w:shd w:val="clear" w:color="auto" w:fill="FDFDFE"/>
+              </w:rPr>
+              <w:t>406.00</w:t>
             </w:r>
           </w:p>
         </w:tc>
@@ -10973,7 +12751,27 @@
                 <w:szCs w:val="20"/>
                 <w:shd w:val="clear" w:color="auto" w:fill="FDFDFE"/>
               </w:rPr>
-              <w:t>1871.70</w:t>
+              <w:t>1</w:t>
+            </w:r>
+            <w:r>
+              <w:rPr>
+                <w:rFonts w:ascii="Arial" w:hAnsi="Arial" w:cs="Arial"/>
+                <w:color w:val="000000"/>
+                <w:sz w:val="20"/>
+                <w:szCs w:val="20"/>
+                <w:shd w:val="clear" w:color="auto" w:fill="FDFDFE"/>
+              </w:rPr>
+              <w:t>,</w:t>
+            </w:r>
+            <w:r>
+              <w:rPr>
+                <w:rFonts w:ascii="Arial" w:hAnsi="Arial" w:cs="Arial"/>
+                <w:color w:val="000000"/>
+                <w:sz w:val="20"/>
+                <w:szCs w:val="20"/>
+                <w:shd w:val="clear" w:color="auto" w:fill="FDFDFE"/>
+              </w:rPr>
+              <w:t>871.70</w:t>
             </w:r>
           </w:p>
         </w:tc>
@@ -10997,7 +12795,27 @@
                 <w:szCs w:val="20"/>
                 <w:shd w:val="clear" w:color="auto" w:fill="FDFDFE"/>
               </w:rPr>
-              <w:t>1534.30</w:t>
+              <w:t>1</w:t>
+            </w:r>
+            <w:r>
+              <w:rPr>
+                <w:rFonts w:ascii="Arial" w:hAnsi="Arial" w:cs="Arial"/>
+                <w:color w:val="000000"/>
+                <w:sz w:val="20"/>
+                <w:szCs w:val="20"/>
+                <w:shd w:val="clear" w:color="auto" w:fill="FDFDFE"/>
+              </w:rPr>
+              <w:t>,</w:t>
+            </w:r>
+            <w:r>
+              <w:rPr>
+                <w:rFonts w:ascii="Arial" w:hAnsi="Arial" w:cs="Arial"/>
+                <w:color w:val="000000"/>
+                <w:sz w:val="20"/>
+                <w:szCs w:val="20"/>
+                <w:shd w:val="clear" w:color="auto" w:fill="FDFDFE"/>
+              </w:rPr>
+              <w:t>534.30</w:t>
             </w:r>
           </w:p>
         </w:tc>
@@ -11122,7 +12940,27 @@
                 <w:szCs w:val="20"/>
                 <w:shd w:val="clear" w:color="auto" w:fill="FDFDFE"/>
               </w:rPr>
-              <w:t>3590.00</w:t>
+              <w:t>3</w:t>
+            </w:r>
+            <w:r>
+              <w:rPr>
+                <w:rFonts w:ascii="Arial" w:hAnsi="Arial" w:cs="Arial"/>
+                <w:color w:val="000000"/>
+                <w:sz w:val="20"/>
+                <w:szCs w:val="20"/>
+                <w:shd w:val="clear" w:color="auto" w:fill="FDFDFE"/>
+              </w:rPr>
+              <w:t>,</w:t>
+            </w:r>
+            <w:r>
+              <w:rPr>
+                <w:rFonts w:ascii="Arial" w:hAnsi="Arial" w:cs="Arial"/>
+                <w:color w:val="000000"/>
+                <w:sz w:val="20"/>
+                <w:szCs w:val="20"/>
+                <w:shd w:val="clear" w:color="auto" w:fill="FDFDFE"/>
+              </w:rPr>
+              <w:t>590.00</w:t>
             </w:r>
           </w:p>
         </w:tc>
@@ -11146,7 +12984,27 @@
                 <w:szCs w:val="20"/>
                 <w:shd w:val="clear" w:color="auto" w:fill="FDFDFE"/>
               </w:rPr>
-              <w:t>2099.50</w:t>
+              <w:t>2</w:t>
+            </w:r>
+            <w:r>
+              <w:rPr>
+                <w:rFonts w:ascii="Arial" w:hAnsi="Arial" w:cs="Arial"/>
+                <w:color w:val="000000"/>
+                <w:sz w:val="20"/>
+                <w:szCs w:val="20"/>
+                <w:shd w:val="clear" w:color="auto" w:fill="FDFDFE"/>
+              </w:rPr>
+              <w:t>,</w:t>
+            </w:r>
+            <w:r>
+              <w:rPr>
+                <w:rFonts w:ascii="Arial" w:hAnsi="Arial" w:cs="Arial"/>
+                <w:color w:val="000000"/>
+                <w:sz w:val="20"/>
+                <w:szCs w:val="20"/>
+                <w:shd w:val="clear" w:color="auto" w:fill="FDFDFE"/>
+              </w:rPr>
+              <w:t>099.50</w:t>
             </w:r>
           </w:p>
         </w:tc>
@@ -11170,7 +13028,27 @@
                 <w:szCs w:val="20"/>
                 <w:shd w:val="clear" w:color="auto" w:fill="FDFDFE"/>
               </w:rPr>
-              <w:t>1490.50</w:t>
+              <w:t>1</w:t>
+            </w:r>
+            <w:r>
+              <w:rPr>
+                <w:rFonts w:ascii="Arial" w:hAnsi="Arial" w:cs="Arial"/>
+                <w:color w:val="000000"/>
+                <w:sz w:val="20"/>
+                <w:szCs w:val="20"/>
+                <w:shd w:val="clear" w:color="auto" w:fill="FDFDFE"/>
+              </w:rPr>
+              <w:t>,</w:t>
+            </w:r>
+            <w:r>
+              <w:rPr>
+                <w:rFonts w:ascii="Arial" w:hAnsi="Arial" w:cs="Arial"/>
+                <w:color w:val="000000"/>
+                <w:sz w:val="20"/>
+                <w:szCs w:val="20"/>
+                <w:shd w:val="clear" w:color="auto" w:fill="FDFDFE"/>
+              </w:rPr>
+              <w:t>490.50</w:t>
             </w:r>
           </w:p>
         </w:tc>
@@ -11295,7 +13173,27 @@
                 <w:szCs w:val="20"/>
                 <w:shd w:val="clear" w:color="auto" w:fill="FDFDFE"/>
               </w:rPr>
-              <w:t>2510.00</w:t>
+              <w:t>2</w:t>
+            </w:r>
+            <w:r>
+              <w:rPr>
+                <w:rFonts w:ascii="Arial" w:hAnsi="Arial" w:cs="Arial"/>
+                <w:color w:val="000000"/>
+                <w:sz w:val="20"/>
+                <w:szCs w:val="20"/>
+                <w:shd w:val="clear" w:color="auto" w:fill="FDFDFE"/>
+              </w:rPr>
+              <w:t>,</w:t>
+            </w:r>
+            <w:r>
+              <w:rPr>
+                <w:rFonts w:ascii="Arial" w:hAnsi="Arial" w:cs="Arial"/>
+                <w:color w:val="000000"/>
+                <w:sz w:val="20"/>
+                <w:szCs w:val="20"/>
+                <w:shd w:val="clear" w:color="auto" w:fill="FDFDFE"/>
+              </w:rPr>
+              <w:t>510.00</w:t>
             </w:r>
           </w:p>
         </w:tc>
@@ -11319,7 +13217,27 @@
                 <w:szCs w:val="20"/>
                 <w:shd w:val="clear" w:color="auto" w:fill="FDFDFE"/>
               </w:rPr>
-              <w:t>1028.00</w:t>
+              <w:t>1</w:t>
+            </w:r>
+            <w:r>
+              <w:rPr>
+                <w:rFonts w:ascii="Arial" w:hAnsi="Arial" w:cs="Arial"/>
+                <w:color w:val="000000"/>
+                <w:sz w:val="20"/>
+                <w:szCs w:val="20"/>
+                <w:shd w:val="clear" w:color="auto" w:fill="FDFDFE"/>
+              </w:rPr>
+              <w:t>,</w:t>
+            </w:r>
+            <w:r>
+              <w:rPr>
+                <w:rFonts w:ascii="Arial" w:hAnsi="Arial" w:cs="Arial"/>
+                <w:color w:val="000000"/>
+                <w:sz w:val="20"/>
+                <w:szCs w:val="20"/>
+                <w:shd w:val="clear" w:color="auto" w:fill="FDFDFE"/>
+              </w:rPr>
+              <w:t>028.00</w:t>
             </w:r>
           </w:p>
         </w:tc>
@@ -11343,7 +13261,27 @@
                 <w:szCs w:val="20"/>
                 <w:shd w:val="clear" w:color="auto" w:fill="FDFDFE"/>
               </w:rPr>
-              <w:t>1482.00</w:t>
+              <w:t>1</w:t>
+            </w:r>
+            <w:r>
+              <w:rPr>
+                <w:rFonts w:ascii="Arial" w:hAnsi="Arial" w:cs="Arial"/>
+                <w:color w:val="000000"/>
+                <w:sz w:val="20"/>
+                <w:szCs w:val="20"/>
+                <w:shd w:val="clear" w:color="auto" w:fill="FDFDFE"/>
+              </w:rPr>
+              <w:t>,</w:t>
+            </w:r>
+            <w:r>
+              <w:rPr>
+                <w:rFonts w:ascii="Arial" w:hAnsi="Arial" w:cs="Arial"/>
+                <w:color w:val="000000"/>
+                <w:sz w:val="20"/>
+                <w:szCs w:val="20"/>
+                <w:shd w:val="clear" w:color="auto" w:fill="FDFDFE"/>
+              </w:rPr>
+              <w:t>482.00</w:t>
             </w:r>
           </w:p>
         </w:tc>
@@ -11480,7 +13418,27 @@
                 <w:szCs w:val="20"/>
                 <w:shd w:val="clear" w:color="auto" w:fill="FDFDFE"/>
               </w:rPr>
-              <w:t>3320.00</w:t>
+              <w:t>3</w:t>
+            </w:r>
+            <w:r>
+              <w:rPr>
+                <w:rFonts w:ascii="Arial" w:hAnsi="Arial" w:cs="Arial"/>
+                <w:color w:val="000000"/>
+                <w:sz w:val="20"/>
+                <w:szCs w:val="20"/>
+                <w:shd w:val="clear" w:color="auto" w:fill="FDFDFE"/>
+              </w:rPr>
+              <w:t>,</w:t>
+            </w:r>
+            <w:r>
+              <w:rPr>
+                <w:rFonts w:ascii="Arial" w:hAnsi="Arial" w:cs="Arial"/>
+                <w:color w:val="000000"/>
+                <w:sz w:val="20"/>
+                <w:szCs w:val="20"/>
+                <w:shd w:val="clear" w:color="auto" w:fill="FDFDFE"/>
+              </w:rPr>
+              <w:t>320.00</w:t>
             </w:r>
           </w:p>
         </w:tc>
@@ -11504,7 +13462,27 @@
                 <w:szCs w:val="20"/>
                 <w:shd w:val="clear" w:color="auto" w:fill="FDFDFE"/>
               </w:rPr>
-              <w:t>1839.00</w:t>
+              <w:t>1</w:t>
+            </w:r>
+            <w:r>
+              <w:rPr>
+                <w:rFonts w:ascii="Arial" w:hAnsi="Arial" w:cs="Arial"/>
+                <w:color w:val="000000"/>
+                <w:sz w:val="20"/>
+                <w:szCs w:val="20"/>
+                <w:shd w:val="clear" w:color="auto" w:fill="FDFDFE"/>
+              </w:rPr>
+              <w:t>,</w:t>
+            </w:r>
+            <w:r>
+              <w:rPr>
+                <w:rFonts w:ascii="Arial" w:hAnsi="Arial" w:cs="Arial"/>
+                <w:color w:val="000000"/>
+                <w:sz w:val="20"/>
+                <w:szCs w:val="20"/>
+                <w:shd w:val="clear" w:color="auto" w:fill="FDFDFE"/>
+              </w:rPr>
+              <w:t>839.00</w:t>
             </w:r>
           </w:p>
         </w:tc>
@@ -11528,7 +13506,27 @@
                 <w:szCs w:val="20"/>
                 <w:shd w:val="clear" w:color="auto" w:fill="FDFDFE"/>
               </w:rPr>
-              <w:t>1481.00</w:t>
+              <w:t>1</w:t>
+            </w:r>
+            <w:r>
+              <w:rPr>
+                <w:rFonts w:ascii="Arial" w:hAnsi="Arial" w:cs="Arial"/>
+                <w:color w:val="000000"/>
+                <w:sz w:val="20"/>
+                <w:szCs w:val="20"/>
+                <w:shd w:val="clear" w:color="auto" w:fill="FDFDFE"/>
+              </w:rPr>
+              <w:t>,</w:t>
+            </w:r>
+            <w:r>
+              <w:rPr>
+                <w:rFonts w:ascii="Arial" w:hAnsi="Arial" w:cs="Arial"/>
+                <w:color w:val="000000"/>
+                <w:sz w:val="20"/>
+                <w:szCs w:val="20"/>
+                <w:shd w:val="clear" w:color="auto" w:fill="FDFDFE"/>
+              </w:rPr>
+              <w:t>481.00</w:t>
             </w:r>
           </w:p>
         </w:tc>
@@ -11673,7 +13671,27 @@
                 <w:szCs w:val="20"/>
                 <w:shd w:val="clear" w:color="auto" w:fill="FDFDFE"/>
               </w:rPr>
-              <w:t>3790.00</w:t>
+              <w:t>3</w:t>
+            </w:r>
+            <w:r>
+              <w:rPr>
+                <w:rFonts w:ascii="Arial" w:hAnsi="Arial" w:cs="Arial"/>
+                <w:color w:val="000000"/>
+                <w:sz w:val="20"/>
+                <w:szCs w:val="20"/>
+                <w:shd w:val="clear" w:color="auto" w:fill="FDFDFE"/>
+              </w:rPr>
+              <w:t>,</w:t>
+            </w:r>
+            <w:r>
+              <w:rPr>
+                <w:rFonts w:ascii="Arial" w:hAnsi="Arial" w:cs="Arial"/>
+                <w:color w:val="000000"/>
+                <w:sz w:val="20"/>
+                <w:szCs w:val="20"/>
+                <w:shd w:val="clear" w:color="auto" w:fill="FDFDFE"/>
+              </w:rPr>
+              <w:t>790.00</w:t>
             </w:r>
           </w:p>
         </w:tc>
@@ -11699,7 +13717,27 @@
                 <w:szCs w:val="20"/>
                 <w:shd w:val="clear" w:color="auto" w:fill="FDFDFE"/>
               </w:rPr>
-              <w:t>2310.10</w:t>
+              <w:t>2</w:t>
+            </w:r>
+            <w:r>
+              <w:rPr>
+                <w:rFonts w:ascii="Arial" w:hAnsi="Arial" w:cs="Arial"/>
+                <w:color w:val="000000"/>
+                <w:sz w:val="20"/>
+                <w:szCs w:val="20"/>
+                <w:shd w:val="clear" w:color="auto" w:fill="FDFDFE"/>
+              </w:rPr>
+              <w:t>,</w:t>
+            </w:r>
+            <w:r>
+              <w:rPr>
+                <w:rFonts w:ascii="Arial" w:hAnsi="Arial" w:cs="Arial"/>
+                <w:color w:val="000000"/>
+                <w:sz w:val="20"/>
+                <w:szCs w:val="20"/>
+                <w:shd w:val="clear" w:color="auto" w:fill="FDFDFE"/>
+              </w:rPr>
+              <w:t>310.10</w:t>
             </w:r>
           </w:p>
         </w:tc>
@@ -11725,7 +13763,27 @@
                 <w:szCs w:val="20"/>
                 <w:shd w:val="clear" w:color="auto" w:fill="FDFDFE"/>
               </w:rPr>
-              <w:t>1479.90</w:t>
+              <w:t>1</w:t>
+            </w:r>
+            <w:r>
+              <w:rPr>
+                <w:rFonts w:ascii="Arial" w:hAnsi="Arial" w:cs="Arial"/>
+                <w:color w:val="000000"/>
+                <w:sz w:val="20"/>
+                <w:szCs w:val="20"/>
+                <w:shd w:val="clear" w:color="auto" w:fill="FDFDFE"/>
+              </w:rPr>
+              <w:t>,</w:t>
+            </w:r>
+            <w:r>
+              <w:rPr>
+                <w:rFonts w:ascii="Arial" w:hAnsi="Arial" w:cs="Arial"/>
+                <w:color w:val="000000"/>
+                <w:sz w:val="20"/>
+                <w:szCs w:val="20"/>
+                <w:shd w:val="clear" w:color="auto" w:fill="FDFDFE"/>
+              </w:rPr>
+              <w:t>479.90</w:t>
             </w:r>
           </w:p>
         </w:tc>
@@ -13607,6 +15665,7 @@
                 <w:szCs w:val="20"/>
                 <w:shd w:val="clear" w:color="auto" w:fill="FDFDFE"/>
               </w:rPr>
+              <w:lastRenderedPageBreak/>
               <w:t>100003</w:t>
             </w:r>
           </w:p>
@@ -13931,7 +15990,6 @@
           <w:sz w:val="24"/>
           <w:szCs w:val="24"/>
         </w:rPr>
-        <w:lastRenderedPageBreak/>
         <w:t>Compare the item-level total with the order subtotal for each order</w:t>
       </w:r>
     </w:p>
@@ -14419,7 +16477,27 @@
                 <w:szCs w:val="20"/>
                 <w:shd w:val="clear" w:color="auto" w:fill="FDFDFE"/>
               </w:rPr>
-              <w:t>1298.00</w:t>
+              <w:t>1</w:t>
+            </w:r>
+            <w:r>
+              <w:rPr>
+                <w:rFonts w:ascii="Arial" w:hAnsi="Arial" w:cs="Arial"/>
+                <w:color w:val="000000"/>
+                <w:sz w:val="20"/>
+                <w:szCs w:val="20"/>
+                <w:shd w:val="clear" w:color="auto" w:fill="FDFDFE"/>
+              </w:rPr>
+              <w:t>,</w:t>
+            </w:r>
+            <w:r>
+              <w:rPr>
+                <w:rFonts w:ascii="Arial" w:hAnsi="Arial" w:cs="Arial"/>
+                <w:color w:val="000000"/>
+                <w:sz w:val="20"/>
+                <w:szCs w:val="20"/>
+                <w:shd w:val="clear" w:color="auto" w:fill="FDFDFE"/>
+              </w:rPr>
+              <w:t>298.00</w:t>
             </w:r>
           </w:p>
         </w:tc>
@@ -14448,7 +16526,27 @@
                 <w:szCs w:val="20"/>
                 <w:shd w:val="clear" w:color="auto" w:fill="FDFDFE"/>
               </w:rPr>
-              <w:t>1203.50</w:t>
+              <w:t>1</w:t>
+            </w:r>
+            <w:r>
+              <w:rPr>
+                <w:rFonts w:ascii="Arial" w:hAnsi="Arial" w:cs="Arial"/>
+                <w:color w:val="000000"/>
+                <w:sz w:val="20"/>
+                <w:szCs w:val="20"/>
+                <w:shd w:val="clear" w:color="auto" w:fill="FDFDFE"/>
+              </w:rPr>
+              <w:t>,</w:t>
+            </w:r>
+            <w:r>
+              <w:rPr>
+                <w:rFonts w:ascii="Arial" w:hAnsi="Arial" w:cs="Arial"/>
+                <w:color w:val="000000"/>
+                <w:sz w:val="20"/>
+                <w:szCs w:val="20"/>
+                <w:shd w:val="clear" w:color="auto" w:fill="FDFDFE"/>
+              </w:rPr>
+              <w:t>203.50</w:t>
             </w:r>
           </w:p>
         </w:tc>
@@ -14992,7 +17090,27 @@
                 <w:szCs w:val="20"/>
                 <w:shd w:val="clear" w:color="auto" w:fill="FDFDFE"/>
               </w:rPr>
-              <w:t>1298.00</w:t>
+              <w:t>1</w:t>
+            </w:r>
+            <w:r>
+              <w:rPr>
+                <w:rFonts w:ascii="Arial" w:hAnsi="Arial" w:cs="Arial"/>
+                <w:color w:val="000000"/>
+                <w:sz w:val="20"/>
+                <w:szCs w:val="20"/>
+                <w:shd w:val="clear" w:color="auto" w:fill="FDFDFE"/>
+              </w:rPr>
+              <w:t>,</w:t>
+            </w:r>
+            <w:r>
+              <w:rPr>
+                <w:rFonts w:ascii="Arial" w:hAnsi="Arial" w:cs="Arial"/>
+                <w:color w:val="000000"/>
+                <w:sz w:val="20"/>
+                <w:szCs w:val="20"/>
+                <w:shd w:val="clear" w:color="auto" w:fill="FDFDFE"/>
+              </w:rPr>
+              <w:t>298.00</w:t>
             </w:r>
           </w:p>
         </w:tc>
@@ -15021,7 +17139,27 @@
                 <w:szCs w:val="20"/>
                 <w:shd w:val="clear" w:color="auto" w:fill="FDFDFE"/>
               </w:rPr>
-              <w:t>1203.50</w:t>
+              <w:t>1</w:t>
+            </w:r>
+            <w:r>
+              <w:rPr>
+                <w:rFonts w:ascii="Arial" w:hAnsi="Arial" w:cs="Arial"/>
+                <w:color w:val="000000"/>
+                <w:sz w:val="20"/>
+                <w:szCs w:val="20"/>
+                <w:shd w:val="clear" w:color="auto" w:fill="FDFDFE"/>
+              </w:rPr>
+              <w:t>,</w:t>
+            </w:r>
+            <w:r>
+              <w:rPr>
+                <w:rFonts w:ascii="Arial" w:hAnsi="Arial" w:cs="Arial"/>
+                <w:color w:val="000000"/>
+                <w:sz w:val="20"/>
+                <w:szCs w:val="20"/>
+                <w:shd w:val="clear" w:color="auto" w:fill="FDFDFE"/>
+              </w:rPr>
+              <w:t>203.50</w:t>
             </w:r>
           </w:p>
         </w:tc>
@@ -15104,11 +17242,11 @@
         <w:tblLook w:val="04A0" w:firstRow="1" w:lastRow="0" w:firstColumn="1" w:lastColumn="0" w:noHBand="0" w:noVBand="1"/>
       </w:tblPr>
       <w:tblGrid>
-        <w:gridCol w:w="1089"/>
-        <w:gridCol w:w="1498"/>
-        <w:gridCol w:w="1436"/>
-        <w:gridCol w:w="1116"/>
-        <w:gridCol w:w="1476"/>
+        <w:gridCol w:w="1081"/>
+        <w:gridCol w:w="1492"/>
+        <w:gridCol w:w="1429"/>
+        <w:gridCol w:w="1139"/>
+        <w:gridCol w:w="1474"/>
         <w:gridCol w:w="988"/>
         <w:gridCol w:w="1093"/>
         <w:gridCol w:w="1040"/>
@@ -15794,7 +17932,27 @@
                 <w:szCs w:val="20"/>
                 <w:shd w:val="clear" w:color="auto" w:fill="FDFDFE"/>
               </w:rPr>
-              <w:t>1298.00</w:t>
+              <w:t>1</w:t>
+            </w:r>
+            <w:r>
+              <w:rPr>
+                <w:rFonts w:ascii="Arial" w:hAnsi="Arial" w:cs="Arial"/>
+                <w:color w:val="000000"/>
+                <w:sz w:val="20"/>
+                <w:szCs w:val="20"/>
+                <w:shd w:val="clear" w:color="auto" w:fill="FDFDFE"/>
+              </w:rPr>
+              <w:t>,</w:t>
+            </w:r>
+            <w:r>
+              <w:rPr>
+                <w:rFonts w:ascii="Arial" w:hAnsi="Arial" w:cs="Arial"/>
+                <w:color w:val="000000"/>
+                <w:sz w:val="20"/>
+                <w:szCs w:val="20"/>
+                <w:shd w:val="clear" w:color="auto" w:fill="FDFDFE"/>
+              </w:rPr>
+              <w:t>298.00</w:t>
             </w:r>
           </w:p>
         </w:tc>
@@ -15823,7 +17981,27 @@
                 <w:szCs w:val="20"/>
                 <w:shd w:val="clear" w:color="auto" w:fill="FDFDFE"/>
               </w:rPr>
-              <w:t>1203.50</w:t>
+              <w:t>1</w:t>
+            </w:r>
+            <w:r>
+              <w:rPr>
+                <w:rFonts w:ascii="Arial" w:hAnsi="Arial" w:cs="Arial"/>
+                <w:color w:val="000000"/>
+                <w:sz w:val="20"/>
+                <w:szCs w:val="20"/>
+                <w:shd w:val="clear" w:color="auto" w:fill="FDFDFE"/>
+              </w:rPr>
+              <w:t>,</w:t>
+            </w:r>
+            <w:r>
+              <w:rPr>
+                <w:rFonts w:ascii="Arial" w:hAnsi="Arial" w:cs="Arial"/>
+                <w:color w:val="000000"/>
+                <w:sz w:val="20"/>
+                <w:szCs w:val="20"/>
+                <w:shd w:val="clear" w:color="auto" w:fill="FDFDFE"/>
+              </w:rPr>
+              <w:t>203.50</w:t>
             </w:r>
           </w:p>
         </w:tc>
@@ -16466,6 +18644,7 @@
                 <w:szCs w:val="20"/>
                 <w:shd w:val="clear" w:color="auto" w:fill="FDFDFE"/>
               </w:rPr>
+              <w:lastRenderedPageBreak/>
               <w:t>104757</w:t>
             </w:r>
           </w:p>
@@ -16543,7 +18722,27 @@
                 <w:szCs w:val="20"/>
                 <w:shd w:val="clear" w:color="auto" w:fill="FDFDFE"/>
               </w:rPr>
-              <w:t>1298.00</w:t>
+              <w:t>1</w:t>
+            </w:r>
+            <w:r>
+              <w:rPr>
+                <w:rFonts w:ascii="Arial" w:hAnsi="Arial" w:cs="Arial"/>
+                <w:color w:val="000000"/>
+                <w:sz w:val="20"/>
+                <w:szCs w:val="20"/>
+                <w:shd w:val="clear" w:color="auto" w:fill="FDFDFE"/>
+              </w:rPr>
+              <w:t>,</w:t>
+            </w:r>
+            <w:r>
+              <w:rPr>
+                <w:rFonts w:ascii="Arial" w:hAnsi="Arial" w:cs="Arial"/>
+                <w:color w:val="000000"/>
+                <w:sz w:val="20"/>
+                <w:szCs w:val="20"/>
+                <w:shd w:val="clear" w:color="auto" w:fill="FDFDFE"/>
+              </w:rPr>
+              <w:t>298.00</w:t>
             </w:r>
           </w:p>
         </w:tc>
@@ -16572,7 +18771,27 @@
                 <w:szCs w:val="20"/>
                 <w:shd w:val="clear" w:color="auto" w:fill="FDFDFE"/>
               </w:rPr>
-              <w:t>1203.50</w:t>
+              <w:t>1</w:t>
+            </w:r>
+            <w:r>
+              <w:rPr>
+                <w:rFonts w:ascii="Arial" w:hAnsi="Arial" w:cs="Arial"/>
+                <w:color w:val="000000"/>
+                <w:sz w:val="20"/>
+                <w:szCs w:val="20"/>
+                <w:shd w:val="clear" w:color="auto" w:fill="FDFDFE"/>
+              </w:rPr>
+              <w:t>,</w:t>
+            </w:r>
+            <w:r>
+              <w:rPr>
+                <w:rFonts w:ascii="Arial" w:hAnsi="Arial" w:cs="Arial"/>
+                <w:color w:val="000000"/>
+                <w:sz w:val="20"/>
+                <w:szCs w:val="20"/>
+                <w:shd w:val="clear" w:color="auto" w:fill="FDFDFE"/>
+              </w:rPr>
+              <w:t>203.50</w:t>
             </w:r>
           </w:p>
         </w:tc>
@@ -16637,7 +18856,6 @@
           <w:sz w:val="32"/>
           <w:szCs w:val="32"/>
         </w:rPr>
-        <w:lastRenderedPageBreak/>
         <w:t>Part 5 — Delivery check</w:t>
       </w:r>
     </w:p>
@@ -17048,17 +19266,7 @@
                 <w:szCs w:val="20"/>
                 <w:shd w:val="clear" w:color="auto" w:fill="FDFDFE"/>
               </w:rPr>
-              <w:t>10000</w:t>
-            </w:r>
-            <w:r>
-              <w:rPr>
-                <w:rFonts w:ascii="Arial" w:hAnsi="Arial" w:cs="Arial"/>
-                <w:color w:val="000000"/>
-                <w:sz w:val="20"/>
-                <w:szCs w:val="20"/>
-                <w:shd w:val="clear" w:color="auto" w:fill="FDFDFE"/>
-              </w:rPr>
-              <w:t>2</w:t>
+              <w:t>100002</w:t>
             </w:r>
           </w:p>
         </w:tc>
@@ -17221,17 +19429,7 @@
                 <w:szCs w:val="20"/>
                 <w:shd w:val="clear" w:color="auto" w:fill="FDFDFE"/>
               </w:rPr>
-              <w:t>10000</w:t>
-            </w:r>
-            <w:r>
-              <w:rPr>
-                <w:rFonts w:ascii="Arial" w:hAnsi="Arial" w:cs="Arial"/>
-                <w:color w:val="000000"/>
-                <w:sz w:val="20"/>
-                <w:szCs w:val="20"/>
-                <w:shd w:val="clear" w:color="auto" w:fill="FDFDFE"/>
-              </w:rPr>
-              <w:t>3</w:t>
+              <w:t>100003</w:t>
             </w:r>
           </w:p>
         </w:tc>
@@ -17394,17 +19592,7 @@
                 <w:szCs w:val="20"/>
                 <w:shd w:val="clear" w:color="auto" w:fill="FDFDFE"/>
               </w:rPr>
-              <w:t>10000</w:t>
-            </w:r>
-            <w:r>
-              <w:rPr>
-                <w:rFonts w:ascii="Arial" w:hAnsi="Arial" w:cs="Arial"/>
-                <w:color w:val="000000"/>
-                <w:sz w:val="20"/>
-                <w:szCs w:val="20"/>
-                <w:shd w:val="clear" w:color="auto" w:fill="FDFDFE"/>
-              </w:rPr>
-              <w:t>4</w:t>
+              <w:t>100004</w:t>
             </w:r>
           </w:p>
         </w:tc>
@@ -17567,17 +19755,7 @@
                 <w:szCs w:val="20"/>
                 <w:shd w:val="clear" w:color="auto" w:fill="FDFDFE"/>
               </w:rPr>
-              <w:t>10000</w:t>
-            </w:r>
-            <w:r>
-              <w:rPr>
-                <w:rFonts w:ascii="Arial" w:hAnsi="Arial" w:cs="Arial"/>
-                <w:color w:val="000000"/>
-                <w:sz w:val="20"/>
-                <w:szCs w:val="20"/>
-                <w:shd w:val="clear" w:color="auto" w:fill="FDFDFE"/>
-              </w:rPr>
-              <w:t>5</w:t>
+              <w:t>100005</w:t>
             </w:r>
           </w:p>
         </w:tc>
@@ -17740,17 +19918,7 @@
                 <w:szCs w:val="20"/>
                 <w:shd w:val="clear" w:color="auto" w:fill="FDFDFE"/>
               </w:rPr>
-              <w:t>10000</w:t>
-            </w:r>
-            <w:r>
-              <w:rPr>
-                <w:rFonts w:ascii="Arial" w:hAnsi="Arial" w:cs="Arial"/>
-                <w:color w:val="000000"/>
-                <w:sz w:val="20"/>
-                <w:szCs w:val="20"/>
-                <w:shd w:val="clear" w:color="auto" w:fill="FDFDFE"/>
-              </w:rPr>
-              <w:t>6</w:t>
+              <w:t>100006</w:t>
             </w:r>
           </w:p>
         </w:tc>
@@ -17913,17 +20081,7 @@
                 <w:szCs w:val="20"/>
                 <w:shd w:val="clear" w:color="auto" w:fill="FDFDFE"/>
               </w:rPr>
-              <w:t>10000</w:t>
-            </w:r>
-            <w:r>
-              <w:rPr>
-                <w:rFonts w:ascii="Arial" w:hAnsi="Arial" w:cs="Arial"/>
-                <w:color w:val="000000"/>
-                <w:sz w:val="20"/>
-                <w:szCs w:val="20"/>
-                <w:shd w:val="clear" w:color="auto" w:fill="FDFDFE"/>
-              </w:rPr>
-              <w:t>7</w:t>
+              <w:t>100007</w:t>
             </w:r>
           </w:p>
         </w:tc>
@@ -18086,17 +20244,7 @@
                 <w:szCs w:val="20"/>
                 <w:shd w:val="clear" w:color="auto" w:fill="FDFDFE"/>
               </w:rPr>
-              <w:t>10000</w:t>
-            </w:r>
-            <w:r>
-              <w:rPr>
-                <w:rFonts w:ascii="Arial" w:hAnsi="Arial" w:cs="Arial"/>
-                <w:color w:val="000000"/>
-                <w:sz w:val="20"/>
-                <w:szCs w:val="20"/>
-                <w:shd w:val="clear" w:color="auto" w:fill="FDFDFE"/>
-              </w:rPr>
-              <w:t>8</w:t>
+              <w:t>100008</w:t>
             </w:r>
           </w:p>
         </w:tc>
@@ -18259,17 +20407,7 @@
                 <w:szCs w:val="20"/>
                 <w:shd w:val="clear" w:color="auto" w:fill="FDFDFE"/>
               </w:rPr>
-              <w:t>10000</w:t>
-            </w:r>
-            <w:r>
-              <w:rPr>
-                <w:rFonts w:ascii="Arial" w:hAnsi="Arial" w:cs="Arial"/>
-                <w:color w:val="000000"/>
-                <w:sz w:val="20"/>
-                <w:szCs w:val="20"/>
-                <w:shd w:val="clear" w:color="auto" w:fill="FDFDFE"/>
-              </w:rPr>
-              <w:t>9</w:t>
+              <w:t>100009</w:t>
             </w:r>
           </w:p>
         </w:tc>
@@ -19414,17 +21552,7 @@
                 <w:szCs w:val="20"/>
                 <w:shd w:val="clear" w:color="auto" w:fill="FDFDFE"/>
               </w:rPr>
-              <w:t>B</w:t>
-            </w:r>
-            <w:r>
-              <w:rPr>
-                <w:rFonts w:ascii="Arial" w:hAnsi="Arial" w:cs="Arial"/>
-                <w:color w:val="000000"/>
-                <w:sz w:val="20"/>
-                <w:szCs w:val="20"/>
-                <w:shd w:val="clear" w:color="auto" w:fill="FDFDFE"/>
-              </w:rPr>
-              <w:t>angalore</w:t>
+              <w:t>Bangalore</w:t>
             </w:r>
           </w:p>
         </w:tc>
@@ -20743,7 +22871,6 @@
           <w:sz w:val="32"/>
           <w:szCs w:val="32"/>
         </w:rPr>
-        <w:lastRenderedPageBreak/>
         <w:t>Part 6 — Build one customer report</w:t>
       </w:r>
     </w:p>
@@ -20770,8 +22897,10 @@
         <w:rPr>
           <w:rFonts w:ascii="Arial" w:hAnsi="Arial" w:cs="Arial"/>
           <w:bCs/>
+          <w:noProof/>
           <w:sz w:val="24"/>
           <w:szCs w:val="24"/>
+          <w:lang w:eastAsia="en-IN"/>
         </w:rPr>
         <w:drawing>
           <wp:inline distT="0" distB="0" distL="0" distR="0" wp14:anchorId="1B874FD6" wp14:editId="044E57F1">
@@ -20833,8 +22962,10 @@
         <w:rPr>
           <w:rFonts w:ascii="Arial" w:hAnsi="Arial" w:cs="Arial"/>
           <w:bCs/>
+          <w:noProof/>
           <w:sz w:val="24"/>
           <w:szCs w:val="24"/>
+          <w:lang w:eastAsia="en-IN"/>
         </w:rPr>
         <w:drawing>
           <wp:inline distT="0" distB="0" distL="0" distR="0" wp14:anchorId="1C3420C6" wp14:editId="76C3F085">
@@ -21117,6 +23248,7 @@
           <w:szCs w:val="20"/>
           <w:lang w:eastAsia="en-IN"/>
         </w:rPr>
+        <w:lastRenderedPageBreak/>
         <w:t>total_orders</w:t>
       </w:r>
       <w:proofErr w:type="spellEnd"/>
@@ -21318,7 +23450,6 @@
           <w:szCs w:val="20"/>
           <w:lang w:eastAsia="en-IN"/>
         </w:rPr>
-        <w:lastRenderedPageBreak/>
         <w:t>last_order_date</w:t>
       </w:r>
       <w:proofErr w:type="spellEnd"/>
@@ -21701,8 +23832,6 @@
       <w:r>
         <w:t xml:space="preserve"> of the report.</w:t>
       </w:r>
-      <w:bookmarkStart w:id="0" w:name="_GoBack"/>
-      <w:bookmarkEnd w:id="0"/>
     </w:p>
     <w:sectPr>
       <w:pgSz w:w="11906" w:h="16838"/>
@@ -24180,7 +26309,7 @@
 </file>
 
 <file path=customXml/itemProps1.xml><?xml version="1.0" encoding="utf-8"?>
-<ds:datastoreItem xmlns:ds="http://schemas.openxmlformats.org/officeDocument/2006/customXml" ds:itemID="{5B13B14E-3DF9-479C-9987-A40A39DBE570}">
+<ds:datastoreItem xmlns:ds="http://schemas.openxmlformats.org/officeDocument/2006/customXml" ds:itemID="{EB9CA738-81DF-4BCA-A41B-ADFE2B508CB0}">
   <ds:schemaRefs>
     <ds:schemaRef ds:uri="http://schemas.openxmlformats.org/officeDocument/2006/bibliography"/>
   </ds:schemaRefs>

</xml_diff>

<commit_message>
updated for changes in doc work update
</commit_message>
<xml_diff>
--- a/customers_data_analysis.docx
+++ b/customers_data_analysis.docx
@@ -57,8 +57,6 @@
         </w:rPr>
         <w:t>----------------------------------------------------------------------------------------------------------</w:t>
       </w:r>
-      <w:bookmarkStart w:id="0" w:name="_GoBack"/>
-      <w:bookmarkEnd w:id="0"/>
     </w:p>
     <w:p>
       <w:pPr>
@@ -417,6 +415,7 @@
           </w:tcPr>
           <w:p>
             <w:pPr>
+              <w:jc w:val="center"/>
               <w:rPr>
                 <w:sz w:val="24"/>
                 <w:szCs w:val="24"/>
@@ -465,6 +464,7 @@
           </w:tcPr>
           <w:p>
             <w:pPr>
+              <w:jc w:val="center"/>
               <w:rPr>
                 <w:sz w:val="24"/>
                 <w:szCs w:val="24"/>
@@ -513,6 +513,7 @@
           </w:tcPr>
           <w:p>
             <w:pPr>
+              <w:jc w:val="center"/>
               <w:rPr>
                 <w:sz w:val="24"/>
                 <w:szCs w:val="24"/>
@@ -564,6 +565,7 @@
           </w:tcPr>
           <w:p>
             <w:pPr>
+              <w:jc w:val="center"/>
               <w:rPr>
                 <w:sz w:val="24"/>
                 <w:szCs w:val="24"/>
@@ -612,6 +614,7 @@
           </w:tcPr>
           <w:p>
             <w:pPr>
+              <w:jc w:val="center"/>
               <w:rPr>
                 <w:sz w:val="24"/>
                 <w:szCs w:val="24"/>
@@ -663,6 +666,7 @@
           </w:tcPr>
           <w:p>
             <w:pPr>
+              <w:jc w:val="center"/>
               <w:rPr>
                 <w:sz w:val="24"/>
                 <w:szCs w:val="24"/>
@@ -837,6 +841,7 @@
           </w:tcPr>
           <w:p>
             <w:pPr>
+              <w:jc w:val="center"/>
               <w:rPr>
                 <w:sz w:val="24"/>
                 <w:szCs w:val="24"/>
@@ -888,6 +893,7 @@
           </w:tcPr>
           <w:p>
             <w:pPr>
+              <w:jc w:val="center"/>
               <w:rPr>
                 <w:sz w:val="24"/>
                 <w:szCs w:val="24"/>
@@ -939,6 +945,7 @@
           </w:tcPr>
           <w:p>
             <w:pPr>
+              <w:jc w:val="center"/>
               <w:rPr>
                 <w:sz w:val="24"/>
                 <w:szCs w:val="24"/>
@@ -990,6 +997,7 @@
           </w:tcPr>
           <w:p>
             <w:pPr>
+              <w:jc w:val="center"/>
               <w:rPr>
                 <w:sz w:val="24"/>
                 <w:szCs w:val="24"/>
@@ -1041,6 +1049,7 @@
           </w:tcPr>
           <w:p>
             <w:pPr>
+              <w:jc w:val="center"/>
               <w:rPr>
                 <w:sz w:val="24"/>
                 <w:szCs w:val="24"/>
@@ -1092,6 +1101,7 @@
           </w:tcPr>
           <w:p>
             <w:pPr>
+              <w:jc w:val="center"/>
               <w:rPr>
                 <w:sz w:val="24"/>
                 <w:szCs w:val="24"/>
@@ -1192,16 +1202,17 @@
         <w:tblLook w:val="04A0" w:firstRow="1" w:lastRow="0" w:firstColumn="1" w:lastColumn="0" w:noHBand="0" w:noVBand="1"/>
       </w:tblPr>
       <w:tblGrid>
-        <w:gridCol w:w="4275"/>
-        <w:gridCol w:w="4275"/>
+        <w:gridCol w:w="2946"/>
+        <w:gridCol w:w="2671"/>
+        <w:gridCol w:w="2963"/>
       </w:tblGrid>
       <w:tr>
         <w:trPr>
-          <w:trHeight w:val="287"/>
+          <w:trHeight w:val="284"/>
         </w:trPr>
         <w:tc>
           <w:tcPr>
-            <w:tcW w:w="4275" w:type="dxa"/>
+            <w:tcW w:w="2946" w:type="dxa"/>
           </w:tcPr>
           <w:p>
             <w:pPr>
@@ -1224,7 +1235,30 @@
         </w:tc>
         <w:tc>
           <w:tcPr>
-            <w:tcW w:w="4275" w:type="dxa"/>
+            <w:tcW w:w="2671" w:type="dxa"/>
+          </w:tcPr>
+          <w:p>
+            <w:pPr>
+              <w:jc w:val="center"/>
+              <w:rPr>
+                <w:b/>
+                <w:sz w:val="32"/>
+                <w:szCs w:val="32"/>
+              </w:rPr>
+            </w:pPr>
+            <w:r>
+              <w:rPr>
+                <w:b/>
+                <w:sz w:val="32"/>
+                <w:szCs w:val="32"/>
+              </w:rPr>
+              <w:t>ORDER PERCENTAGE</w:t>
+            </w:r>
+          </w:p>
+        </w:tc>
+        <w:tc>
+          <w:tcPr>
+            <w:tcW w:w="2963" w:type="dxa"/>
           </w:tcPr>
           <w:p>
             <w:pPr>
@@ -1248,11 +1282,11 @@
       </w:tr>
       <w:tr>
         <w:trPr>
-          <w:trHeight w:val="268"/>
+          <w:trHeight w:val="265"/>
         </w:trPr>
         <w:tc>
           <w:tcPr>
-            <w:tcW w:w="4275" w:type="dxa"/>
+            <w:tcW w:w="2946" w:type="dxa"/>
           </w:tcPr>
           <w:p>
             <w:pPr>
@@ -1275,10 +1309,38 @@
         </w:tc>
         <w:tc>
           <w:tcPr>
-            <w:tcW w:w="4275" w:type="dxa"/>
-          </w:tcPr>
-          <w:p>
-            <w:pPr>
+            <w:tcW w:w="2671" w:type="dxa"/>
+          </w:tcPr>
+          <w:p>
+            <w:pPr>
+              <w:jc w:val="center"/>
+              <w:rPr>
+                <w:rFonts w:ascii="Arial" w:hAnsi="Arial" w:cs="Arial"/>
+                <w:color w:val="000000"/>
+                <w:sz w:val="20"/>
+                <w:szCs w:val="20"/>
+                <w:shd w:val="clear" w:color="auto" w:fill="FDFDFE"/>
+              </w:rPr>
+            </w:pPr>
+            <w:r>
+              <w:rPr>
+                <w:rFonts w:ascii="Arial" w:hAnsi="Arial" w:cs="Arial"/>
+                <w:color w:val="000000"/>
+                <w:sz w:val="20"/>
+                <w:szCs w:val="20"/>
+                <w:shd w:val="clear" w:color="auto" w:fill="FDFDFE"/>
+              </w:rPr>
+              <w:t>87.97</w:t>
+            </w:r>
+          </w:p>
+        </w:tc>
+        <w:tc>
+          <w:tcPr>
+            <w:tcW w:w="2963" w:type="dxa"/>
+          </w:tcPr>
+          <w:p>
+            <w:pPr>
+              <w:jc w:val="center"/>
               <w:rPr>
                 <w:sz w:val="24"/>
                 <w:szCs w:val="24"/>
@@ -1299,11 +1361,11 @@
       </w:tr>
       <w:tr>
         <w:trPr>
-          <w:trHeight w:val="287"/>
+          <w:trHeight w:val="284"/>
         </w:trPr>
         <w:tc>
           <w:tcPr>
-            <w:tcW w:w="4275" w:type="dxa"/>
+            <w:tcW w:w="2946" w:type="dxa"/>
           </w:tcPr>
           <w:p>
             <w:pPr>
@@ -1326,10 +1388,38 @@
         </w:tc>
         <w:tc>
           <w:tcPr>
-            <w:tcW w:w="4275" w:type="dxa"/>
-          </w:tcPr>
-          <w:p>
-            <w:pPr>
+            <w:tcW w:w="2671" w:type="dxa"/>
+          </w:tcPr>
+          <w:p>
+            <w:pPr>
+              <w:jc w:val="center"/>
+              <w:rPr>
+                <w:rFonts w:ascii="Arial" w:hAnsi="Arial" w:cs="Arial"/>
+                <w:color w:val="000000"/>
+                <w:sz w:val="20"/>
+                <w:szCs w:val="20"/>
+                <w:shd w:val="clear" w:color="auto" w:fill="FDFDFE"/>
+              </w:rPr>
+            </w:pPr>
+            <w:r>
+              <w:rPr>
+                <w:rFonts w:ascii="Arial" w:hAnsi="Arial" w:cs="Arial"/>
+                <w:color w:val="000000"/>
+                <w:sz w:val="20"/>
+                <w:szCs w:val="20"/>
+                <w:shd w:val="clear" w:color="auto" w:fill="FDFDFE"/>
+              </w:rPr>
+              <w:t>8.61</w:t>
+            </w:r>
+          </w:p>
+        </w:tc>
+        <w:tc>
+          <w:tcPr>
+            <w:tcW w:w="2963" w:type="dxa"/>
+          </w:tcPr>
+          <w:p>
+            <w:pPr>
+              <w:jc w:val="center"/>
               <w:rPr>
                 <w:sz w:val="24"/>
                 <w:szCs w:val="24"/>
@@ -1350,11 +1440,11 @@
       </w:tr>
       <w:tr>
         <w:trPr>
-          <w:trHeight w:val="268"/>
+          <w:trHeight w:val="265"/>
         </w:trPr>
         <w:tc>
           <w:tcPr>
-            <w:tcW w:w="4275" w:type="dxa"/>
+            <w:tcW w:w="2946" w:type="dxa"/>
           </w:tcPr>
           <w:p>
             <w:pPr>
@@ -1377,10 +1467,38 @@
         </w:tc>
         <w:tc>
           <w:tcPr>
-            <w:tcW w:w="4275" w:type="dxa"/>
-          </w:tcPr>
-          <w:p>
-            <w:pPr>
+            <w:tcW w:w="2671" w:type="dxa"/>
+          </w:tcPr>
+          <w:p>
+            <w:pPr>
+              <w:jc w:val="center"/>
+              <w:rPr>
+                <w:rFonts w:ascii="Arial" w:hAnsi="Arial" w:cs="Arial"/>
+                <w:color w:val="000000"/>
+                <w:sz w:val="20"/>
+                <w:szCs w:val="20"/>
+                <w:shd w:val="clear" w:color="auto" w:fill="FDFDFE"/>
+              </w:rPr>
+            </w:pPr>
+            <w:r>
+              <w:rPr>
+                <w:rFonts w:ascii="Arial" w:hAnsi="Arial" w:cs="Arial"/>
+                <w:color w:val="000000"/>
+                <w:sz w:val="20"/>
+                <w:szCs w:val="20"/>
+                <w:shd w:val="clear" w:color="auto" w:fill="FDFDFE"/>
+              </w:rPr>
+              <w:t>2.89</w:t>
+            </w:r>
+          </w:p>
+        </w:tc>
+        <w:tc>
+          <w:tcPr>
+            <w:tcW w:w="2963" w:type="dxa"/>
+          </w:tcPr>
+          <w:p>
+            <w:pPr>
+              <w:jc w:val="center"/>
               <w:rPr>
                 <w:sz w:val="24"/>
                 <w:szCs w:val="24"/>
@@ -1401,11 +1519,11 @@
       </w:tr>
       <w:tr>
         <w:trPr>
-          <w:trHeight w:val="287"/>
+          <w:trHeight w:val="284"/>
         </w:trPr>
         <w:tc>
           <w:tcPr>
-            <w:tcW w:w="4275" w:type="dxa"/>
+            <w:tcW w:w="2946" w:type="dxa"/>
           </w:tcPr>
           <w:p>
             <w:pPr>
@@ -1428,10 +1546,32 @@
         </w:tc>
         <w:tc>
           <w:tcPr>
-            <w:tcW w:w="4275" w:type="dxa"/>
-          </w:tcPr>
-          <w:p>
-            <w:pPr>
+            <w:tcW w:w="2671" w:type="dxa"/>
+          </w:tcPr>
+          <w:p>
+            <w:pPr>
+              <w:jc w:val="center"/>
+              <w:rPr>
+                <w:sz w:val="24"/>
+                <w:szCs w:val="24"/>
+              </w:rPr>
+            </w:pPr>
+            <w:r>
+              <w:rPr>
+                <w:sz w:val="24"/>
+                <w:szCs w:val="24"/>
+              </w:rPr>
+              <w:t>0.52</w:t>
+            </w:r>
+          </w:p>
+        </w:tc>
+        <w:tc>
+          <w:tcPr>
+            <w:tcW w:w="2963" w:type="dxa"/>
+          </w:tcPr>
+          <w:p>
+            <w:pPr>
+              <w:jc w:val="center"/>
               <w:rPr>
                 <w:sz w:val="24"/>
                 <w:szCs w:val="24"/>
@@ -1612,6 +1752,22 @@
         </w:tc>
       </w:tr>
     </w:tbl>
+    <w:p>
+      <w:pPr>
+        <w:rPr>
+          <w:sz w:val="24"/>
+          <w:szCs w:val="24"/>
+        </w:rPr>
+      </w:pPr>
+    </w:p>
+    <w:p>
+      <w:pPr>
+        <w:rPr>
+          <w:sz w:val="24"/>
+          <w:szCs w:val="24"/>
+        </w:rPr>
+      </w:pPr>
+    </w:p>
     <w:p>
       <w:pPr>
         <w:rPr>
@@ -1697,7 +1853,15 @@
                 <w:sz w:val="32"/>
                 <w:szCs w:val="32"/>
               </w:rPr>
-              <w:t>TOTAL ORDERS PER STATUS</w:t>
+              <w:t xml:space="preserve">TOTAL ORDERS </w:t>
+            </w:r>
+            <w:r>
+              <w:rPr>
+                <w:b/>
+                <w:sz w:val="32"/>
+                <w:szCs w:val="32"/>
+              </w:rPr>
+              <w:t>AMOUNT</w:t>
             </w:r>
           </w:p>
         </w:tc>
@@ -1725,7 +1889,6 @@
                 <w:szCs w:val="20"/>
                 <w:shd w:val="clear" w:color="auto" w:fill="FDFDFE"/>
               </w:rPr>
-              <w:lastRenderedPageBreak/>
               <w:t>Android</w:t>
             </w:r>
           </w:p>
@@ -1982,25 +2145,6 @@
     </w:tbl>
     <w:p>
       <w:pPr>
-        <w:pStyle w:val="ListParagraph"/>
-        <w:rPr>
-          <w:sz w:val="24"/>
-          <w:szCs w:val="24"/>
-        </w:rPr>
-      </w:pPr>
-    </w:p>
-    <w:p>
-      <w:pPr>
-        <w:pStyle w:val="ListParagraph"/>
-        <w:rPr>
-          <w:sz w:val="24"/>
-          <w:szCs w:val="24"/>
-        </w:rPr>
-      </w:pPr>
-    </w:p>
-    <w:p>
-      <w:pPr>
-        <w:pStyle w:val="ListParagraph"/>
         <w:rPr>
           <w:sz w:val="24"/>
           <w:szCs w:val="24"/>
@@ -2035,16 +2179,16 @@
         <w:tblLook w:val="04A0" w:firstRow="1" w:lastRow="0" w:firstColumn="1" w:lastColumn="0" w:noHBand="0" w:noVBand="1"/>
       </w:tblPr>
       <w:tblGrid>
-        <w:gridCol w:w="4275"/>
-        <w:gridCol w:w="4275"/>
+        <w:gridCol w:w="4652"/>
+        <w:gridCol w:w="3853"/>
       </w:tblGrid>
       <w:tr>
         <w:trPr>
-          <w:trHeight w:val="287"/>
+          <w:trHeight w:val="272"/>
         </w:trPr>
         <w:tc>
           <w:tcPr>
-            <w:tcW w:w="4275" w:type="dxa"/>
+            <w:tcW w:w="4652" w:type="dxa"/>
           </w:tcPr>
           <w:p>
             <w:pPr>
@@ -2067,7 +2211,7 @@
         </w:tc>
         <w:tc>
           <w:tcPr>
-            <w:tcW w:w="4275" w:type="dxa"/>
+            <w:tcW w:w="3853" w:type="dxa"/>
           </w:tcPr>
           <w:p>
             <w:pPr>
@@ -2084,18 +2228,18 @@
                 <w:sz w:val="32"/>
                 <w:szCs w:val="32"/>
               </w:rPr>
-              <w:t>TOTAL ORDER AMOUNT</w:t>
+              <w:t>TOTAL CUSTOMERS</w:t>
             </w:r>
           </w:p>
         </w:tc>
       </w:tr>
       <w:tr>
         <w:trPr>
-          <w:trHeight w:val="268"/>
+          <w:trHeight w:val="254"/>
         </w:trPr>
         <w:tc>
           <w:tcPr>
-            <w:tcW w:w="4275" w:type="dxa"/>
+            <w:tcW w:w="4652" w:type="dxa"/>
           </w:tcPr>
           <w:p>
             <w:pPr>
@@ -2118,260 +2262,142 @@
         </w:tc>
         <w:tc>
           <w:tcPr>
-            <w:tcW w:w="4275" w:type="dxa"/>
-          </w:tcPr>
-          <w:p>
-            <w:pPr>
-              <w:jc w:val="right"/>
-              <w:rPr>
-                <w:sz w:val="24"/>
-                <w:szCs w:val="24"/>
-              </w:rPr>
-            </w:pPr>
-            <w:r>
-              <w:rPr>
-                <w:rFonts w:ascii="Arial" w:hAnsi="Arial" w:cs="Arial"/>
-                <w:color w:val="000000"/>
-                <w:sz w:val="20"/>
-                <w:szCs w:val="20"/>
-                <w:shd w:val="clear" w:color="auto" w:fill="FDFDFE"/>
-              </w:rPr>
-              <w:t>11</w:t>
-            </w:r>
-            <w:r>
-              <w:rPr>
-                <w:rFonts w:ascii="Arial" w:hAnsi="Arial" w:cs="Arial"/>
-                <w:color w:val="000000"/>
-                <w:sz w:val="20"/>
-                <w:szCs w:val="20"/>
-                <w:shd w:val="clear" w:color="auto" w:fill="FDFDFE"/>
-              </w:rPr>
-              <w:t>,</w:t>
-            </w:r>
-            <w:r>
-              <w:rPr>
-                <w:rFonts w:ascii="Arial" w:hAnsi="Arial" w:cs="Arial"/>
-                <w:color w:val="000000"/>
-                <w:sz w:val="20"/>
-                <w:szCs w:val="20"/>
-                <w:shd w:val="clear" w:color="auto" w:fill="FDFDFE"/>
-              </w:rPr>
-              <w:t>82</w:t>
-            </w:r>
-            <w:r>
-              <w:rPr>
-                <w:rFonts w:ascii="Arial" w:hAnsi="Arial" w:cs="Arial"/>
-                <w:color w:val="000000"/>
-                <w:sz w:val="20"/>
-                <w:szCs w:val="20"/>
-                <w:shd w:val="clear" w:color="auto" w:fill="FDFDFE"/>
-              </w:rPr>
-              <w:t>,</w:t>
-            </w:r>
-            <w:r>
-              <w:rPr>
-                <w:rFonts w:ascii="Arial" w:hAnsi="Arial" w:cs="Arial"/>
-                <w:color w:val="000000"/>
-                <w:sz w:val="20"/>
-                <w:szCs w:val="20"/>
-                <w:shd w:val="clear" w:color="auto" w:fill="FDFDFE"/>
-              </w:rPr>
-              <w:t>687.89</w:t>
+            <w:tcW w:w="3853" w:type="dxa"/>
+          </w:tcPr>
+          <w:p>
+            <w:pPr>
+              <w:jc w:val="center"/>
+            </w:pPr>
+            <w:r>
+              <w:rPr>
+                <w:rFonts w:ascii="Arial" w:hAnsi="Arial" w:cs="Arial"/>
+                <w:color w:val="000000"/>
+                <w:sz w:val="20"/>
+                <w:szCs w:val="20"/>
+                <w:shd w:val="clear" w:color="auto" w:fill="FDFDFE"/>
+              </w:rPr>
+              <w:t>724</w:t>
             </w:r>
           </w:p>
         </w:tc>
       </w:tr>
       <w:tr>
         <w:trPr>
-          <w:trHeight w:val="287"/>
+          <w:trHeight w:val="272"/>
         </w:trPr>
         <w:tc>
           <w:tcPr>
-            <w:tcW w:w="4275" w:type="dxa"/>
-          </w:tcPr>
-          <w:p>
-            <w:pPr>
-              <w:rPr>
-                <w:sz w:val="24"/>
-                <w:szCs w:val="24"/>
-              </w:rPr>
-            </w:pPr>
-            <w:r>
-              <w:rPr>
-                <w:rFonts w:ascii="Arial" w:hAnsi="Arial" w:cs="Arial"/>
-                <w:color w:val="000000"/>
-                <w:sz w:val="20"/>
-                <w:szCs w:val="20"/>
-                <w:shd w:val="clear" w:color="auto" w:fill="FDFDFE"/>
-              </w:rPr>
-              <w:t>Organic Search</w:t>
-            </w:r>
-          </w:p>
-        </w:tc>
-        <w:tc>
-          <w:tcPr>
-            <w:tcW w:w="4275" w:type="dxa"/>
-          </w:tcPr>
-          <w:p>
-            <w:pPr>
-              <w:jc w:val="right"/>
-              <w:rPr>
-                <w:sz w:val="24"/>
-                <w:szCs w:val="24"/>
-              </w:rPr>
-            </w:pPr>
-            <w:r>
-              <w:rPr>
-                <w:rFonts w:ascii="Arial" w:hAnsi="Arial" w:cs="Arial"/>
-                <w:color w:val="000000"/>
-                <w:sz w:val="20"/>
-                <w:szCs w:val="20"/>
-                <w:shd w:val="clear" w:color="auto" w:fill="FDFDFE"/>
-              </w:rPr>
-              <w:t>6</w:t>
-            </w:r>
-            <w:r>
-              <w:rPr>
-                <w:rFonts w:ascii="Arial" w:hAnsi="Arial" w:cs="Arial"/>
-                <w:color w:val="000000"/>
-                <w:sz w:val="20"/>
-                <w:szCs w:val="20"/>
-                <w:shd w:val="clear" w:color="auto" w:fill="FDFDFE"/>
-              </w:rPr>
-              <w:t>,</w:t>
-            </w:r>
-            <w:r>
-              <w:rPr>
-                <w:rFonts w:ascii="Arial" w:hAnsi="Arial" w:cs="Arial"/>
-                <w:color w:val="000000"/>
-                <w:sz w:val="20"/>
-                <w:szCs w:val="20"/>
-                <w:shd w:val="clear" w:color="auto" w:fill="FDFDFE"/>
-              </w:rPr>
-              <w:t>46</w:t>
-            </w:r>
-            <w:r>
-              <w:rPr>
-                <w:rFonts w:ascii="Arial" w:hAnsi="Arial" w:cs="Arial"/>
-                <w:color w:val="000000"/>
-                <w:sz w:val="20"/>
-                <w:szCs w:val="20"/>
-                <w:shd w:val="clear" w:color="auto" w:fill="FDFDFE"/>
-              </w:rPr>
-              <w:t>,</w:t>
-            </w:r>
-            <w:r>
-              <w:rPr>
-                <w:rFonts w:ascii="Arial" w:hAnsi="Arial" w:cs="Arial"/>
-                <w:color w:val="000000"/>
-                <w:sz w:val="20"/>
-                <w:szCs w:val="20"/>
-                <w:shd w:val="clear" w:color="auto" w:fill="FDFDFE"/>
-              </w:rPr>
-              <w:t>789.05</w:t>
+            <w:tcW w:w="4652" w:type="dxa"/>
+          </w:tcPr>
+          <w:p>
+            <w:pPr>
+              <w:rPr>
+                <w:sz w:val="24"/>
+                <w:szCs w:val="24"/>
+              </w:rPr>
+            </w:pPr>
+            <w:r>
+              <w:rPr>
+                <w:rFonts w:ascii="Arial" w:hAnsi="Arial" w:cs="Arial"/>
+                <w:color w:val="000000"/>
+                <w:sz w:val="20"/>
+                <w:szCs w:val="20"/>
+                <w:shd w:val="clear" w:color="auto" w:fill="FDFDFE"/>
+              </w:rPr>
+              <w:t>Meta Ads</w:t>
+            </w:r>
+          </w:p>
+        </w:tc>
+        <w:tc>
+          <w:tcPr>
+            <w:tcW w:w="3853" w:type="dxa"/>
+          </w:tcPr>
+          <w:p>
+            <w:pPr>
+              <w:jc w:val="center"/>
+              <w:rPr>
+                <w:rFonts w:ascii="Arial" w:hAnsi="Arial" w:cs="Arial"/>
+                <w:color w:val="000000"/>
+                <w:sz w:val="20"/>
+                <w:szCs w:val="20"/>
+                <w:shd w:val="clear" w:color="auto" w:fill="FDFDFE"/>
+              </w:rPr>
+            </w:pPr>
+            <w:r>
+              <w:rPr>
+                <w:rFonts w:ascii="Arial" w:hAnsi="Arial" w:cs="Arial"/>
+                <w:color w:val="000000"/>
+                <w:sz w:val="20"/>
+                <w:szCs w:val="20"/>
+                <w:shd w:val="clear" w:color="auto" w:fill="FDFDFE"/>
+              </w:rPr>
+              <w:t>456</w:t>
             </w:r>
           </w:p>
         </w:tc>
       </w:tr>
       <w:tr>
         <w:trPr>
-          <w:trHeight w:val="268"/>
+          <w:trHeight w:val="254"/>
         </w:trPr>
         <w:tc>
           <w:tcPr>
-            <w:tcW w:w="4275" w:type="dxa"/>
-          </w:tcPr>
-          <w:p>
-            <w:pPr>
-              <w:rPr>
-                <w:sz w:val="24"/>
-                <w:szCs w:val="24"/>
-              </w:rPr>
-            </w:pPr>
-            <w:r>
-              <w:rPr>
-                <w:rFonts w:ascii="Arial" w:hAnsi="Arial" w:cs="Arial"/>
-                <w:color w:val="000000"/>
-                <w:sz w:val="20"/>
-                <w:szCs w:val="20"/>
-                <w:shd w:val="clear" w:color="auto" w:fill="FDFDFE"/>
-              </w:rPr>
-              <w:t>Meta Ads</w:t>
-            </w:r>
-          </w:p>
-        </w:tc>
-        <w:tc>
-          <w:tcPr>
-            <w:tcW w:w="4275" w:type="dxa"/>
-          </w:tcPr>
-          <w:p>
-            <w:pPr>
-              <w:jc w:val="right"/>
-              <w:rPr>
-                <w:sz w:val="24"/>
-                <w:szCs w:val="24"/>
-              </w:rPr>
-            </w:pPr>
-            <w:r>
-              <w:rPr>
-                <w:rFonts w:ascii="Arial" w:hAnsi="Arial" w:cs="Arial"/>
-                <w:color w:val="000000"/>
-                <w:sz w:val="20"/>
-                <w:szCs w:val="20"/>
-                <w:shd w:val="clear" w:color="auto" w:fill="FDFDFE"/>
-              </w:rPr>
-              <w:t>4</w:t>
-            </w:r>
-            <w:r>
-              <w:rPr>
-                <w:rFonts w:ascii="Arial" w:hAnsi="Arial" w:cs="Arial"/>
-                <w:color w:val="000000"/>
-                <w:sz w:val="20"/>
-                <w:szCs w:val="20"/>
-                <w:shd w:val="clear" w:color="auto" w:fill="FDFDFE"/>
-              </w:rPr>
-              <w:t>,</w:t>
-            </w:r>
-            <w:r>
-              <w:rPr>
-                <w:rFonts w:ascii="Arial" w:hAnsi="Arial" w:cs="Arial"/>
-                <w:color w:val="000000"/>
-                <w:sz w:val="20"/>
-                <w:szCs w:val="20"/>
-                <w:shd w:val="clear" w:color="auto" w:fill="FDFDFE"/>
-              </w:rPr>
-              <w:t>97</w:t>
-            </w:r>
-            <w:r>
-              <w:rPr>
-                <w:rFonts w:ascii="Arial" w:hAnsi="Arial" w:cs="Arial"/>
-                <w:color w:val="000000"/>
-                <w:sz w:val="20"/>
-                <w:szCs w:val="20"/>
-                <w:shd w:val="clear" w:color="auto" w:fill="FDFDFE"/>
-              </w:rPr>
-              <w:t>,</w:t>
-            </w:r>
-            <w:r>
-              <w:rPr>
-                <w:rFonts w:ascii="Arial" w:hAnsi="Arial" w:cs="Arial"/>
-                <w:color w:val="000000"/>
-                <w:sz w:val="20"/>
-                <w:szCs w:val="20"/>
-                <w:shd w:val="clear" w:color="auto" w:fill="FDFDFE"/>
-              </w:rPr>
-              <w:t>038.54</w:t>
+            <w:tcW w:w="4652" w:type="dxa"/>
+          </w:tcPr>
+          <w:p>
+            <w:pPr>
+              <w:rPr>
+                <w:sz w:val="24"/>
+                <w:szCs w:val="24"/>
+              </w:rPr>
+            </w:pPr>
+            <w:r>
+              <w:rPr>
+                <w:rFonts w:ascii="Arial" w:hAnsi="Arial" w:cs="Arial"/>
+                <w:color w:val="000000"/>
+                <w:sz w:val="20"/>
+                <w:szCs w:val="20"/>
+                <w:shd w:val="clear" w:color="auto" w:fill="FDFDFE"/>
+              </w:rPr>
+              <w:t>Organic Search</w:t>
+            </w:r>
+          </w:p>
+        </w:tc>
+        <w:tc>
+          <w:tcPr>
+            <w:tcW w:w="3853" w:type="dxa"/>
+          </w:tcPr>
+          <w:p>
+            <w:pPr>
+              <w:jc w:val="center"/>
+              <w:rPr>
+                <w:rFonts w:ascii="Arial" w:hAnsi="Arial" w:cs="Arial"/>
+                <w:color w:val="000000"/>
+                <w:sz w:val="20"/>
+                <w:szCs w:val="20"/>
+                <w:shd w:val="clear" w:color="auto" w:fill="FDFDFE"/>
+              </w:rPr>
+            </w:pPr>
+            <w:r>
+              <w:rPr>
+                <w:rFonts w:ascii="Arial" w:hAnsi="Arial" w:cs="Arial"/>
+                <w:color w:val="000000"/>
+                <w:sz w:val="20"/>
+                <w:szCs w:val="20"/>
+                <w:shd w:val="clear" w:color="auto" w:fill="FDFDFE"/>
+              </w:rPr>
+              <w:t>411</w:t>
             </w:r>
           </w:p>
         </w:tc>
       </w:tr>
       <w:tr>
         <w:trPr>
-          <w:trHeight w:val="268"/>
+          <w:trHeight w:val="254"/>
         </w:trPr>
         <w:tc>
           <w:tcPr>
-            <w:tcW w:w="4275" w:type="dxa"/>
+            <w:tcW w:w="4652" w:type="dxa"/>
           </w:tcPr>
           <w:p>
             <w:pPr>
@@ -2397,79 +2423,39 @@
         </w:tc>
         <w:tc>
           <w:tcPr>
-            <w:tcW w:w="4275" w:type="dxa"/>
-          </w:tcPr>
-          <w:p>
-            <w:pPr>
-              <w:jc w:val="right"/>
-              <w:rPr>
-                <w:rFonts w:ascii="Arial" w:hAnsi="Arial" w:cs="Arial"/>
-                <w:color w:val="000000"/>
-                <w:sz w:val="20"/>
-                <w:szCs w:val="20"/>
-                <w:shd w:val="clear" w:color="auto" w:fill="FDFDFE"/>
-              </w:rPr>
-            </w:pPr>
-            <w:r>
-              <w:rPr>
-                <w:rFonts w:ascii="Arial" w:hAnsi="Arial" w:cs="Arial"/>
-                <w:color w:val="000000"/>
-                <w:sz w:val="20"/>
-                <w:szCs w:val="20"/>
-                <w:shd w:val="clear" w:color="auto" w:fill="FDFDFE"/>
-              </w:rPr>
-              <w:t>4</w:t>
-            </w:r>
-            <w:r>
-              <w:rPr>
-                <w:rFonts w:ascii="Arial" w:hAnsi="Arial" w:cs="Arial"/>
-                <w:color w:val="000000"/>
-                <w:sz w:val="20"/>
-                <w:szCs w:val="20"/>
-                <w:shd w:val="clear" w:color="auto" w:fill="FDFDFE"/>
-              </w:rPr>
-              <w:t>,</w:t>
-            </w:r>
-            <w:r>
-              <w:rPr>
-                <w:rFonts w:ascii="Arial" w:hAnsi="Arial" w:cs="Arial"/>
-                <w:color w:val="000000"/>
-                <w:sz w:val="20"/>
-                <w:szCs w:val="20"/>
-                <w:shd w:val="clear" w:color="auto" w:fill="FDFDFE"/>
-              </w:rPr>
-              <w:t>00</w:t>
-            </w:r>
-            <w:r>
-              <w:rPr>
-                <w:rFonts w:ascii="Arial" w:hAnsi="Arial" w:cs="Arial"/>
-                <w:color w:val="000000"/>
-                <w:sz w:val="20"/>
-                <w:szCs w:val="20"/>
-                <w:shd w:val="clear" w:color="auto" w:fill="FDFDFE"/>
-              </w:rPr>
-              <w:t>,</w:t>
-            </w:r>
-            <w:r>
-              <w:rPr>
-                <w:rFonts w:ascii="Arial" w:hAnsi="Arial" w:cs="Arial"/>
-                <w:color w:val="000000"/>
-                <w:sz w:val="20"/>
-                <w:szCs w:val="20"/>
-                <w:shd w:val="clear" w:color="auto" w:fill="FDFDFE"/>
-              </w:rPr>
-              <w:t>471.50</w:t>
+            <w:tcW w:w="3853" w:type="dxa"/>
+          </w:tcPr>
+          <w:p>
+            <w:pPr>
+              <w:jc w:val="center"/>
+              <w:rPr>
+                <w:rFonts w:ascii="Arial" w:hAnsi="Arial" w:cs="Arial"/>
+                <w:color w:val="000000"/>
+                <w:sz w:val="20"/>
+                <w:szCs w:val="20"/>
+                <w:shd w:val="clear" w:color="auto" w:fill="FDFDFE"/>
+              </w:rPr>
+            </w:pPr>
+            <w:r>
+              <w:rPr>
+                <w:rFonts w:ascii="Arial" w:hAnsi="Arial" w:cs="Arial"/>
+                <w:color w:val="000000"/>
+                <w:sz w:val="20"/>
+                <w:szCs w:val="20"/>
+                <w:shd w:val="clear" w:color="auto" w:fill="FDFDFE"/>
+              </w:rPr>
+              <w:t>286</w:t>
             </w:r>
           </w:p>
         </w:tc>
       </w:tr>
       <w:tr>
         <w:trPr>
-          <w:trHeight w:val="268"/>
+          <w:trHeight w:val="254"/>
         </w:trPr>
         <w:tc>
           <w:tcPr>
-            <w:tcW w:w="4275" w:type="dxa"/>
+            <w:tcW w:w="4652" w:type="dxa"/>
           </w:tcPr>
           <w:p>
             <w:pPr>
@@ -2495,79 +2481,39 @@
         </w:tc>
         <w:tc>
           <w:tcPr>
-            <w:tcW w:w="4275" w:type="dxa"/>
-          </w:tcPr>
-          <w:p>
-            <w:pPr>
-              <w:jc w:val="right"/>
-              <w:rPr>
-                <w:rFonts w:ascii="Arial" w:hAnsi="Arial" w:cs="Arial"/>
-                <w:color w:val="000000"/>
-                <w:sz w:val="20"/>
-                <w:szCs w:val="20"/>
-                <w:shd w:val="clear" w:color="auto" w:fill="FDFDFE"/>
-              </w:rPr>
-            </w:pPr>
-            <w:r>
-              <w:rPr>
-                <w:rFonts w:ascii="Arial" w:hAnsi="Arial" w:cs="Arial"/>
-                <w:color w:val="000000"/>
-                <w:sz w:val="20"/>
-                <w:szCs w:val="20"/>
-                <w:shd w:val="clear" w:color="auto" w:fill="FDFDFE"/>
-              </w:rPr>
-              <w:t>2</w:t>
-            </w:r>
-            <w:r>
-              <w:rPr>
-                <w:rFonts w:ascii="Arial" w:hAnsi="Arial" w:cs="Arial"/>
-                <w:color w:val="000000"/>
-                <w:sz w:val="20"/>
-                <w:szCs w:val="20"/>
-                <w:shd w:val="clear" w:color="auto" w:fill="FDFDFE"/>
-              </w:rPr>
-              <w:t>,</w:t>
-            </w:r>
-            <w:r>
-              <w:rPr>
-                <w:rFonts w:ascii="Arial" w:hAnsi="Arial" w:cs="Arial"/>
-                <w:color w:val="000000"/>
-                <w:sz w:val="20"/>
-                <w:szCs w:val="20"/>
-                <w:shd w:val="clear" w:color="auto" w:fill="FDFDFE"/>
-              </w:rPr>
-              <w:t>53</w:t>
-            </w:r>
-            <w:r>
-              <w:rPr>
-                <w:rFonts w:ascii="Arial" w:hAnsi="Arial" w:cs="Arial"/>
-                <w:color w:val="000000"/>
-                <w:sz w:val="20"/>
-                <w:szCs w:val="20"/>
-                <w:shd w:val="clear" w:color="auto" w:fill="FDFDFE"/>
-              </w:rPr>
-              <w:t>,</w:t>
-            </w:r>
-            <w:r>
-              <w:rPr>
-                <w:rFonts w:ascii="Arial" w:hAnsi="Arial" w:cs="Arial"/>
-                <w:color w:val="000000"/>
-                <w:sz w:val="20"/>
-                <w:szCs w:val="20"/>
-                <w:shd w:val="clear" w:color="auto" w:fill="FDFDFE"/>
-              </w:rPr>
-              <w:t>909.92</w:t>
+            <w:tcW w:w="3853" w:type="dxa"/>
+          </w:tcPr>
+          <w:p>
+            <w:pPr>
+              <w:jc w:val="center"/>
+              <w:rPr>
+                <w:rFonts w:ascii="Arial" w:hAnsi="Arial" w:cs="Arial"/>
+                <w:color w:val="000000"/>
+                <w:sz w:val="20"/>
+                <w:szCs w:val="20"/>
+                <w:shd w:val="clear" w:color="auto" w:fill="FDFDFE"/>
+              </w:rPr>
+            </w:pPr>
+            <w:r>
+              <w:rPr>
+                <w:rFonts w:ascii="Arial" w:hAnsi="Arial" w:cs="Arial"/>
+                <w:color w:val="000000"/>
+                <w:sz w:val="20"/>
+                <w:szCs w:val="20"/>
+                <w:shd w:val="clear" w:color="auto" w:fill="FDFDFE"/>
+              </w:rPr>
+              <w:t>209</w:t>
             </w:r>
           </w:p>
         </w:tc>
       </w:tr>
       <w:tr>
         <w:trPr>
-          <w:trHeight w:val="268"/>
+          <w:trHeight w:val="254"/>
         </w:trPr>
         <w:tc>
           <w:tcPr>
-            <w:tcW w:w="4275" w:type="dxa"/>
+            <w:tcW w:w="4652" w:type="dxa"/>
           </w:tcPr>
           <w:p>
             <w:pPr>
@@ -2593,68 +2539,76 @@
         </w:tc>
         <w:tc>
           <w:tcPr>
-            <w:tcW w:w="4275" w:type="dxa"/>
-          </w:tcPr>
-          <w:p>
-            <w:pPr>
-              <w:jc w:val="right"/>
-              <w:rPr>
-                <w:rFonts w:ascii="Arial" w:hAnsi="Arial" w:cs="Arial"/>
-                <w:color w:val="000000"/>
-                <w:sz w:val="20"/>
-                <w:szCs w:val="20"/>
-                <w:shd w:val="clear" w:color="auto" w:fill="FDFDFE"/>
-              </w:rPr>
-            </w:pPr>
-            <w:r>
-              <w:rPr>
-                <w:rFonts w:ascii="Arial" w:hAnsi="Arial" w:cs="Arial"/>
-                <w:color w:val="000000"/>
-                <w:sz w:val="20"/>
-                <w:szCs w:val="20"/>
-                <w:shd w:val="clear" w:color="auto" w:fill="FDFDFE"/>
-              </w:rPr>
-              <w:t>1</w:t>
-            </w:r>
-            <w:r>
-              <w:rPr>
-                <w:rFonts w:ascii="Arial" w:hAnsi="Arial" w:cs="Arial"/>
-                <w:color w:val="000000"/>
-                <w:sz w:val="20"/>
-                <w:szCs w:val="20"/>
-                <w:shd w:val="clear" w:color="auto" w:fill="FDFDFE"/>
-              </w:rPr>
-              <w:t>,</w:t>
-            </w:r>
-            <w:r>
-              <w:rPr>
-                <w:rFonts w:ascii="Arial" w:hAnsi="Arial" w:cs="Arial"/>
-                <w:color w:val="000000"/>
-                <w:sz w:val="20"/>
-                <w:szCs w:val="20"/>
-                <w:shd w:val="clear" w:color="auto" w:fill="FDFDFE"/>
-              </w:rPr>
-              <w:t>20</w:t>
-            </w:r>
-            <w:r>
-              <w:rPr>
-                <w:rFonts w:ascii="Arial" w:hAnsi="Arial" w:cs="Arial"/>
-                <w:color w:val="000000"/>
-                <w:sz w:val="20"/>
-                <w:szCs w:val="20"/>
-                <w:shd w:val="clear" w:color="auto" w:fill="FDFDFE"/>
-              </w:rPr>
-              <w:t>,</w:t>
-            </w:r>
-            <w:r>
-              <w:rPr>
-                <w:rFonts w:ascii="Arial" w:hAnsi="Arial" w:cs="Arial"/>
-                <w:color w:val="000000"/>
-                <w:sz w:val="20"/>
-                <w:szCs w:val="20"/>
-                <w:shd w:val="clear" w:color="auto" w:fill="FDFDFE"/>
-              </w:rPr>
-              <w:t>481.43</w:t>
+            <w:tcW w:w="3853" w:type="dxa"/>
+          </w:tcPr>
+          <w:p>
+            <w:pPr>
+              <w:jc w:val="center"/>
+              <w:rPr>
+                <w:rFonts w:ascii="Arial" w:hAnsi="Arial" w:cs="Arial"/>
+                <w:color w:val="000000"/>
+                <w:sz w:val="20"/>
+                <w:szCs w:val="20"/>
+                <w:shd w:val="clear" w:color="auto" w:fill="FDFDFE"/>
+              </w:rPr>
+            </w:pPr>
+            <w:r>
+              <w:rPr>
+                <w:rFonts w:ascii="Arial" w:hAnsi="Arial" w:cs="Arial"/>
+                <w:color w:val="000000"/>
+                <w:sz w:val="20"/>
+                <w:szCs w:val="20"/>
+                <w:shd w:val="clear" w:color="auto" w:fill="FDFDFE"/>
+              </w:rPr>
+              <w:t>112</w:t>
+            </w:r>
+          </w:p>
+        </w:tc>
+      </w:tr>
+      <w:tr>
+        <w:trPr>
+          <w:trHeight w:val="254"/>
+        </w:trPr>
+        <w:tc>
+          <w:tcPr>
+            <w:tcW w:w="4652" w:type="dxa"/>
+          </w:tcPr>
+          <w:p>
+            <w:pPr>
+              <w:rPr>
+                <w:rFonts w:ascii="Arial" w:hAnsi="Arial" w:cs="Arial"/>
+                <w:color w:val="000000"/>
+                <w:sz w:val="20"/>
+                <w:szCs w:val="20"/>
+                <w:shd w:val="clear" w:color="auto" w:fill="FDFDFE"/>
+              </w:rPr>
+            </w:pPr>
+          </w:p>
+        </w:tc>
+        <w:tc>
+          <w:tcPr>
+            <w:tcW w:w="3853" w:type="dxa"/>
+          </w:tcPr>
+          <w:p>
+            <w:pPr>
+              <w:jc w:val="center"/>
+              <w:rPr>
+                <w:rFonts w:ascii="Arial" w:hAnsi="Arial" w:cs="Arial"/>
+                <w:color w:val="000000"/>
+                <w:sz w:val="20"/>
+                <w:szCs w:val="20"/>
+                <w:shd w:val="clear" w:color="auto" w:fill="FDFDFE"/>
+              </w:rPr>
+            </w:pPr>
+            <w:r>
+              <w:rPr>
+                <w:rFonts w:ascii="Arial" w:hAnsi="Arial" w:cs="Arial"/>
+                <w:color w:val="000000"/>
+                <w:sz w:val="20"/>
+                <w:szCs w:val="20"/>
+                <w:shd w:val="clear" w:color="auto" w:fill="FDFDFE"/>
+              </w:rPr>
+              <w:t>55</w:t>
             </w:r>
           </w:p>
         </w:tc>
@@ -2808,6 +2762,7 @@
           </w:tcPr>
           <w:p>
             <w:pPr>
+              <w:jc w:val="center"/>
               <w:rPr>
                 <w:sz w:val="24"/>
                 <w:szCs w:val="24"/>
@@ -2859,6 +2814,7 @@
           </w:tcPr>
           <w:p>
             <w:pPr>
+              <w:jc w:val="center"/>
               <w:rPr>
                 <w:sz w:val="24"/>
                 <w:szCs w:val="24"/>
@@ -2910,6 +2866,7 @@
           </w:tcPr>
           <w:p>
             <w:pPr>
+              <w:jc w:val="center"/>
               <w:rPr>
                 <w:sz w:val="24"/>
                 <w:szCs w:val="24"/>
@@ -2961,6 +2918,7 @@
           </w:tcPr>
           <w:p>
             <w:pPr>
+              <w:jc w:val="center"/>
               <w:rPr>
                 <w:sz w:val="24"/>
                 <w:szCs w:val="24"/>
@@ -3015,6 +2973,7 @@
           </w:tcPr>
           <w:p>
             <w:pPr>
+              <w:jc w:val="center"/>
               <w:rPr>
                 <w:rFonts w:ascii="Arial" w:hAnsi="Arial" w:cs="Arial"/>
                 <w:color w:val="000000"/>
@@ -3072,6 +3031,7 @@
           </w:tcPr>
           <w:p>
             <w:pPr>
+              <w:jc w:val="center"/>
               <w:rPr>
                 <w:rFonts w:ascii="Arial" w:hAnsi="Arial" w:cs="Arial"/>
                 <w:color w:val="000000"/>
@@ -3129,6 +3089,7 @@
           </w:tcPr>
           <w:p>
             <w:pPr>
+              <w:jc w:val="center"/>
               <w:rPr>
                 <w:rFonts w:ascii="Arial" w:hAnsi="Arial" w:cs="Arial"/>
                 <w:color w:val="000000"/>
@@ -3186,6 +3147,7 @@
           </w:tcPr>
           <w:p>
             <w:pPr>
+              <w:jc w:val="center"/>
               <w:rPr>
                 <w:rFonts w:ascii="Arial" w:hAnsi="Arial" w:cs="Arial"/>
                 <w:color w:val="000000"/>
@@ -3243,6 +3205,7 @@
           </w:tcPr>
           <w:p>
             <w:pPr>
+              <w:jc w:val="center"/>
               <w:rPr>
                 <w:rFonts w:ascii="Arial" w:hAnsi="Arial" w:cs="Arial"/>
                 <w:color w:val="000000"/>
@@ -3300,6 +3263,7 @@
           </w:tcPr>
           <w:p>
             <w:pPr>
+              <w:jc w:val="center"/>
               <w:rPr>
                 <w:rFonts w:ascii="Arial" w:hAnsi="Arial" w:cs="Arial"/>
                 <w:color w:val="000000"/>
@@ -3445,6 +3409,7 @@
           </w:tcPr>
           <w:p>
             <w:pPr>
+              <w:jc w:val="center"/>
               <w:rPr>
                 <w:sz w:val="24"/>
                 <w:szCs w:val="24"/>
@@ -3496,6 +3461,7 @@
           </w:tcPr>
           <w:p>
             <w:pPr>
+              <w:jc w:val="center"/>
               <w:rPr>
                 <w:sz w:val="24"/>
                 <w:szCs w:val="24"/>
@@ -3547,6 +3513,7 @@
           </w:tcPr>
           <w:p>
             <w:pPr>
+              <w:jc w:val="center"/>
               <w:rPr>
                 <w:sz w:val="24"/>
                 <w:szCs w:val="24"/>
@@ -3598,6 +3565,7 @@
           </w:tcPr>
           <w:p>
             <w:pPr>
+              <w:jc w:val="center"/>
               <w:rPr>
                 <w:sz w:val="24"/>
                 <w:szCs w:val="24"/>
@@ -3652,6 +3620,7 @@
           </w:tcPr>
           <w:p>
             <w:pPr>
+              <w:jc w:val="center"/>
               <w:rPr>
                 <w:rFonts w:ascii="Arial" w:hAnsi="Arial" w:cs="Arial"/>
                 <w:color w:val="000000"/>
@@ -3721,6 +3690,7 @@
           </w:tcPr>
           <w:p>
             <w:pPr>
+              <w:jc w:val="center"/>
               <w:rPr>
                 <w:rFonts w:ascii="Arial" w:hAnsi="Arial" w:cs="Arial"/>
                 <w:color w:val="000000"/>
@@ -3790,6 +3760,7 @@
           </w:tcPr>
           <w:p>
             <w:pPr>
+              <w:jc w:val="center"/>
               <w:rPr>
                 <w:rFonts w:ascii="Arial" w:hAnsi="Arial" w:cs="Arial"/>
                 <w:color w:val="000000"/>
@@ -3847,6 +3818,7 @@
           </w:tcPr>
           <w:p>
             <w:pPr>
+              <w:jc w:val="center"/>
               <w:rPr>
                 <w:rFonts w:ascii="Arial" w:hAnsi="Arial" w:cs="Arial"/>
                 <w:color w:val="000000"/>
@@ -3904,6 +3876,7 @@
           </w:tcPr>
           <w:p>
             <w:pPr>
+              <w:jc w:val="center"/>
               <w:rPr>
                 <w:rFonts w:ascii="Arial" w:hAnsi="Arial" w:cs="Arial"/>
                 <w:color w:val="000000"/>
@@ -3961,6 +3934,7 @@
           </w:tcPr>
           <w:p>
             <w:pPr>
+              <w:jc w:val="center"/>
               <w:rPr>
                 <w:rFonts w:ascii="Arial" w:hAnsi="Arial" w:cs="Arial"/>
                 <w:color w:val="000000"/>
@@ -3983,6 +3957,33 @@
         </w:tc>
       </w:tr>
     </w:tbl>
+    <w:p>
+      <w:pPr>
+        <w:pStyle w:val="ListParagraph"/>
+        <w:rPr>
+          <w:sz w:val="24"/>
+          <w:szCs w:val="24"/>
+        </w:rPr>
+      </w:pPr>
+    </w:p>
+    <w:p>
+      <w:pPr>
+        <w:pStyle w:val="ListParagraph"/>
+        <w:rPr>
+          <w:sz w:val="24"/>
+          <w:szCs w:val="24"/>
+        </w:rPr>
+      </w:pPr>
+    </w:p>
+    <w:p>
+      <w:pPr>
+        <w:pStyle w:val="ListParagraph"/>
+        <w:rPr>
+          <w:sz w:val="24"/>
+          <w:szCs w:val="24"/>
+        </w:rPr>
+      </w:pPr>
+    </w:p>
     <w:p>
       <w:pPr>
         <w:pStyle w:val="ListParagraph"/>
@@ -4322,7 +4323,6 @@
                 <w:szCs w:val="20"/>
                 <w:shd w:val="clear" w:color="auto" w:fill="FDFDFE"/>
               </w:rPr>
-              <w:lastRenderedPageBreak/>
               <w:t>Nebulizer Machine</w:t>
             </w:r>
           </w:p>
@@ -5000,126 +5000,6 @@
                 <w:shd w:val="clear" w:color="auto" w:fill="FDFDFE"/>
               </w:rPr>
               <w:t>30</w:t>
-            </w:r>
-          </w:p>
-        </w:tc>
-      </w:tr>
-      <w:tr>
-        <w:trPr>
-          <w:trHeight w:val="268"/>
-        </w:trPr>
-        <w:tc>
-          <w:tcPr>
-            <w:tcW w:w="2241" w:type="dxa"/>
-          </w:tcPr>
-          <w:p>
-            <w:pPr>
-              <w:jc w:val="center"/>
-              <w:rPr>
-                <w:b/>
-                <w:sz w:val="32"/>
-                <w:szCs w:val="32"/>
-              </w:rPr>
-            </w:pPr>
-            <w:r>
-              <w:rPr>
-                <w:b/>
-                <w:sz w:val="32"/>
-                <w:szCs w:val="32"/>
-              </w:rPr>
-              <w:t>PRODUCT NAME</w:t>
-            </w:r>
-          </w:p>
-        </w:tc>
-        <w:tc>
-          <w:tcPr>
-            <w:tcW w:w="2214" w:type="dxa"/>
-          </w:tcPr>
-          <w:p>
-            <w:pPr>
-              <w:jc w:val="center"/>
-              <w:rPr>
-                <w:b/>
-                <w:sz w:val="32"/>
-                <w:szCs w:val="32"/>
-              </w:rPr>
-            </w:pPr>
-            <w:r>
-              <w:rPr>
-                <w:b/>
-                <w:sz w:val="32"/>
-                <w:szCs w:val="32"/>
-              </w:rPr>
-              <w:t>MRP</w:t>
-            </w:r>
-          </w:p>
-        </w:tc>
-        <w:tc>
-          <w:tcPr>
-            <w:tcW w:w="1637" w:type="dxa"/>
-          </w:tcPr>
-          <w:p>
-            <w:pPr>
-              <w:jc w:val="center"/>
-              <w:rPr>
-                <w:b/>
-                <w:sz w:val="32"/>
-                <w:szCs w:val="32"/>
-              </w:rPr>
-            </w:pPr>
-            <w:r>
-              <w:rPr>
-                <w:b/>
-                <w:sz w:val="32"/>
-                <w:szCs w:val="32"/>
-              </w:rPr>
-              <w:t>SELLING PRICE</w:t>
-            </w:r>
-          </w:p>
-        </w:tc>
-        <w:tc>
-          <w:tcPr>
-            <w:tcW w:w="1672" w:type="dxa"/>
-          </w:tcPr>
-          <w:p>
-            <w:pPr>
-              <w:jc w:val="center"/>
-              <w:rPr>
-                <w:b/>
-                <w:sz w:val="32"/>
-                <w:szCs w:val="32"/>
-              </w:rPr>
-            </w:pPr>
-            <w:r>
-              <w:rPr>
-                <w:b/>
-                <w:sz w:val="32"/>
-                <w:szCs w:val="32"/>
-              </w:rPr>
-              <w:t>DISCOUNT PRICE</w:t>
-            </w:r>
-          </w:p>
-        </w:tc>
-        <w:tc>
-          <w:tcPr>
-            <w:tcW w:w="1972" w:type="dxa"/>
-          </w:tcPr>
-          <w:p>
-            <w:pPr>
-              <w:jc w:val="center"/>
-              <w:rPr>
-                <w:b/>
-                <w:sz w:val="32"/>
-                <w:szCs w:val="32"/>
-              </w:rPr>
-            </w:pPr>
-            <w:r>
-              <w:rPr>
-                <w:b/>
-                <w:sz w:val="32"/>
-                <w:szCs w:val="32"/>
-              </w:rPr>
-              <w:t>DISCOUNT PERCENTAGE</w:t>
             </w:r>
           </w:p>
         </w:tc>
@@ -6502,15 +6382,6 @@
       </w:r>
       <w:proofErr w:type="gramEnd"/>
     </w:p>
-    <w:p>
-      <w:pPr>
-        <w:pStyle w:val="ListParagraph"/>
-        <w:rPr>
-          <w:sz w:val="24"/>
-          <w:szCs w:val="24"/>
-        </w:rPr>
-      </w:pPr>
-    </w:p>
     <w:tbl>
       <w:tblPr>
         <w:tblStyle w:val="TableGrid"/>
@@ -6694,13 +6565,10 @@
             </w:pPr>
             <w:r>
               <w:rPr>
-                <w:rFonts w:ascii="Arial" w:hAnsi="Arial" w:cs="Arial"/>
-                <w:color w:val="000000"/>
-                <w:sz w:val="20"/>
-                <w:szCs w:val="20"/>
-                <w:shd w:val="clear" w:color="auto" w:fill="FDFDFE"/>
-              </w:rPr>
-              <w:t>Non-Generic</w:t>
+                <w:sz w:val="24"/>
+                <w:szCs w:val="24"/>
+              </w:rPr>
+              <w:t>non-prescription</w:t>
             </w:r>
           </w:p>
         </w:tc>
@@ -6894,13 +6762,10 @@
             </w:pPr>
             <w:r>
               <w:rPr>
-                <w:rFonts w:ascii="Arial" w:hAnsi="Arial" w:cs="Arial"/>
-                <w:color w:val="000000"/>
-                <w:sz w:val="20"/>
-                <w:szCs w:val="20"/>
-                <w:shd w:val="clear" w:color="auto" w:fill="FDFDFE"/>
-              </w:rPr>
-              <w:t>Generic</w:t>
+                <w:sz w:val="24"/>
+                <w:szCs w:val="24"/>
+              </w:rPr>
+              <w:t>prescription</w:t>
             </w:r>
           </w:p>
         </w:tc>
@@ -7080,10 +6945,10 @@
     </w:tbl>
     <w:p>
       <w:pPr>
-        <w:pStyle w:val="ListParagraph"/>
         <w:rPr>
-          <w:sz w:val="24"/>
-          <w:szCs w:val="24"/>
+          <w:b/>
+          <w:sz w:val="32"/>
+          <w:szCs w:val="32"/>
         </w:rPr>
       </w:pPr>
     </w:p>
@@ -7143,14 +7008,14 @@
     <w:tbl>
       <w:tblPr>
         <w:tblStyle w:val="TableGrid"/>
-        <w:tblW w:w="9811" w:type="dxa"/>
-        <w:tblInd w:w="720" w:type="dxa"/>
+        <w:tblpPr w:leftFromText="180" w:rightFromText="180" w:vertAnchor="text" w:horzAnchor="page" w:tblpX="1441" w:tblpY="639"/>
+        <w:tblW w:w="9776" w:type="dxa"/>
         <w:tblLook w:val="04A0" w:firstRow="1" w:lastRow="0" w:firstColumn="1" w:lastColumn="0" w:noHBand="0" w:noVBand="1"/>
       </w:tblPr>
       <w:tblGrid>
-        <w:gridCol w:w="3386"/>
-        <w:gridCol w:w="3789"/>
-        <w:gridCol w:w="2636"/>
+        <w:gridCol w:w="2263"/>
+        <w:gridCol w:w="2183"/>
+        <w:gridCol w:w="5330"/>
       </w:tblGrid>
       <w:tr>
         <w:trPr>
@@ -7158,11 +7023,10 @@
         </w:trPr>
         <w:tc>
           <w:tcPr>
-            <w:tcW w:w="3386" w:type="dxa"/>
-          </w:tcPr>
-          <w:p>
-            <w:pPr>
-              <w:jc w:val="center"/>
+            <w:tcW w:w="2263" w:type="dxa"/>
+          </w:tcPr>
+          <w:p>
+            <w:pPr>
               <w:rPr>
                 <w:b/>
                 <w:sz w:val="32"/>
@@ -7181,7 +7045,7 @@
         </w:tc>
         <w:tc>
           <w:tcPr>
-            <w:tcW w:w="3789" w:type="dxa"/>
+            <w:tcW w:w="2183" w:type="dxa"/>
           </w:tcPr>
           <w:p>
             <w:pPr>
@@ -7198,13 +7062,13 @@
                 <w:sz w:val="32"/>
                 <w:szCs w:val="32"/>
               </w:rPr>
-              <w:t>TOTAL REDEMPTIONS</w:t>
-            </w:r>
-          </w:p>
-        </w:tc>
-        <w:tc>
-          <w:tcPr>
-            <w:tcW w:w="2636" w:type="dxa"/>
+              <w:t>TOTAL  ORDERS</w:t>
+            </w:r>
+          </w:p>
+        </w:tc>
+        <w:tc>
+          <w:tcPr>
+            <w:tcW w:w="5330" w:type="dxa"/>
           </w:tcPr>
           <w:p>
             <w:pPr>
@@ -7232,7 +7096,7 @@
         </w:trPr>
         <w:tc>
           <w:tcPr>
-            <w:tcW w:w="3386" w:type="dxa"/>
+            <w:tcW w:w="2263" w:type="dxa"/>
           </w:tcPr>
           <w:p>
             <w:pPr>
@@ -7255,7 +7119,7 @@
         </w:tc>
         <w:tc>
           <w:tcPr>
-            <w:tcW w:w="3789" w:type="dxa"/>
+            <w:tcW w:w="2183" w:type="dxa"/>
           </w:tcPr>
           <w:p>
             <w:pPr>
@@ -7279,68 +7143,28 @@
         </w:tc>
         <w:tc>
           <w:tcPr>
-            <w:tcW w:w="2636" w:type="dxa"/>
-          </w:tcPr>
-          <w:p>
-            <w:pPr>
-              <w:jc w:val="right"/>
-              <w:rPr>
-                <w:rFonts w:ascii="Arial" w:hAnsi="Arial" w:cs="Arial"/>
-                <w:color w:val="000000"/>
-                <w:sz w:val="20"/>
-                <w:szCs w:val="20"/>
-                <w:shd w:val="clear" w:color="auto" w:fill="FDFDFE"/>
-              </w:rPr>
-            </w:pPr>
-            <w:r>
-              <w:rPr>
-                <w:rFonts w:ascii="Arial" w:hAnsi="Arial" w:cs="Arial"/>
-                <w:color w:val="000000"/>
-                <w:sz w:val="20"/>
-                <w:szCs w:val="20"/>
-                <w:shd w:val="clear" w:color="auto" w:fill="FDFDFE"/>
-              </w:rPr>
-              <w:t>3</w:t>
-            </w:r>
-            <w:r>
-              <w:rPr>
-                <w:rFonts w:ascii="Arial" w:hAnsi="Arial" w:cs="Arial"/>
-                <w:color w:val="000000"/>
-                <w:sz w:val="20"/>
-                <w:szCs w:val="20"/>
-                <w:shd w:val="clear" w:color="auto" w:fill="FDFDFE"/>
-              </w:rPr>
-              <w:t>,</w:t>
-            </w:r>
-            <w:r>
-              <w:rPr>
-                <w:rFonts w:ascii="Arial" w:hAnsi="Arial" w:cs="Arial"/>
-                <w:color w:val="000000"/>
-                <w:sz w:val="20"/>
-                <w:szCs w:val="20"/>
-                <w:shd w:val="clear" w:color="auto" w:fill="FDFDFE"/>
-              </w:rPr>
-              <w:t>94</w:t>
-            </w:r>
-            <w:r>
-              <w:rPr>
-                <w:rFonts w:ascii="Arial" w:hAnsi="Arial" w:cs="Arial"/>
-                <w:color w:val="000000"/>
-                <w:sz w:val="20"/>
-                <w:szCs w:val="20"/>
-                <w:shd w:val="clear" w:color="auto" w:fill="FDFDFE"/>
-              </w:rPr>
-              <w:t>,</w:t>
-            </w:r>
-            <w:r>
-              <w:rPr>
-                <w:rFonts w:ascii="Arial" w:hAnsi="Arial" w:cs="Arial"/>
-                <w:color w:val="000000"/>
-                <w:sz w:val="20"/>
-                <w:szCs w:val="20"/>
-                <w:shd w:val="clear" w:color="auto" w:fill="FDFDFE"/>
-              </w:rPr>
-              <w:t>788.95</w:t>
+            <w:tcW w:w="5330" w:type="dxa"/>
+          </w:tcPr>
+          <w:p>
+            <w:pPr>
+              <w:jc w:val="right"/>
+              <w:rPr>
+                <w:rFonts w:ascii="Arial" w:hAnsi="Arial" w:cs="Arial"/>
+                <w:color w:val="000000"/>
+                <w:sz w:val="20"/>
+                <w:szCs w:val="20"/>
+                <w:shd w:val="clear" w:color="auto" w:fill="FDFDFE"/>
+              </w:rPr>
+            </w:pPr>
+            <w:r>
+              <w:rPr>
+                <w:rFonts w:ascii="Arial" w:hAnsi="Arial" w:cs="Arial"/>
+                <w:color w:val="000000"/>
+                <w:sz w:val="20"/>
+                <w:szCs w:val="20"/>
+                <w:shd w:val="clear" w:color="auto" w:fill="FDFDFE"/>
+              </w:rPr>
+              <w:t>3,94,788.95</w:t>
             </w:r>
           </w:p>
         </w:tc>
@@ -7351,7 +7175,7 @@
         </w:trPr>
         <w:tc>
           <w:tcPr>
-            <w:tcW w:w="3386" w:type="dxa"/>
+            <w:tcW w:w="2263" w:type="dxa"/>
           </w:tcPr>
           <w:p>
             <w:pPr>
@@ -7374,7 +7198,7 @@
         </w:tc>
         <w:tc>
           <w:tcPr>
-            <w:tcW w:w="3789" w:type="dxa"/>
+            <w:tcW w:w="2183" w:type="dxa"/>
           </w:tcPr>
           <w:p>
             <w:pPr>
@@ -7398,68 +7222,28 @@
         </w:tc>
         <w:tc>
           <w:tcPr>
-            <w:tcW w:w="2636" w:type="dxa"/>
-          </w:tcPr>
-          <w:p>
-            <w:pPr>
-              <w:jc w:val="right"/>
-              <w:rPr>
-                <w:rFonts w:ascii="Arial" w:hAnsi="Arial" w:cs="Arial"/>
-                <w:color w:val="000000"/>
-                <w:sz w:val="20"/>
-                <w:szCs w:val="20"/>
-                <w:shd w:val="clear" w:color="auto" w:fill="FDFDFE"/>
-              </w:rPr>
-            </w:pPr>
-            <w:r>
-              <w:rPr>
-                <w:rFonts w:ascii="Arial" w:hAnsi="Arial" w:cs="Arial"/>
-                <w:color w:val="000000"/>
-                <w:sz w:val="20"/>
-                <w:szCs w:val="20"/>
-                <w:shd w:val="clear" w:color="auto" w:fill="FDFDFE"/>
-              </w:rPr>
-              <w:t>2</w:t>
-            </w:r>
-            <w:r>
-              <w:rPr>
-                <w:rFonts w:ascii="Arial" w:hAnsi="Arial" w:cs="Arial"/>
-                <w:color w:val="000000"/>
-                <w:sz w:val="20"/>
-                <w:szCs w:val="20"/>
-                <w:shd w:val="clear" w:color="auto" w:fill="FDFDFE"/>
-              </w:rPr>
-              <w:t>,</w:t>
-            </w:r>
-            <w:r>
-              <w:rPr>
-                <w:rFonts w:ascii="Arial" w:hAnsi="Arial" w:cs="Arial"/>
-                <w:color w:val="000000"/>
-                <w:sz w:val="20"/>
-                <w:szCs w:val="20"/>
-                <w:shd w:val="clear" w:color="auto" w:fill="FDFDFE"/>
-              </w:rPr>
-              <w:t>71</w:t>
-            </w:r>
-            <w:r>
-              <w:rPr>
-                <w:rFonts w:ascii="Arial" w:hAnsi="Arial" w:cs="Arial"/>
-                <w:color w:val="000000"/>
-                <w:sz w:val="20"/>
-                <w:szCs w:val="20"/>
-                <w:shd w:val="clear" w:color="auto" w:fill="FDFDFE"/>
-              </w:rPr>
-              <w:t>,</w:t>
-            </w:r>
-            <w:r>
-              <w:rPr>
-                <w:rFonts w:ascii="Arial" w:hAnsi="Arial" w:cs="Arial"/>
-                <w:color w:val="000000"/>
-                <w:sz w:val="20"/>
-                <w:szCs w:val="20"/>
-                <w:shd w:val="clear" w:color="auto" w:fill="FDFDFE"/>
-              </w:rPr>
-              <w:t>318.50</w:t>
+            <w:tcW w:w="5330" w:type="dxa"/>
+          </w:tcPr>
+          <w:p>
+            <w:pPr>
+              <w:jc w:val="right"/>
+              <w:rPr>
+                <w:rFonts w:ascii="Arial" w:hAnsi="Arial" w:cs="Arial"/>
+                <w:color w:val="000000"/>
+                <w:sz w:val="20"/>
+                <w:szCs w:val="20"/>
+                <w:shd w:val="clear" w:color="auto" w:fill="FDFDFE"/>
+              </w:rPr>
+            </w:pPr>
+            <w:r>
+              <w:rPr>
+                <w:rFonts w:ascii="Arial" w:hAnsi="Arial" w:cs="Arial"/>
+                <w:color w:val="000000"/>
+                <w:sz w:val="20"/>
+                <w:szCs w:val="20"/>
+                <w:shd w:val="clear" w:color="auto" w:fill="FDFDFE"/>
+              </w:rPr>
+              <w:t>2,71,318.50</w:t>
             </w:r>
           </w:p>
         </w:tc>
@@ -7470,7 +7254,7 @@
         </w:trPr>
         <w:tc>
           <w:tcPr>
-            <w:tcW w:w="3386" w:type="dxa"/>
+            <w:tcW w:w="2263" w:type="dxa"/>
           </w:tcPr>
           <w:p>
             <w:pPr>
@@ -7493,7 +7277,7 @@
         </w:tc>
         <w:tc>
           <w:tcPr>
-            <w:tcW w:w="3789" w:type="dxa"/>
+            <w:tcW w:w="2183" w:type="dxa"/>
           </w:tcPr>
           <w:p>
             <w:pPr>
@@ -7517,48 +7301,28 @@
         </w:tc>
         <w:tc>
           <w:tcPr>
-            <w:tcW w:w="2636" w:type="dxa"/>
-          </w:tcPr>
-          <w:p>
-            <w:pPr>
-              <w:jc w:val="right"/>
-              <w:rPr>
-                <w:rFonts w:ascii="Arial" w:hAnsi="Arial" w:cs="Arial"/>
-                <w:color w:val="000000"/>
-                <w:sz w:val="20"/>
-                <w:szCs w:val="20"/>
-                <w:shd w:val="clear" w:color="auto" w:fill="FDFDFE"/>
-              </w:rPr>
-            </w:pPr>
-            <w:r>
-              <w:rPr>
-                <w:rFonts w:ascii="Arial" w:hAnsi="Arial" w:cs="Arial"/>
-                <w:color w:val="000000"/>
-                <w:sz w:val="20"/>
-                <w:szCs w:val="20"/>
-                <w:shd w:val="clear" w:color="auto" w:fill="FDFDFE"/>
-              </w:rPr>
-              <w:t>62</w:t>
-            </w:r>
-            <w:r>
-              <w:rPr>
-                <w:rFonts w:ascii="Arial" w:hAnsi="Arial" w:cs="Arial"/>
-                <w:color w:val="000000"/>
-                <w:sz w:val="20"/>
-                <w:szCs w:val="20"/>
-                <w:shd w:val="clear" w:color="auto" w:fill="FDFDFE"/>
-              </w:rPr>
-              <w:t>,</w:t>
-            </w:r>
-            <w:r>
-              <w:rPr>
-                <w:rFonts w:ascii="Arial" w:hAnsi="Arial" w:cs="Arial"/>
-                <w:color w:val="000000"/>
-                <w:sz w:val="20"/>
-                <w:szCs w:val="20"/>
-                <w:shd w:val="clear" w:color="auto" w:fill="FDFDFE"/>
-              </w:rPr>
-              <w:t>881.80</w:t>
+            <w:tcW w:w="5330" w:type="dxa"/>
+          </w:tcPr>
+          <w:p>
+            <w:pPr>
+              <w:jc w:val="right"/>
+              <w:rPr>
+                <w:rFonts w:ascii="Arial" w:hAnsi="Arial" w:cs="Arial"/>
+                <w:color w:val="000000"/>
+                <w:sz w:val="20"/>
+                <w:szCs w:val="20"/>
+                <w:shd w:val="clear" w:color="auto" w:fill="FDFDFE"/>
+              </w:rPr>
+            </w:pPr>
+            <w:r>
+              <w:rPr>
+                <w:rFonts w:ascii="Arial" w:hAnsi="Arial" w:cs="Arial"/>
+                <w:color w:val="000000"/>
+                <w:sz w:val="20"/>
+                <w:szCs w:val="20"/>
+                <w:shd w:val="clear" w:color="auto" w:fill="FDFDFE"/>
+              </w:rPr>
+              <w:t>62,881.80</w:t>
             </w:r>
           </w:p>
         </w:tc>
@@ -7569,7 +7333,7 @@
         </w:trPr>
         <w:tc>
           <w:tcPr>
-            <w:tcW w:w="3386" w:type="dxa"/>
+            <w:tcW w:w="2263" w:type="dxa"/>
           </w:tcPr>
           <w:p>
             <w:pPr>
@@ -7595,7 +7359,7 @@
         </w:tc>
         <w:tc>
           <w:tcPr>
-            <w:tcW w:w="3789" w:type="dxa"/>
+            <w:tcW w:w="2183" w:type="dxa"/>
           </w:tcPr>
           <w:p>
             <w:pPr>
@@ -7622,48 +7386,28 @@
         </w:tc>
         <w:tc>
           <w:tcPr>
-            <w:tcW w:w="2636" w:type="dxa"/>
-          </w:tcPr>
-          <w:p>
-            <w:pPr>
-              <w:jc w:val="right"/>
-              <w:rPr>
-                <w:rFonts w:ascii="Arial" w:hAnsi="Arial" w:cs="Arial"/>
-                <w:color w:val="000000"/>
-                <w:sz w:val="20"/>
-                <w:szCs w:val="20"/>
-                <w:shd w:val="clear" w:color="auto" w:fill="FDFDFE"/>
-              </w:rPr>
-            </w:pPr>
-            <w:r>
-              <w:rPr>
-                <w:rFonts w:ascii="Arial" w:hAnsi="Arial" w:cs="Arial"/>
-                <w:color w:val="000000"/>
-                <w:sz w:val="20"/>
-                <w:szCs w:val="20"/>
-                <w:shd w:val="clear" w:color="auto" w:fill="FDFDFE"/>
-              </w:rPr>
-              <w:t>73</w:t>
-            </w:r>
-            <w:r>
-              <w:rPr>
-                <w:rFonts w:ascii="Arial" w:hAnsi="Arial" w:cs="Arial"/>
-                <w:color w:val="000000"/>
-                <w:sz w:val="20"/>
-                <w:szCs w:val="20"/>
-                <w:shd w:val="clear" w:color="auto" w:fill="FDFDFE"/>
-              </w:rPr>
-              <w:t>,</w:t>
-            </w:r>
-            <w:r>
-              <w:rPr>
-                <w:rFonts w:ascii="Arial" w:hAnsi="Arial" w:cs="Arial"/>
-                <w:color w:val="000000"/>
-                <w:sz w:val="20"/>
-                <w:szCs w:val="20"/>
-                <w:shd w:val="clear" w:color="auto" w:fill="FDFDFE"/>
-              </w:rPr>
-              <w:t>655.20</w:t>
+            <w:tcW w:w="5330" w:type="dxa"/>
+          </w:tcPr>
+          <w:p>
+            <w:pPr>
+              <w:jc w:val="right"/>
+              <w:rPr>
+                <w:rFonts w:ascii="Arial" w:hAnsi="Arial" w:cs="Arial"/>
+                <w:color w:val="000000"/>
+                <w:sz w:val="20"/>
+                <w:szCs w:val="20"/>
+                <w:shd w:val="clear" w:color="auto" w:fill="FDFDFE"/>
+              </w:rPr>
+            </w:pPr>
+            <w:r>
+              <w:rPr>
+                <w:rFonts w:ascii="Arial" w:hAnsi="Arial" w:cs="Arial"/>
+                <w:color w:val="000000"/>
+                <w:sz w:val="20"/>
+                <w:szCs w:val="20"/>
+                <w:shd w:val="clear" w:color="auto" w:fill="FDFDFE"/>
+              </w:rPr>
+              <w:t>73,655.20</w:t>
             </w:r>
           </w:p>
         </w:tc>
@@ -7674,7 +7418,7 @@
         </w:trPr>
         <w:tc>
           <w:tcPr>
-            <w:tcW w:w="3386" w:type="dxa"/>
+            <w:tcW w:w="2263" w:type="dxa"/>
           </w:tcPr>
           <w:p>
             <w:pPr>
@@ -7700,7 +7444,7 @@
         </w:tc>
         <w:tc>
           <w:tcPr>
-            <w:tcW w:w="3789" w:type="dxa"/>
+            <w:tcW w:w="2183" w:type="dxa"/>
           </w:tcPr>
           <w:p>
             <w:pPr>
@@ -7727,48 +7471,28 @@
         </w:tc>
         <w:tc>
           <w:tcPr>
-            <w:tcW w:w="2636" w:type="dxa"/>
-          </w:tcPr>
-          <w:p>
-            <w:pPr>
-              <w:jc w:val="right"/>
-              <w:rPr>
-                <w:rFonts w:ascii="Arial" w:hAnsi="Arial" w:cs="Arial"/>
-                <w:color w:val="000000"/>
-                <w:sz w:val="20"/>
-                <w:szCs w:val="20"/>
-                <w:shd w:val="clear" w:color="auto" w:fill="FDFDFE"/>
-              </w:rPr>
-            </w:pPr>
-            <w:r>
-              <w:rPr>
-                <w:rFonts w:ascii="Arial" w:hAnsi="Arial" w:cs="Arial"/>
-                <w:color w:val="000000"/>
-                <w:sz w:val="20"/>
-                <w:szCs w:val="20"/>
-                <w:shd w:val="clear" w:color="auto" w:fill="FDFDFE"/>
-              </w:rPr>
-              <w:t>79</w:t>
-            </w:r>
-            <w:r>
-              <w:rPr>
-                <w:rFonts w:ascii="Arial" w:hAnsi="Arial" w:cs="Arial"/>
-                <w:color w:val="000000"/>
-                <w:sz w:val="20"/>
-                <w:szCs w:val="20"/>
-                <w:shd w:val="clear" w:color="auto" w:fill="FDFDFE"/>
-              </w:rPr>
-              <w:t>,</w:t>
-            </w:r>
-            <w:r>
-              <w:rPr>
-                <w:rFonts w:ascii="Arial" w:hAnsi="Arial" w:cs="Arial"/>
-                <w:color w:val="000000"/>
-                <w:sz w:val="20"/>
-                <w:szCs w:val="20"/>
-                <w:shd w:val="clear" w:color="auto" w:fill="FDFDFE"/>
-              </w:rPr>
-              <w:t>441.10</w:t>
+            <w:tcW w:w="5330" w:type="dxa"/>
+          </w:tcPr>
+          <w:p>
+            <w:pPr>
+              <w:jc w:val="right"/>
+              <w:rPr>
+                <w:rFonts w:ascii="Arial" w:hAnsi="Arial" w:cs="Arial"/>
+                <w:color w:val="000000"/>
+                <w:sz w:val="20"/>
+                <w:szCs w:val="20"/>
+                <w:shd w:val="clear" w:color="auto" w:fill="FDFDFE"/>
+              </w:rPr>
+            </w:pPr>
+            <w:r>
+              <w:rPr>
+                <w:rFonts w:ascii="Arial" w:hAnsi="Arial" w:cs="Arial"/>
+                <w:color w:val="000000"/>
+                <w:sz w:val="20"/>
+                <w:szCs w:val="20"/>
+                <w:shd w:val="clear" w:color="auto" w:fill="FDFDFE"/>
+              </w:rPr>
+              <w:t>79,441.10</w:t>
             </w:r>
           </w:p>
         </w:tc>
@@ -7779,33 +7503,34 @@
         </w:trPr>
         <w:tc>
           <w:tcPr>
-            <w:tcW w:w="3386" w:type="dxa"/>
-          </w:tcPr>
-          <w:p>
-            <w:pPr>
-              <w:rPr>
-                <w:rFonts w:ascii="Arial" w:hAnsi="Arial" w:cs="Arial"/>
-                <w:color w:val="000000"/>
-                <w:sz w:val="20"/>
-                <w:szCs w:val="20"/>
-                <w:shd w:val="clear" w:color="auto" w:fill="FDFDFE"/>
-              </w:rPr>
-            </w:pPr>
-            <w:r>
-              <w:rPr>
-                <w:rFonts w:ascii="Arial" w:hAnsi="Arial" w:cs="Arial"/>
-                <w:color w:val="000000"/>
-                <w:sz w:val="20"/>
-                <w:szCs w:val="20"/>
-                <w:shd w:val="clear" w:color="auto" w:fill="FDFDFE"/>
-              </w:rPr>
+            <w:tcW w:w="2263" w:type="dxa"/>
+          </w:tcPr>
+          <w:p>
+            <w:pPr>
+              <w:rPr>
+                <w:rFonts w:ascii="Arial" w:hAnsi="Arial" w:cs="Arial"/>
+                <w:color w:val="000000"/>
+                <w:sz w:val="20"/>
+                <w:szCs w:val="20"/>
+                <w:shd w:val="clear" w:color="auto" w:fill="FDFDFE"/>
+              </w:rPr>
+            </w:pPr>
+            <w:r>
+              <w:rPr>
+                <w:rFonts w:ascii="Arial" w:hAnsi="Arial" w:cs="Arial"/>
+                <w:color w:val="000000"/>
+                <w:sz w:val="20"/>
+                <w:szCs w:val="20"/>
+                <w:shd w:val="clear" w:color="auto" w:fill="FDFDFE"/>
+              </w:rPr>
+              <w:lastRenderedPageBreak/>
               <w:t>MONSOON12</w:t>
             </w:r>
           </w:p>
         </w:tc>
         <w:tc>
           <w:tcPr>
-            <w:tcW w:w="3789" w:type="dxa"/>
+            <w:tcW w:w="2183" w:type="dxa"/>
           </w:tcPr>
           <w:p>
             <w:pPr>
@@ -7832,48 +7557,28 @@
         </w:tc>
         <w:tc>
           <w:tcPr>
-            <w:tcW w:w="2636" w:type="dxa"/>
-          </w:tcPr>
-          <w:p>
-            <w:pPr>
-              <w:jc w:val="right"/>
-              <w:rPr>
-                <w:rFonts w:ascii="Arial" w:hAnsi="Arial" w:cs="Arial"/>
-                <w:color w:val="000000"/>
-                <w:sz w:val="20"/>
-                <w:szCs w:val="20"/>
-                <w:shd w:val="clear" w:color="auto" w:fill="FDFDFE"/>
-              </w:rPr>
-            </w:pPr>
-            <w:r>
-              <w:rPr>
-                <w:rFonts w:ascii="Arial" w:hAnsi="Arial" w:cs="Arial"/>
-                <w:color w:val="000000"/>
-                <w:sz w:val="20"/>
-                <w:szCs w:val="20"/>
-                <w:shd w:val="clear" w:color="auto" w:fill="FDFDFE"/>
-              </w:rPr>
-              <w:t>42</w:t>
-            </w:r>
-            <w:r>
-              <w:rPr>
-                <w:rFonts w:ascii="Arial" w:hAnsi="Arial" w:cs="Arial"/>
-                <w:color w:val="000000"/>
-                <w:sz w:val="20"/>
-                <w:szCs w:val="20"/>
-                <w:shd w:val="clear" w:color="auto" w:fill="FDFDFE"/>
-              </w:rPr>
-              <w:t>,</w:t>
-            </w:r>
-            <w:r>
-              <w:rPr>
-                <w:rFonts w:ascii="Arial" w:hAnsi="Arial" w:cs="Arial"/>
-                <w:color w:val="000000"/>
-                <w:sz w:val="20"/>
-                <w:szCs w:val="20"/>
-                <w:shd w:val="clear" w:color="auto" w:fill="FDFDFE"/>
-              </w:rPr>
-              <w:t>888.05</w:t>
+            <w:tcW w:w="5330" w:type="dxa"/>
+          </w:tcPr>
+          <w:p>
+            <w:pPr>
+              <w:jc w:val="right"/>
+              <w:rPr>
+                <w:rFonts w:ascii="Arial" w:hAnsi="Arial" w:cs="Arial"/>
+                <w:color w:val="000000"/>
+                <w:sz w:val="20"/>
+                <w:szCs w:val="20"/>
+                <w:shd w:val="clear" w:color="auto" w:fill="FDFDFE"/>
+              </w:rPr>
+            </w:pPr>
+            <w:r>
+              <w:rPr>
+                <w:rFonts w:ascii="Arial" w:hAnsi="Arial" w:cs="Arial"/>
+                <w:color w:val="000000"/>
+                <w:sz w:val="20"/>
+                <w:szCs w:val="20"/>
+                <w:shd w:val="clear" w:color="auto" w:fill="FDFDFE"/>
+              </w:rPr>
+              <w:t>42,888.05</w:t>
             </w:r>
           </w:p>
         </w:tc>
@@ -7884,7 +7589,7 @@
         </w:trPr>
         <w:tc>
           <w:tcPr>
-            <w:tcW w:w="3386" w:type="dxa"/>
+            <w:tcW w:w="2263" w:type="dxa"/>
           </w:tcPr>
           <w:p>
             <w:pPr>
@@ -7910,7 +7615,7 @@
         </w:tc>
         <w:tc>
           <w:tcPr>
-            <w:tcW w:w="3789" w:type="dxa"/>
+            <w:tcW w:w="2183" w:type="dxa"/>
           </w:tcPr>
           <w:p>
             <w:pPr>
@@ -7937,48 +7642,28 @@
         </w:tc>
         <w:tc>
           <w:tcPr>
-            <w:tcW w:w="2636" w:type="dxa"/>
-          </w:tcPr>
-          <w:p>
-            <w:pPr>
-              <w:jc w:val="right"/>
-              <w:rPr>
-                <w:rFonts w:ascii="Arial" w:hAnsi="Arial" w:cs="Arial"/>
-                <w:color w:val="000000"/>
-                <w:sz w:val="20"/>
-                <w:szCs w:val="20"/>
-                <w:shd w:val="clear" w:color="auto" w:fill="FDFDFE"/>
-              </w:rPr>
-            </w:pPr>
-            <w:r>
-              <w:rPr>
-                <w:rFonts w:ascii="Arial" w:hAnsi="Arial" w:cs="Arial"/>
-                <w:color w:val="000000"/>
-                <w:sz w:val="20"/>
-                <w:szCs w:val="20"/>
-                <w:shd w:val="clear" w:color="auto" w:fill="FDFDFE"/>
-              </w:rPr>
-              <w:t>30</w:t>
-            </w:r>
-            <w:r>
-              <w:rPr>
-                <w:rFonts w:ascii="Arial" w:hAnsi="Arial" w:cs="Arial"/>
-                <w:color w:val="000000"/>
-                <w:sz w:val="20"/>
-                <w:szCs w:val="20"/>
-                <w:shd w:val="clear" w:color="auto" w:fill="FDFDFE"/>
-              </w:rPr>
-              <w:t>,</w:t>
-            </w:r>
-            <w:r>
-              <w:rPr>
-                <w:rFonts w:ascii="Arial" w:hAnsi="Arial" w:cs="Arial"/>
-                <w:color w:val="000000"/>
-                <w:sz w:val="20"/>
-                <w:szCs w:val="20"/>
-                <w:shd w:val="clear" w:color="auto" w:fill="FDFDFE"/>
-              </w:rPr>
-              <w:t>120.15</w:t>
+            <w:tcW w:w="5330" w:type="dxa"/>
+          </w:tcPr>
+          <w:p>
+            <w:pPr>
+              <w:jc w:val="right"/>
+              <w:rPr>
+                <w:rFonts w:ascii="Arial" w:hAnsi="Arial" w:cs="Arial"/>
+                <w:color w:val="000000"/>
+                <w:sz w:val="20"/>
+                <w:szCs w:val="20"/>
+                <w:shd w:val="clear" w:color="auto" w:fill="FDFDFE"/>
+              </w:rPr>
+            </w:pPr>
+            <w:r>
+              <w:rPr>
+                <w:rFonts w:ascii="Arial" w:hAnsi="Arial" w:cs="Arial"/>
+                <w:color w:val="000000"/>
+                <w:sz w:val="20"/>
+                <w:szCs w:val="20"/>
+                <w:shd w:val="clear" w:color="auto" w:fill="FDFDFE"/>
+              </w:rPr>
+              <w:t>30,120.15</w:t>
             </w:r>
           </w:p>
         </w:tc>
@@ -7989,7 +7674,7 @@
         </w:trPr>
         <w:tc>
           <w:tcPr>
-            <w:tcW w:w="3386" w:type="dxa"/>
+            <w:tcW w:w="2263" w:type="dxa"/>
           </w:tcPr>
           <w:p>
             <w:pPr>
@@ -8015,7 +7700,7 @@
         </w:tc>
         <w:tc>
           <w:tcPr>
-            <w:tcW w:w="3789" w:type="dxa"/>
+            <w:tcW w:w="2183" w:type="dxa"/>
           </w:tcPr>
           <w:p>
             <w:pPr>
@@ -8042,48 +7727,28 @@
         </w:tc>
         <w:tc>
           <w:tcPr>
-            <w:tcW w:w="2636" w:type="dxa"/>
-          </w:tcPr>
-          <w:p>
-            <w:pPr>
-              <w:jc w:val="right"/>
-              <w:rPr>
-                <w:rFonts w:ascii="Arial" w:hAnsi="Arial" w:cs="Arial"/>
-                <w:color w:val="000000"/>
-                <w:sz w:val="20"/>
-                <w:szCs w:val="20"/>
-                <w:shd w:val="clear" w:color="auto" w:fill="FDFDFE"/>
-              </w:rPr>
-            </w:pPr>
-            <w:r>
-              <w:rPr>
-                <w:rFonts w:ascii="Arial" w:hAnsi="Arial" w:cs="Arial"/>
-                <w:color w:val="000000"/>
-                <w:sz w:val="20"/>
-                <w:szCs w:val="20"/>
-                <w:shd w:val="clear" w:color="auto" w:fill="FDFDFE"/>
-              </w:rPr>
-              <w:t>34</w:t>
-            </w:r>
-            <w:r>
-              <w:rPr>
-                <w:rFonts w:ascii="Arial" w:hAnsi="Arial" w:cs="Arial"/>
-                <w:color w:val="000000"/>
-                <w:sz w:val="20"/>
-                <w:szCs w:val="20"/>
-                <w:shd w:val="clear" w:color="auto" w:fill="FDFDFE"/>
-              </w:rPr>
-              <w:t>,</w:t>
-            </w:r>
-            <w:r>
-              <w:rPr>
-                <w:rFonts w:ascii="Arial" w:hAnsi="Arial" w:cs="Arial"/>
-                <w:color w:val="000000"/>
-                <w:sz w:val="20"/>
-                <w:szCs w:val="20"/>
-                <w:shd w:val="clear" w:color="auto" w:fill="FDFDFE"/>
-              </w:rPr>
-              <w:t>827.25</w:t>
+            <w:tcW w:w="5330" w:type="dxa"/>
+          </w:tcPr>
+          <w:p>
+            <w:pPr>
+              <w:jc w:val="right"/>
+              <w:rPr>
+                <w:rFonts w:ascii="Arial" w:hAnsi="Arial" w:cs="Arial"/>
+                <w:color w:val="000000"/>
+                <w:sz w:val="20"/>
+                <w:szCs w:val="20"/>
+                <w:shd w:val="clear" w:color="auto" w:fill="FDFDFE"/>
+              </w:rPr>
+            </w:pPr>
+            <w:r>
+              <w:rPr>
+                <w:rFonts w:ascii="Arial" w:hAnsi="Arial" w:cs="Arial"/>
+                <w:color w:val="000000"/>
+                <w:sz w:val="20"/>
+                <w:szCs w:val="20"/>
+                <w:shd w:val="clear" w:color="auto" w:fill="FDFDFE"/>
+              </w:rPr>
+              <w:t>34,827.25</w:t>
             </w:r>
           </w:p>
         </w:tc>
@@ -8094,7 +7759,7 @@
         </w:trPr>
         <w:tc>
           <w:tcPr>
-            <w:tcW w:w="3386" w:type="dxa"/>
+            <w:tcW w:w="2263" w:type="dxa"/>
           </w:tcPr>
           <w:p>
             <w:pPr>
@@ -8120,7 +7785,7 @@
         </w:tc>
         <w:tc>
           <w:tcPr>
-            <w:tcW w:w="3789" w:type="dxa"/>
+            <w:tcW w:w="2183" w:type="dxa"/>
           </w:tcPr>
           <w:p>
             <w:pPr>
@@ -8147,53 +7812,43 @@
         </w:tc>
         <w:tc>
           <w:tcPr>
-            <w:tcW w:w="2636" w:type="dxa"/>
-          </w:tcPr>
-          <w:p>
-            <w:pPr>
-              <w:jc w:val="right"/>
-              <w:rPr>
-                <w:rFonts w:ascii="Arial" w:hAnsi="Arial" w:cs="Arial"/>
-                <w:color w:val="000000"/>
-                <w:sz w:val="20"/>
-                <w:szCs w:val="20"/>
-                <w:shd w:val="clear" w:color="auto" w:fill="FDFDFE"/>
-              </w:rPr>
-            </w:pPr>
-            <w:r>
-              <w:rPr>
-                <w:rFonts w:ascii="Arial" w:hAnsi="Arial" w:cs="Arial"/>
-                <w:color w:val="000000"/>
-                <w:sz w:val="20"/>
-                <w:szCs w:val="20"/>
-                <w:shd w:val="clear" w:color="auto" w:fill="FDFDFE"/>
-              </w:rPr>
-              <w:t>17</w:t>
-            </w:r>
-            <w:r>
-              <w:rPr>
-                <w:rFonts w:ascii="Arial" w:hAnsi="Arial" w:cs="Arial"/>
-                <w:color w:val="000000"/>
-                <w:sz w:val="20"/>
-                <w:szCs w:val="20"/>
-                <w:shd w:val="clear" w:color="auto" w:fill="FDFDFE"/>
-              </w:rPr>
-              <w:t>,</w:t>
-            </w:r>
-            <w:r>
-              <w:rPr>
-                <w:rFonts w:ascii="Arial" w:hAnsi="Arial" w:cs="Arial"/>
-                <w:color w:val="000000"/>
-                <w:sz w:val="20"/>
-                <w:szCs w:val="20"/>
-                <w:shd w:val="clear" w:color="auto" w:fill="FDFDFE"/>
-              </w:rPr>
-              <w:t>096.70</w:t>
+            <w:tcW w:w="5330" w:type="dxa"/>
+          </w:tcPr>
+          <w:p>
+            <w:pPr>
+              <w:jc w:val="right"/>
+              <w:rPr>
+                <w:rFonts w:ascii="Arial" w:hAnsi="Arial" w:cs="Arial"/>
+                <w:color w:val="000000"/>
+                <w:sz w:val="20"/>
+                <w:szCs w:val="20"/>
+                <w:shd w:val="clear" w:color="auto" w:fill="FDFDFE"/>
+              </w:rPr>
+            </w:pPr>
+            <w:r>
+              <w:rPr>
+                <w:rFonts w:ascii="Arial" w:hAnsi="Arial" w:cs="Arial"/>
+                <w:color w:val="000000"/>
+                <w:sz w:val="20"/>
+                <w:szCs w:val="20"/>
+                <w:shd w:val="clear" w:color="auto" w:fill="FDFDFE"/>
+              </w:rPr>
+              <w:t>17,096.70</w:t>
             </w:r>
           </w:p>
         </w:tc>
       </w:tr>
     </w:tbl>
+    <w:p>
+      <w:pPr>
+        <w:pStyle w:val="ListParagraph"/>
+        <w:ind w:left="1080"/>
+        <w:rPr>
+          <w:sz w:val="24"/>
+          <w:szCs w:val="24"/>
+        </w:rPr>
+      </w:pPr>
+    </w:p>
     <w:p>
       <w:pPr>
         <w:pStyle w:val="ListParagraph"/>
@@ -8261,7 +7916,6 @@
                 <w:sz w:val="24"/>
                 <w:szCs w:val="24"/>
               </w:rPr>
-              <w:lastRenderedPageBreak/>
               <w:t xml:space="preserve">CAMPAIGN </w:t>
             </w:r>
             <w:r>
@@ -8576,174 +8230,6 @@
                 <w:shd w:val="clear" w:color="auto" w:fill="FDFDFE"/>
               </w:rPr>
               <w:t>311.55</w:t>
-            </w:r>
-          </w:p>
-        </w:tc>
-      </w:tr>
-      <w:tr>
-        <w:trPr>
-          <w:trHeight w:val="485"/>
-        </w:trPr>
-        <w:tc>
-          <w:tcPr>
-            <w:tcW w:w="2256" w:type="dxa"/>
-          </w:tcPr>
-          <w:p>
-            <w:pPr>
-              <w:jc w:val="center"/>
-              <w:rPr>
-                <w:b/>
-                <w:sz w:val="24"/>
-                <w:szCs w:val="24"/>
-              </w:rPr>
-            </w:pPr>
-            <w:r>
-              <w:rPr>
-                <w:b/>
-                <w:sz w:val="24"/>
-                <w:szCs w:val="24"/>
-              </w:rPr>
-              <w:t xml:space="preserve">CAMPAIGN </w:t>
-            </w:r>
-            <w:r>
-              <w:rPr>
-                <w:b/>
-                <w:sz w:val="24"/>
-                <w:szCs w:val="24"/>
-              </w:rPr>
-              <w:t>TYPE</w:t>
-            </w:r>
-          </w:p>
-        </w:tc>
-        <w:tc>
-          <w:tcPr>
-            <w:tcW w:w="2139" w:type="dxa"/>
-          </w:tcPr>
-          <w:p>
-            <w:pPr>
-              <w:jc w:val="center"/>
-              <w:rPr>
-                <w:b/>
-                <w:sz w:val="24"/>
-                <w:szCs w:val="24"/>
-              </w:rPr>
-            </w:pPr>
-            <w:r>
-              <w:rPr>
-                <w:b/>
-                <w:sz w:val="24"/>
-                <w:szCs w:val="24"/>
-              </w:rPr>
-              <w:t>TOTAL ORDERS</w:t>
-            </w:r>
-          </w:p>
-        </w:tc>
-        <w:tc>
-          <w:tcPr>
-            <w:tcW w:w="1688" w:type="dxa"/>
-          </w:tcPr>
-          <w:p>
-            <w:pPr>
-              <w:jc w:val="center"/>
-              <w:rPr>
-                <w:b/>
-                <w:sz w:val="24"/>
-                <w:szCs w:val="24"/>
-              </w:rPr>
-            </w:pPr>
-            <w:r>
-              <w:rPr>
-                <w:b/>
-                <w:sz w:val="24"/>
-                <w:szCs w:val="24"/>
-              </w:rPr>
-              <w:t>TOTAL CUSTOMERS</w:t>
-            </w:r>
-          </w:p>
-        </w:tc>
-        <w:tc>
-          <w:tcPr>
-            <w:tcW w:w="1832" w:type="dxa"/>
-          </w:tcPr>
-          <w:p>
-            <w:pPr>
-              <w:jc w:val="center"/>
-              <w:rPr>
-                <w:b/>
-                <w:sz w:val="24"/>
-                <w:szCs w:val="24"/>
-              </w:rPr>
-            </w:pPr>
-            <w:r>
-              <w:rPr>
-                <w:b/>
-                <w:sz w:val="24"/>
-                <w:szCs w:val="24"/>
-              </w:rPr>
-              <w:t>TOTAL</w:t>
-            </w:r>
-            <w:r>
-              <w:rPr>
-                <w:b/>
-                <w:sz w:val="24"/>
-                <w:szCs w:val="24"/>
-              </w:rPr>
-              <w:t xml:space="preserve"> SALES</w:t>
-            </w:r>
-            <w:r>
-              <w:rPr>
-                <w:b/>
-                <w:sz w:val="24"/>
-                <w:szCs w:val="24"/>
-              </w:rPr>
-              <w:t xml:space="preserve"> REVENUE</w:t>
-            </w:r>
-          </w:p>
-        </w:tc>
-        <w:tc>
-          <w:tcPr>
-            <w:tcW w:w="1825" w:type="dxa"/>
-          </w:tcPr>
-          <w:p>
-            <w:pPr>
-              <w:jc w:val="center"/>
-              <w:rPr>
-                <w:b/>
-                <w:sz w:val="24"/>
-                <w:szCs w:val="24"/>
-              </w:rPr>
-            </w:pPr>
-            <w:r>
-              <w:rPr>
-                <w:b/>
-                <w:sz w:val="24"/>
-                <w:szCs w:val="24"/>
-              </w:rPr>
-              <w:t xml:space="preserve">AVG </w:t>
-            </w:r>
-            <w:r>
-              <w:rPr>
-                <w:b/>
-                <w:sz w:val="24"/>
-                <w:szCs w:val="24"/>
-              </w:rPr>
-              <w:t>ORDER</w:t>
-            </w:r>
-            <w:r>
-              <w:rPr>
-                <w:b/>
-                <w:sz w:val="24"/>
-                <w:szCs w:val="24"/>
-              </w:rPr>
-              <w:t xml:space="preserve"> </w:t>
-            </w:r>
-            <w:r>
-              <w:rPr>
-                <w:b/>
-                <w:sz w:val="24"/>
-                <w:szCs w:val="24"/>
-              </w:rPr>
-              <w:t>VALUE</w:t>
             </w:r>
           </w:p>
         </w:tc>
@@ -11012,6 +10498,46 @@
     <w:p>
       <w:pPr>
         <w:pStyle w:val="ListParagraph"/>
+        <w:ind w:left="1080"/>
+        <w:rPr>
+          <w:sz w:val="24"/>
+          <w:szCs w:val="24"/>
+        </w:rPr>
+      </w:pPr>
+    </w:p>
+    <w:p>
+      <w:pPr>
+        <w:pStyle w:val="ListParagraph"/>
+        <w:ind w:left="1080"/>
+        <w:rPr>
+          <w:sz w:val="24"/>
+          <w:szCs w:val="24"/>
+        </w:rPr>
+      </w:pPr>
+    </w:p>
+    <w:p>
+      <w:pPr>
+        <w:pStyle w:val="ListParagraph"/>
+        <w:ind w:left="1080"/>
+        <w:rPr>
+          <w:sz w:val="24"/>
+          <w:szCs w:val="24"/>
+        </w:rPr>
+      </w:pPr>
+    </w:p>
+    <w:p>
+      <w:pPr>
+        <w:pStyle w:val="ListParagraph"/>
+        <w:ind w:left="1080"/>
+        <w:rPr>
+          <w:sz w:val="24"/>
+          <w:szCs w:val="24"/>
+        </w:rPr>
+      </w:pPr>
+    </w:p>
+    <w:p>
+      <w:pPr>
+        <w:pStyle w:val="ListParagraph"/>
         <w:numPr>
           <w:ilvl w:val="0"/>
           <w:numId w:val="3"/>
@@ -11497,7 +11023,6 @@
                 <w:szCs w:val="20"/>
                 <w:shd w:val="clear" w:color="auto" w:fill="FDFDFE"/>
               </w:rPr>
-              <w:lastRenderedPageBreak/>
               <w:t>104308</w:t>
             </w:r>
           </w:p>
@@ -11975,172 +11500,6 @@
                 <w:shd w:val="clear" w:color="auto" w:fill="FDFDFE"/>
               </w:rPr>
               <w:t>38.53</w:t>
-            </w:r>
-          </w:p>
-        </w:tc>
-      </w:tr>
-      <w:tr>
-        <w:trPr>
-          <w:trHeight w:val="629"/>
-        </w:trPr>
-        <w:tc>
-          <w:tcPr>
-            <w:tcW w:w="1343" w:type="dxa"/>
-          </w:tcPr>
-          <w:p>
-            <w:pPr>
-              <w:jc w:val="center"/>
-              <w:rPr>
-                <w:b/>
-                <w:sz w:val="24"/>
-                <w:szCs w:val="24"/>
-              </w:rPr>
-            </w:pPr>
-            <w:r>
-              <w:rPr>
-                <w:b/>
-                <w:sz w:val="24"/>
-                <w:szCs w:val="24"/>
-              </w:rPr>
-              <w:t>ORDER ID</w:t>
-            </w:r>
-          </w:p>
-        </w:tc>
-        <w:tc>
-          <w:tcPr>
-            <w:tcW w:w="1538" w:type="dxa"/>
-          </w:tcPr>
-          <w:p>
-            <w:pPr>
-              <w:jc w:val="center"/>
-              <w:rPr>
-                <w:b/>
-                <w:sz w:val="24"/>
-                <w:szCs w:val="24"/>
-              </w:rPr>
-            </w:pPr>
-            <w:r>
-              <w:rPr>
-                <w:b/>
-                <w:sz w:val="24"/>
-                <w:szCs w:val="24"/>
-              </w:rPr>
-              <w:t>CUSTOMER NAME</w:t>
-            </w:r>
-          </w:p>
-        </w:tc>
-        <w:tc>
-          <w:tcPr>
-            <w:tcW w:w="1584" w:type="dxa"/>
-          </w:tcPr>
-          <w:p>
-            <w:pPr>
-              <w:jc w:val="center"/>
-              <w:rPr>
-                <w:b/>
-                <w:sz w:val="24"/>
-                <w:szCs w:val="24"/>
-              </w:rPr>
-            </w:pPr>
-            <w:r>
-              <w:rPr>
-                <w:b/>
-                <w:sz w:val="24"/>
-                <w:szCs w:val="24"/>
-              </w:rPr>
-              <w:t>COUPON CODE</w:t>
-            </w:r>
-          </w:p>
-        </w:tc>
-        <w:tc>
-          <w:tcPr>
-            <w:tcW w:w="1377" w:type="dxa"/>
-          </w:tcPr>
-          <w:p>
-            <w:pPr>
-              <w:jc w:val="center"/>
-              <w:rPr>
-                <w:b/>
-                <w:sz w:val="24"/>
-                <w:szCs w:val="24"/>
-              </w:rPr>
-            </w:pPr>
-            <w:r>
-              <w:rPr>
-                <w:b/>
-                <w:sz w:val="24"/>
-                <w:szCs w:val="24"/>
-              </w:rPr>
-              <w:t>GROSS MRP VALUE</w:t>
-            </w:r>
-          </w:p>
-        </w:tc>
-        <w:tc>
-          <w:tcPr>
-            <w:tcW w:w="1239" w:type="dxa"/>
-          </w:tcPr>
-          <w:p>
-            <w:pPr>
-              <w:jc w:val="center"/>
-              <w:rPr>
-                <w:b/>
-                <w:sz w:val="24"/>
-                <w:szCs w:val="24"/>
-              </w:rPr>
-            </w:pPr>
-            <w:r>
-              <w:rPr>
-                <w:b/>
-                <w:sz w:val="24"/>
-                <w:szCs w:val="24"/>
-              </w:rPr>
-              <w:t>NET SELLING VALUE</w:t>
-            </w:r>
-          </w:p>
-        </w:tc>
-        <w:tc>
-          <w:tcPr>
-            <w:tcW w:w="1268" w:type="dxa"/>
-          </w:tcPr>
-          <w:p>
-            <w:pPr>
-              <w:jc w:val="center"/>
-              <w:rPr>
-                <w:b/>
-                <w:sz w:val="24"/>
-                <w:szCs w:val="24"/>
-              </w:rPr>
-            </w:pPr>
-            <w:r>
-              <w:rPr>
-                <w:b/>
-                <w:sz w:val="24"/>
-                <w:szCs w:val="24"/>
-              </w:rPr>
-              <w:t>TOTAL DISCOUNT AMOUNT</w:t>
-            </w:r>
-          </w:p>
-        </w:tc>
-        <w:tc>
-          <w:tcPr>
-            <w:tcW w:w="1387" w:type="dxa"/>
-          </w:tcPr>
-          <w:p>
-            <w:pPr>
-              <w:jc w:val="center"/>
-              <w:rPr>
-                <w:b/>
-                <w:sz w:val="24"/>
-                <w:szCs w:val="24"/>
-              </w:rPr>
-            </w:pPr>
-            <w:r>
-              <w:rPr>
-                <w:b/>
-                <w:sz w:val="24"/>
-                <w:szCs w:val="24"/>
-              </w:rPr>
-              <w:t>DISCOUNT PERCENTGE</w:t>
             </w:r>
           </w:p>
         </w:tc>
@@ -15167,6 +14526,7 @@
                 <w:szCs w:val="20"/>
                 <w:shd w:val="clear" w:color="auto" w:fill="FDFDFE"/>
               </w:rPr>
+              <w:lastRenderedPageBreak/>
               <w:t>100003</w:t>
             </w:r>
           </w:p>
@@ -15665,7 +15025,6 @@
                 <w:szCs w:val="20"/>
                 <w:shd w:val="clear" w:color="auto" w:fill="FDFDFE"/>
               </w:rPr>
-              <w:lastRenderedPageBreak/>
               <w:t>100003</w:t>
             </w:r>
           </w:p>
@@ -16358,22 +15717,12 @@
             <w:r>
               <w:rPr>
                 <w:rFonts w:ascii="Arial" w:hAnsi="Arial" w:cs="Arial"/>
-                <w:color w:val="444444"/>
-                <w:sz w:val="20"/>
-                <w:szCs w:val="20"/>
-                <w:shd w:val="clear" w:color="auto" w:fill="DFDFDF"/>
-              </w:rPr>
-              <w:t>305.0</w:t>
-            </w:r>
-            <w:r>
-              <w:rPr>
-                <w:rFonts w:ascii="Arial" w:hAnsi="Arial" w:cs="Arial"/>
-                <w:color w:val="444444"/>
-                <w:sz w:val="20"/>
-                <w:szCs w:val="20"/>
-                <w:shd w:val="clear" w:color="auto" w:fill="DFDFDF"/>
-              </w:rPr>
-              <w:t>0</w:t>
+                <w:color w:val="000000"/>
+                <w:sz w:val="20"/>
+                <w:szCs w:val="20"/>
+                <w:shd w:val="clear" w:color="auto" w:fill="FDFDFE"/>
+              </w:rPr>
+              <w:t>305.00</w:t>
             </w:r>
           </w:p>
         </w:tc>
@@ -16971,22 +16320,12 @@
             <w:r>
               <w:rPr>
                 <w:rFonts w:ascii="Arial" w:hAnsi="Arial" w:cs="Arial"/>
-                <w:color w:val="444444"/>
-                <w:sz w:val="20"/>
-                <w:szCs w:val="20"/>
-                <w:shd w:val="clear" w:color="auto" w:fill="DFDFDF"/>
-              </w:rPr>
-              <w:t>305.0</w:t>
-            </w:r>
-            <w:r>
-              <w:rPr>
-                <w:rFonts w:ascii="Arial" w:hAnsi="Arial" w:cs="Arial"/>
-                <w:color w:val="444444"/>
-                <w:sz w:val="20"/>
-                <w:szCs w:val="20"/>
-                <w:shd w:val="clear" w:color="auto" w:fill="DFDFDF"/>
-              </w:rPr>
-              <w:t>0</w:t>
+                <w:color w:val="000000"/>
+                <w:sz w:val="20"/>
+                <w:szCs w:val="20"/>
+                <w:shd w:val="clear" w:color="auto" w:fill="FDFDFE"/>
+              </w:rPr>
+              <w:t>305.00</w:t>
             </w:r>
           </w:p>
         </w:tc>
@@ -18115,6 +17454,51 @@
     <w:p>
       <w:pPr>
         <w:pStyle w:val="ListParagraph"/>
+        <w:rPr>
+          <w:sz w:val="24"/>
+          <w:szCs w:val="24"/>
+        </w:rPr>
+      </w:pPr>
+    </w:p>
+    <w:p>
+      <w:pPr>
+        <w:pStyle w:val="ListParagraph"/>
+        <w:rPr>
+          <w:sz w:val="24"/>
+          <w:szCs w:val="24"/>
+        </w:rPr>
+      </w:pPr>
+    </w:p>
+    <w:p>
+      <w:pPr>
+        <w:pStyle w:val="ListParagraph"/>
+        <w:rPr>
+          <w:sz w:val="24"/>
+          <w:szCs w:val="24"/>
+        </w:rPr>
+      </w:pPr>
+    </w:p>
+    <w:p>
+      <w:pPr>
+        <w:pStyle w:val="ListParagraph"/>
+        <w:rPr>
+          <w:sz w:val="24"/>
+          <w:szCs w:val="24"/>
+        </w:rPr>
+      </w:pPr>
+    </w:p>
+    <w:p>
+      <w:pPr>
+        <w:pStyle w:val="ListParagraph"/>
+        <w:rPr>
+          <w:sz w:val="24"/>
+          <w:szCs w:val="24"/>
+        </w:rPr>
+      </w:pPr>
+    </w:p>
+    <w:p>
+      <w:pPr>
+        <w:pStyle w:val="ListParagraph"/>
         <w:numPr>
           <w:ilvl w:val="0"/>
           <w:numId w:val="7"/>
@@ -18644,7 +18028,6 @@
                 <w:szCs w:val="20"/>
                 <w:shd w:val="clear" w:color="auto" w:fill="FDFDFE"/>
               </w:rPr>
-              <w:lastRenderedPageBreak/>
               <w:t>104757</w:t>
             </w:r>
           </w:p>
@@ -20866,6 +20249,61 @@
     </w:p>
     <w:p>
       <w:pPr>
+        <w:rPr>
+          <w:rFonts w:ascii="Arial" w:hAnsi="Arial" w:cs="Arial"/>
+          <w:b/>
+          <w:bCs/>
+          <w:sz w:val="32"/>
+          <w:szCs w:val="32"/>
+        </w:rPr>
+      </w:pPr>
+    </w:p>
+    <w:p>
+      <w:pPr>
+        <w:rPr>
+          <w:rFonts w:ascii="Arial" w:hAnsi="Arial" w:cs="Arial"/>
+          <w:b/>
+          <w:bCs/>
+          <w:sz w:val="32"/>
+          <w:szCs w:val="32"/>
+        </w:rPr>
+      </w:pPr>
+    </w:p>
+    <w:p>
+      <w:pPr>
+        <w:rPr>
+          <w:rFonts w:ascii="Arial" w:hAnsi="Arial" w:cs="Arial"/>
+          <w:b/>
+          <w:bCs/>
+          <w:sz w:val="32"/>
+          <w:szCs w:val="32"/>
+        </w:rPr>
+      </w:pPr>
+    </w:p>
+    <w:p>
+      <w:pPr>
+        <w:rPr>
+          <w:rFonts w:ascii="Arial" w:hAnsi="Arial" w:cs="Arial"/>
+          <w:b/>
+          <w:bCs/>
+          <w:sz w:val="32"/>
+          <w:szCs w:val="32"/>
+        </w:rPr>
+      </w:pPr>
+    </w:p>
+    <w:p>
+      <w:pPr>
+        <w:rPr>
+          <w:rFonts w:ascii="Arial" w:hAnsi="Arial" w:cs="Arial"/>
+          <w:b/>
+          <w:bCs/>
+          <w:sz w:val="32"/>
+          <w:szCs w:val="32"/>
+        </w:rPr>
+      </w:pPr>
+    </w:p>
+    <w:p>
+      <w:pPr>
         <w:pStyle w:val="ListParagraph"/>
         <w:numPr>
           <w:ilvl w:val="0"/>
@@ -22811,7 +22249,6 @@
     </w:tbl>
     <w:p>
       <w:pPr>
-        <w:ind w:left="360"/>
         <w:rPr>
           <w:rFonts w:ascii="Arial" w:hAnsi="Arial" w:cs="Arial"/>
           <w:bCs/>
@@ -22819,39 +22256,8 @@
           <w:szCs w:val="20"/>
         </w:rPr>
       </w:pPr>
-    </w:p>
-    <w:p>
-      <w:pPr>
-        <w:ind w:left="360"/>
-        <w:rPr>
-          <w:rFonts w:ascii="Arial" w:hAnsi="Arial" w:cs="Arial"/>
-          <w:bCs/>
-          <w:sz w:val="20"/>
-          <w:szCs w:val="20"/>
-        </w:rPr>
-      </w:pPr>
-    </w:p>
-    <w:p>
-      <w:pPr>
-        <w:ind w:left="360"/>
-        <w:rPr>
-          <w:rFonts w:ascii="Arial" w:hAnsi="Arial" w:cs="Arial"/>
-          <w:bCs/>
-          <w:sz w:val="20"/>
-          <w:szCs w:val="20"/>
-        </w:rPr>
-      </w:pPr>
-    </w:p>
-    <w:p>
-      <w:pPr>
-        <w:ind w:left="360"/>
-        <w:rPr>
-          <w:rFonts w:ascii="Arial" w:hAnsi="Arial" w:cs="Arial"/>
-          <w:bCs/>
-          <w:sz w:val="20"/>
-          <w:szCs w:val="20"/>
-        </w:rPr>
-      </w:pPr>
+      <w:bookmarkStart w:id="0" w:name="_GoBack"/>
+      <w:bookmarkEnd w:id="0"/>
     </w:p>
     <w:p>
       <w:pPr>
@@ -22871,28 +22277,9 @@
           <w:sz w:val="32"/>
           <w:szCs w:val="32"/>
         </w:rPr>
+        <w:lastRenderedPageBreak/>
         <w:t>Part 6 — Build one customer report</w:t>
       </w:r>
-    </w:p>
-    <w:p>
-      <w:pPr>
-        <w:rPr>
-          <w:rFonts w:ascii="Arial" w:hAnsi="Arial" w:cs="Arial"/>
-          <w:bCs/>
-          <w:sz w:val="24"/>
-          <w:szCs w:val="24"/>
-        </w:rPr>
-      </w:pPr>
-    </w:p>
-    <w:p>
-      <w:pPr>
-        <w:rPr>
-          <w:rFonts w:ascii="Arial" w:hAnsi="Arial" w:cs="Arial"/>
-          <w:bCs/>
-          <w:sz w:val="24"/>
-          <w:szCs w:val="24"/>
-        </w:rPr>
-      </w:pPr>
       <w:r>
         <w:rPr>
           <w:rFonts w:ascii="Arial" w:hAnsi="Arial" w:cs="Arial"/>
@@ -22938,26 +22325,6 @@
           </wp:inline>
         </w:drawing>
       </w:r>
-    </w:p>
-    <w:p>
-      <w:pPr>
-        <w:rPr>
-          <w:rFonts w:ascii="Arial" w:hAnsi="Arial" w:cs="Arial"/>
-          <w:bCs/>
-          <w:sz w:val="24"/>
-          <w:szCs w:val="24"/>
-        </w:rPr>
-      </w:pPr>
-    </w:p>
-    <w:p>
-      <w:pPr>
-        <w:rPr>
-          <w:rFonts w:ascii="Arial" w:hAnsi="Arial" w:cs="Arial"/>
-          <w:bCs/>
-          <w:sz w:val="24"/>
-          <w:szCs w:val="24"/>
-        </w:rPr>
-      </w:pPr>
       <w:r>
         <w:rPr>
           <w:rFonts w:ascii="Arial" w:hAnsi="Arial" w:cs="Arial"/>
@@ -23248,7 +22615,6 @@
           <w:szCs w:val="20"/>
           <w:lang w:eastAsia="en-IN"/>
         </w:rPr>
-        <w:lastRenderedPageBreak/>
         <w:t>total_orders</w:t>
       </w:r>
       <w:proofErr w:type="spellEnd"/>
@@ -23466,6 +22832,18 @@
     <w:p>
       <w:pPr>
         <w:spacing w:before="100" w:beforeAutospacing="1" w:after="100" w:afterAutospacing="1" w:line="240" w:lineRule="auto"/>
+        <w:ind w:left="720"/>
+        <w:rPr>
+          <w:rFonts w:ascii="Times New Roman" w:eastAsia="Times New Roman" w:hAnsi="Times New Roman" w:cs="Times New Roman"/>
+          <w:sz w:val="24"/>
+          <w:szCs w:val="24"/>
+          <w:lang w:eastAsia="en-IN"/>
+        </w:rPr>
+      </w:pPr>
+    </w:p>
+    <w:p>
+      <w:pPr>
+        <w:spacing w:before="100" w:beforeAutospacing="1" w:after="100" w:afterAutospacing="1" w:line="240" w:lineRule="auto"/>
         <w:outlineLvl w:val="2"/>
         <w:rPr>
           <w:rFonts w:ascii="Times New Roman" w:eastAsia="Times New Roman" w:hAnsi="Times New Roman" w:cs="Times New Roman"/>
@@ -23485,6 +22863,7 @@
           <w:szCs w:val="27"/>
           <w:lang w:eastAsia="en-IN"/>
         </w:rPr>
+        <w:lastRenderedPageBreak/>
         <w:t>3. Engagement &amp; Segmentation</w:t>
       </w:r>
     </w:p>
@@ -25885,7 +25264,6 @@
   <w:style w:type="character" w:default="1" w:styleId="DefaultParagraphFont">
     <w:name w:val="Default Paragraph Font"/>
     <w:uiPriority w:val="1"/>
-    <w:semiHidden/>
     <w:unhideWhenUsed/>
   </w:style>
   <w:style w:type="table" w:default="1" w:styleId="TableNormal">
@@ -26309,7 +25687,7 @@
 </file>
 
 <file path=customXml/itemProps1.xml><?xml version="1.0" encoding="utf-8"?>
-<ds:datastoreItem xmlns:ds="http://schemas.openxmlformats.org/officeDocument/2006/customXml" ds:itemID="{EB9CA738-81DF-4BCA-A41B-ADFE2B508CB0}">
+<ds:datastoreItem xmlns:ds="http://schemas.openxmlformats.org/officeDocument/2006/customXml" ds:itemID="{D0AF5323-2DAD-43BB-A538-0FAC2F7A593A}">
   <ds:schemaRefs>
     <ds:schemaRef ds:uri="http://schemas.openxmlformats.org/officeDocument/2006/bibliography"/>
   </ds:schemaRefs>

</xml_diff>